<commit_message>
Market prep Word file brought in line with the checklist
Adds the 18 items the web checklist gained today: the mirror and try-on displays, the posting tasks at their dates, stand-and-greet and let-people-handle-things on market day, the how-did-you-hear tally at both markets, thank-you posts after sold pieces are marked online, and the mirror, try-on bow and display dog on the packing list.

Edited in place rather than regenerated: each new line copies the file's existing tick-box paragraph and run formatting, and only word/document.xml was replaced inside the package. The XML parses and all additions read back in order. Not rendered to pages here - no LibreOffice on this machine.

Co-Authored-By: Claude Opus 5 <noreply@anthropic.com>
</commit_message>
<xml_diff>
--- a/marketing/october-market-prep.docx
+++ b/marketing/october-market-prep.docx
@@ -2097,7 +2097,16 @@
                 <w:sz w:val="21"/>
                 <w:szCs w:val="21"/>
               </w:rPr>
-              <w:t xml:space="preserve">Inventory list — every piece going to the table</w:t>
+              <w:t xml:space="preserve">A mirror on the table</w:t>
+            </w:r>
+            <w:r>
+              <w:rPr>
+                <w:rFonts w:ascii="Calibri" w:cs="Calibri" w:eastAsia="Calibri" w:hAnsi="Calibri"/>
+                <w:color w:val="6A5B4A"/>
+                <w:sz w:val="18"/>
+                <w:szCs w:val="18"/>
+              </w:rPr>
+              <w:t xml:space="preserve"> — bows and scrunchies get tried on, and a mirror draws people in</w:t>
             </w:r>
           </w:p>
           <w:p>
@@ -2135,7 +2144,244 @@
                 <w:sz w:val="21"/>
                 <w:szCs w:val="21"/>
               </w:rPr>
+              <w:t xml:space="preserve">Try-on bow on a clip · a basket of scrunchies to handle · a stuffed dog wearing a bandana</w:t>
+            </w:r>
+          </w:p>
+          <w:p>
+            <w:pPr>
+              <w:spacing w:after="60"/>
+              <w:ind w:left="300" w:hanging="300"/>
+            </w:pPr>
+            <w:sdt>
+              <w:sdtPr>
+                <w14:checkbox>
+                  <w14:checked w14:val="0"/>
+                  <w14:checkedState w14:val="2612" w14:font="MS Gothic"/>
+                  <w14:uncheckedState w14:val="2610" w14:font="MS Gothic"/>
+                </w14:checkbox>
+              </w:sdtPr>
+              <w:sdtContent>
+                <w:r>
+                  <w:sym w:char="2610" w:font="MS Gothic"/>
+                </w:r>
+              </w:sdtContent>
+            </w:sdt>
+            <w:r>
+              <w:rPr>
+                <w:rFonts w:ascii="Calibri" w:cs="Calibri" w:eastAsia="Calibri" w:hAnsi="Calibri"/>
+                <w:color w:val="453A30"/>
+                <w:sz w:val="21"/>
+                <w:szCs w:val="21"/>
+              </w:rPr>
+              <w:t xml:space="preserve">  </w:t>
+            </w:r>
+            <w:r>
+              <w:rPr>
+                <w:rFonts w:ascii="Calibri" w:cs="Calibri" w:eastAsia="Calibri" w:hAnsi="Calibri"/>
+                <w:color w:val="453A30"/>
+                <w:sz w:val="21"/>
+                <w:szCs w:val="21"/>
+              </w:rPr>
+              <w:t xml:space="preserve">Inventory list — every piece going to the table</w:t>
+            </w:r>
+          </w:p>
+          <w:p>
+            <w:pPr>
+              <w:spacing w:after="60"/>
+              <w:ind w:left="300" w:hanging="300"/>
+            </w:pPr>
+            <w:sdt>
+              <w:sdtPr>
+                <w14:checkbox>
+                  <w14:checked w14:val="0"/>
+                  <w14:checkedState w14:val="2612" w14:font="MS Gothic"/>
+                  <w14:uncheckedState w14:val="2610" w14:font="MS Gothic"/>
+                </w14:checkbox>
+              </w:sdtPr>
+              <w:sdtContent>
+                <w:r>
+                  <w:sym w:char="2610" w:font="MS Gothic"/>
+                </w:r>
+              </w:sdtContent>
+            </w:sdt>
+            <w:r>
+              <w:rPr>
+                <w:rFonts w:ascii="Calibri" w:cs="Calibri" w:eastAsia="Calibri" w:hAnsi="Calibri"/>
+                <w:color w:val="453A30"/>
+                <w:sz w:val="21"/>
+                <w:szCs w:val="21"/>
+              </w:rPr>
+              <w:t xml:space="preserve">  </w:t>
+            </w:r>
+            <w:r>
+              <w:rPr>
+                <w:rFonts w:ascii="Calibri" w:cs="Calibri" w:eastAsia="Calibri" w:hAnsi="Calibri"/>
+                <w:color w:val="453A30"/>
+                <w:sz w:val="21"/>
+                <w:szCs w:val="21"/>
+              </w:rPr>
               <w:t xml:space="preserve">Set the table up once at home and photograph it</w:t>
+            </w:r>
+          </w:p>
+          <w:p>
+            <w:pPr>
+              <w:spacing w:after="60"/>
+              <w:ind w:left="300" w:hanging="300"/>
+            </w:pPr>
+            <w:sdt>
+              <w:sdtPr>
+                <w14:checkbox>
+                  <w14:checked w14:val="0"/>
+                  <w14:checkedState w14:val="2612" w14:font="MS Gothic"/>
+                  <w14:uncheckedState w14:val="2610" w14:font="MS Gothic"/>
+                </w14:checkbox>
+              </w:sdtPr>
+              <w:sdtContent>
+                <w:r>
+                  <w:sym w:char="2610" w:font="MS Gothic"/>
+                </w:r>
+              </w:sdtContent>
+            </w:sdt>
+            <w:r>
+              <w:rPr>
+                <w:rFonts w:ascii="Calibri" w:cs="Calibri" w:eastAsia="Calibri" w:hAnsi="Calibri"/>
+                <w:color w:val="453A30"/>
+                <w:sz w:val="21"/>
+                <w:szCs w:val="21"/>
+              </w:rPr>
+              <w:t xml:space="preserve">  </w:t>
+            </w:r>
+            <w:r>
+              <w:rPr>
+                <w:rFonts w:ascii="Calibri" w:cs="Calibri" w:eastAsia="Calibri" w:hAnsi="Calibri"/>
+                <w:color w:val="453A30"/>
+                <w:sz w:val="21"/>
+                <w:szCs w:val="21"/>
+              </w:rPr>
+              <w:t xml:space="preserve">Fill the </w:t>
+            </w:r>
+            <w:r>
+              <w:rPr>
+                <w:rFonts w:ascii="Calibri" w:cs="Calibri" w:eastAsia="Calibri" w:hAnsi="Calibri"/>
+                <w:b/>
+                <w:bCs/>
+                <w:color w:val="453A30"/>
+                <w:sz w:val="21"/>
+                <w:szCs w:val="21"/>
+              </w:rPr>
+              <w:t xml:space="preserve">[brackets]</w:t>
+            </w:r>
+            <w:r>
+              <w:rPr>
+                <w:rFonts w:ascii="Calibri" w:cs="Calibri" w:eastAsia="Calibri" w:hAnsi="Calibri"/>
+                <w:color w:val="453A30"/>
+                <w:sz w:val="21"/>
+                <w:szCs w:val="21"/>
+              </w:rPr>
+              <w:t xml:space="preserve"> in the market posts · tag the market and share its event page</w:t>
+            </w:r>
+            <w:r>
+              <w:rPr>
+                <w:rFonts w:ascii="Calibri" w:cs="Calibri" w:eastAsia="Calibri" w:hAnsi="Calibri"/>
+                <w:color w:val="6A5B4A"/>
+                <w:sz w:val="18"/>
+                <w:szCs w:val="18"/>
+              </w:rPr>
+              <w:t xml:space="preserve"> — copy is in marketing/october-market-posts.md</w:t>
+            </w:r>
+          </w:p>
+          <w:p>
+            <w:pPr>
+              <w:spacing w:after="60"/>
+              <w:ind w:left="300" w:hanging="300"/>
+            </w:pPr>
+            <w:sdt>
+              <w:sdtPr>
+                <w14:checkbox>
+                  <w14:checked w14:val="0"/>
+                  <w14:checkedState w14:val="2612" w14:font="MS Gothic"/>
+                  <w14:uncheckedState w14:val="2610" w14:font="MS Gothic"/>
+                </w14:checkbox>
+              </w:sdtPr>
+              <w:sdtContent>
+                <w:r>
+                  <w:sym w:char="2610" w:font="MS Gothic"/>
+                </w:r>
+              </w:sdtContent>
+            </w:sdt>
+            <w:r>
+              <w:rPr>
+                <w:rFonts w:ascii="Calibri" w:cs="Calibri" w:eastAsia="Calibri" w:hAnsi="Calibri"/>
+                <w:color w:val="453A30"/>
+                <w:sz w:val="21"/>
+                <w:szCs w:val="21"/>
+              </w:rPr>
+              <w:t xml:space="preserve">  </w:t>
+            </w:r>
+            <w:r>
+              <w:rPr>
+                <w:rFonts w:ascii="Calibri" w:cs="Calibri" w:eastAsia="Calibri" w:hAnsi="Calibri"/>
+                <w:color w:val="453A30"/>
+                <w:sz w:val="21"/>
+                <w:szCs w:val="21"/>
+              </w:rPr>
+              <w:t xml:space="preserve">Post the announcement — your page + Instagram</w:t>
+            </w:r>
+            <w:r>
+              <w:rPr>
+                <w:rFonts w:ascii="Calibri" w:cs="Calibri" w:eastAsia="Calibri" w:hAnsi="Calibri"/>
+                <w:color w:val="6A5B4A"/>
+                <w:sz w:val="18"/>
+                <w:szCs w:val="18"/>
+              </w:rPr>
+              <w:t xml:space="preserve"> · Oct 3–4 · use the table photo</w:t>
+            </w:r>
+          </w:p>
+          <w:p>
+            <w:pPr>
+              <w:spacing w:after="60"/>
+              <w:ind w:left="300" w:hanging="300"/>
+            </w:pPr>
+            <w:sdt>
+              <w:sdtPr>
+                <w14:checkbox>
+                  <w14:checked w14:val="0"/>
+                  <w14:checkedState w14:val="2612" w14:font="MS Gothic"/>
+                  <w14:uncheckedState w14:val="2610" w14:font="MS Gothic"/>
+                </w14:checkbox>
+              </w:sdtPr>
+              <w:sdtContent>
+                <w:r>
+                  <w:sym w:char="2610" w:font="MS Gothic"/>
+                </w:r>
+              </w:sdtContent>
+            </w:sdt>
+            <w:r>
+              <w:rPr>
+                <w:rFonts w:ascii="Calibri" w:cs="Calibri" w:eastAsia="Calibri" w:hAnsi="Calibri"/>
+                <w:color w:val="453A30"/>
+                <w:sz w:val="21"/>
+                <w:szCs w:val="21"/>
+              </w:rPr>
+              <w:t xml:space="preserve">  </w:t>
+            </w:r>
+            <w:r>
+              <w:rPr>
+                <w:rFonts w:ascii="Calibri" w:cs="Calibri" w:eastAsia="Calibri" w:hAnsi="Calibri"/>
+                <w:color w:val="453A30"/>
+                <w:sz w:val="21"/>
+                <w:szCs w:val="21"/>
+              </w:rPr>
+              <w:t xml:space="preserve">Post in two local groups, different words each</w:t>
+            </w:r>
+            <w:r>
+              <w:rPr>
+                <w:rFonts w:ascii="Calibri" w:cs="Calibri" w:eastAsia="Calibri" w:hAnsi="Calibri"/>
+                <w:color w:val="6A5B4A"/>
+                <w:sz w:val="18"/>
+                <w:szCs w:val="18"/>
+              </w:rPr>
+              <w:t xml:space="preserve"> · Oct 5 and Oct 7</w:t>
             </w:r>
           </w:p>
         </w:tc>
@@ -2254,6 +2500,44 @@
                 <w:szCs w:val="21"/>
               </w:rPr>
               <w:t xml:space="preserve"> · charge the phone</w:t>
+            </w:r>
+          </w:p>
+          <w:p>
+            <w:pPr>
+              <w:spacing w:after="60"/>
+              <w:ind w:left="300" w:hanging="300"/>
+            </w:pPr>
+            <w:sdt>
+              <w:sdtPr>
+                <w14:checkbox>
+                  <w14:checked w14:val="0"/>
+                  <w14:checkedState w14:val="2612" w14:font="MS Gothic"/>
+                  <w14:uncheckedState w14:val="2610" w14:font="MS Gothic"/>
+                </w14:checkbox>
+              </w:sdtPr>
+              <w:sdtContent>
+                <w:r>
+                  <w:sym w:char="2610" w:font="MS Gothic"/>
+                </w:r>
+              </w:sdtContent>
+            </w:sdt>
+            <w:r>
+              <w:rPr>
+                <w:rFonts w:ascii="Calibri" w:cs="Calibri" w:eastAsia="Calibri" w:hAnsi="Calibri"/>
+                <w:color w:val="453A30"/>
+                <w:sz w:val="21"/>
+                <w:szCs w:val="21"/>
+              </w:rPr>
+              <w:t xml:space="preserve">  </w:t>
+            </w:r>
+            <w:r>
+              <w:rPr>
+                <w:rFonts w:ascii="Calibri" w:cs="Calibri" w:eastAsia="Calibri" w:hAnsi="Calibri"/>
+                <w:color w:val="453A30"/>
+                <w:sz w:val="21"/>
+                <w:szCs w:val="21"/>
+              </w:rPr>
+              <w:t xml:space="preserve">Post “packed and ready” — your page + Story</w:t>
             </w:r>
           </w:p>
         </w:tc>
@@ -2483,11 +2767,192 @@
             <w:r>
               <w:rPr>
                 <w:rFonts w:ascii="Calibri" w:cs="Calibri" w:eastAsia="Calibri" w:hAnsi="Calibri"/>
+                <w:b/>
+                <w:bCs/>
+                <w:color w:val="453A30"/>
+                <w:sz w:val="21"/>
+                <w:szCs w:val="21"/>
+              </w:rPr>
+              <w:t xml:space="preserve">Stand, don't sit · phone away</w:t>
+            </w:r>
+            <w:r>
+              <w:rPr>
+                <w:rFonts w:ascii="Calibri" w:cs="Calibri" w:eastAsia="Calibri" w:hAnsi="Calibri"/>
+                <w:color w:val="453A30"/>
+                <w:sz w:val="21"/>
+                <w:szCs w:val="21"/>
+              </w:rPr>
+              <w:t xml:space="preserve"> · smile, say hello, invite people in to look</w:t>
+            </w:r>
+            <w:r>
+              <w:rPr>
+                <w:rFonts w:ascii="Calibri" w:cs="Calibri" w:eastAsia="Calibri" w:hAnsi="Calibri"/>
+                <w:color w:val="6A5B4A"/>
+                <w:sz w:val="18"/>
+                <w:szCs w:val="18"/>
+              </w:rPr>
+              <w:t xml:space="preserve"> — people buy from someone they enjoyed talking to</w:t>
+            </w:r>
+          </w:p>
+          <w:p>
+            <w:pPr>
+              <w:spacing w:after="60"/>
+              <w:ind w:left="300" w:hanging="300"/>
+            </w:pPr>
+            <w:sdt>
+              <w:sdtPr>
+                <w14:checkbox>
+                  <w14:checked w14:val="0"/>
+                  <w14:checkedState w14:val="2612" w14:font="MS Gothic"/>
+                  <w14:uncheckedState w14:val="2610" w14:font="MS Gothic"/>
+                </w14:checkbox>
+              </w:sdtPr>
+              <w:sdtContent>
+                <w:r>
+                  <w:sym w:char="2610" w:font="MS Gothic"/>
+                </w:r>
+              </w:sdtContent>
+            </w:sdt>
+            <w:r>
+              <w:rPr>
+                <w:rFonts w:ascii="Calibri" w:cs="Calibri" w:eastAsia="Calibri" w:hAnsi="Calibri"/>
+                <w:color w:val="453A30"/>
+                <w:sz w:val="21"/>
+                <w:szCs w:val="21"/>
+              </w:rPr>
+              <w:t xml:space="preserve">  </w:t>
+            </w:r>
+            <w:r>
+              <w:rPr>
+                <w:rFonts w:ascii="Calibri" w:cs="Calibri" w:eastAsia="Calibri" w:hAnsi="Calibri"/>
+                <w:color w:val="453A30"/>
+                <w:sz w:val="21"/>
+                <w:szCs w:val="21"/>
+              </w:rPr>
+              <w:t xml:space="preserve">Let people pick things up and try bows on — keep the table touchable</w:t>
+            </w:r>
+          </w:p>
+          <w:p>
+            <w:pPr>
+              <w:spacing w:after="60"/>
+              <w:ind w:left="300" w:hanging="300"/>
+            </w:pPr>
+            <w:sdt>
+              <w:sdtPr>
+                <w14:checkbox>
+                  <w14:checked w14:val="0"/>
+                  <w14:checkedState w14:val="2612" w14:font="MS Gothic"/>
+                  <w14:uncheckedState w14:val="2610" w14:font="MS Gothic"/>
+                </w14:checkbox>
+              </w:sdtPr>
+              <w:sdtContent>
+                <w:r>
+                  <w:sym w:char="2610" w:font="MS Gothic"/>
+                </w:r>
+              </w:sdtContent>
+            </w:sdt>
+            <w:r>
+              <w:rPr>
+                <w:rFonts w:ascii="Calibri" w:cs="Calibri" w:eastAsia="Calibri" w:hAnsi="Calibri"/>
+                <w:color w:val="453A30"/>
+                <w:sz w:val="21"/>
+                <w:szCs w:val="21"/>
+              </w:rPr>
+              <w:t xml:space="preserve">  </w:t>
+            </w:r>
+            <w:r>
+              <w:rPr>
+                <w:rFonts w:ascii="Calibri" w:cs="Calibri" w:eastAsia="Calibri" w:hAnsi="Calibri"/>
+                <w:color w:val="453A30"/>
+                <w:sz w:val="21"/>
+                <w:szCs w:val="21"/>
+              </w:rPr>
+              <w:t xml:space="preserve">Story once you're set up</w:t>
+            </w:r>
+            <w:r>
+              <w:rPr>
+                <w:rFonts w:ascii="Calibri" w:cs="Calibri" w:eastAsia="Calibri" w:hAnsi="Calibri"/>
+                <w:color w:val="6A5B4A"/>
+                <w:sz w:val="18"/>
+                <w:szCs w:val="18"/>
+              </w:rPr>
+              <w:t xml:space="preserve"> · booth photo + location sticker</w:t>
+            </w:r>
+          </w:p>
+          <w:p>
+            <w:pPr>
+              <w:spacing w:after="60"/>
+              <w:ind w:left="300" w:hanging="300"/>
+            </w:pPr>
+            <w:sdt>
+              <w:sdtPr>
+                <w14:checkbox>
+                  <w14:checked w14:val="0"/>
+                  <w14:checkedState w14:val="2612" w14:font="MS Gothic"/>
+                  <w14:uncheckedState w14:val="2610" w14:font="MS Gothic"/>
+                </w14:checkbox>
+              </w:sdtPr>
+              <w:sdtContent>
+                <w:r>
+                  <w:sym w:char="2610" w:font="MS Gothic"/>
+                </w:r>
+              </w:sdtContent>
+            </w:sdt>
+            <w:r>
+              <w:rPr>
+                <w:rFonts w:ascii="Calibri" w:cs="Calibri" w:eastAsia="Calibri" w:hAnsi="Calibri"/>
+                <w:color w:val="453A30"/>
+                <w:sz w:val="21"/>
+                <w:szCs w:val="21"/>
+              </w:rPr>
+              <w:t xml:space="preserve">  </w:t>
+            </w:r>
+            <w:r>
+              <w:rPr>
+                <w:rFonts w:ascii="Calibri" w:cs="Calibri" w:eastAsia="Calibri" w:hAnsi="Calibri"/>
                 <w:color w:val="453A30"/>
                 <w:sz w:val="21"/>
                 <w:szCs w:val="21"/>
               </w:rPr>
               <w:t xml:space="preserve">Mark each sale on the inventory list</w:t>
+            </w:r>
+          </w:p>
+          <w:p>
+            <w:pPr>
+              <w:spacing w:after="60"/>
+              <w:ind w:left="300" w:hanging="300"/>
+            </w:pPr>
+            <w:sdt>
+              <w:sdtPr>
+                <w14:checkbox>
+                  <w14:checked w14:val="0"/>
+                  <w14:checkedState w14:val="2612" w14:font="MS Gothic"/>
+                  <w14:uncheckedState w14:val="2610" w14:font="MS Gothic"/>
+                </w14:checkbox>
+              </w:sdtPr>
+              <w:sdtContent>
+                <w:r>
+                  <w:sym w:char="2610" w:font="MS Gothic"/>
+                </w:r>
+              </w:sdtContent>
+            </w:sdt>
+            <w:r>
+              <w:rPr>
+                <w:rFonts w:ascii="Calibri" w:cs="Calibri" w:eastAsia="Calibri" w:hAnsi="Calibri"/>
+                <w:color w:val="453A30"/>
+                <w:sz w:val="21"/>
+                <w:szCs w:val="21"/>
+              </w:rPr>
+              <w:t xml:space="preserve">  </w:t>
+            </w:r>
+            <w:r>
+              <w:rPr>
+                <w:rFonts w:ascii="Calibri" w:cs="Calibri" w:eastAsia="Calibri" w:hAnsi="Calibri"/>
+                <w:color w:val="453A30"/>
+                <w:sz w:val="21"/>
+                <w:szCs w:val="21"/>
+              </w:rPr>
+              <w:t xml:space="preserve">Ask every buyer how they heard: post ____ group ____ walked past ____ friend ____</w:t>
             </w:r>
           </w:p>
           <w:p>
@@ -2707,6 +3172,64 @@
                 <w:szCs w:val="21"/>
               </w:rPr>
               <w:t xml:space="preserve">Tell Claude what sold, so it's marked sold out online</w:t>
+            </w:r>
+          </w:p>
+          <w:p>
+            <w:pPr>
+              <w:spacing w:after="60"/>
+              <w:ind w:left="300" w:hanging="300"/>
+            </w:pPr>
+            <w:sdt>
+              <w:sdtPr>
+                <w14:checkbox>
+                  <w14:checked w14:val="0"/>
+                  <w14:checkedState w14:val="2612" w14:font="MS Gothic"/>
+                  <w14:uncheckedState w14:val="2610" w14:font="MS Gothic"/>
+                </w14:checkbox>
+              </w:sdtPr>
+              <w:sdtContent>
+                <w:r>
+                  <w:sym w:char="2610" w:font="MS Gothic"/>
+                </w:r>
+              </w:sdtContent>
+            </w:sdt>
+            <w:r>
+              <w:rPr>
+                <w:rFonts w:ascii="Calibri" w:cs="Calibri" w:eastAsia="Calibri" w:hAnsi="Calibri"/>
+                <w:color w:val="453A30"/>
+                <w:sz w:val="21"/>
+                <w:szCs w:val="21"/>
+              </w:rPr>
+              <w:t xml:space="preserve">  </w:t>
+            </w:r>
+            <w:r>
+              <w:rPr>
+                <w:rFonts w:ascii="Calibri" w:cs="Calibri" w:eastAsia="Calibri" w:hAnsi="Calibri"/>
+                <w:b/>
+                <w:bCs/>
+                <w:color w:val="453A30"/>
+                <w:sz w:val="21"/>
+                <w:szCs w:val="21"/>
+              </w:rPr>
+              <w:t xml:space="preserve">Then</w:t>
+            </w:r>
+            <w:r>
+              <w:rPr>
+                <w:rFonts w:ascii="Calibri" w:cs="Calibri" w:eastAsia="Calibri" w:hAnsi="Calibri"/>
+                <w:color w:val="453A30"/>
+                <w:sz w:val="21"/>
+                <w:szCs w:val="21"/>
+              </w:rPr>
+              <w:t xml:space="preserve"> post the thank-you</w:t>
+            </w:r>
+            <w:r>
+              <w:rPr>
+                <w:rFonts w:ascii="Calibri" w:cs="Calibri" w:eastAsia="Calibri" w:hAnsi="Calibri"/>
+                <w:color w:val="6A5B4A"/>
+                <w:sz w:val="18"/>
+                <w:szCs w:val="18"/>
+              </w:rPr>
+              <w:t xml:space="preserve"> · one real moment from the day</w:t>
             </w:r>
           </w:p>
           <w:p>
@@ -3573,6 +4096,64 @@
             <w:r>
               <w:rPr>
                 <w:rFonts w:ascii="Calibri" w:cs="Calibri" w:eastAsia="Calibri" w:hAnsi="Calibri"/>
+                <w:b/>
+                <w:bCs/>
+                <w:color w:val="453A30"/>
+                <w:sz w:val="21"/>
+                <w:szCs w:val="21"/>
+              </w:rPr>
+              <w:t xml:space="preserve">Tue Oct 27:</w:t>
+            </w:r>
+            <w:r>
+              <w:rPr>
+                <w:rFonts w:ascii="Calibri" w:cs="Calibri" w:eastAsia="Calibri" w:hAnsi="Calibri"/>
+                <w:color w:val="453A30"/>
+                <w:sz w:val="21"/>
+                <w:szCs w:val="21"/>
+              </w:rPr>
+              <w:t xml:space="preserve"> post the night-market announcement — your page + one local group</w:t>
+            </w:r>
+            <w:r>
+              <w:rPr>
+                <w:rFonts w:ascii="Calibri" w:cs="Calibri" w:eastAsia="Calibri" w:hAnsi="Calibri"/>
+                <w:color w:val="6A5B4A"/>
+                <w:sz w:val="18"/>
+                <w:szCs w:val="18"/>
+              </w:rPr>
+              <w:t xml:space="preserve"> · cut the Halloween line if there's no second batch</w:t>
+            </w:r>
+          </w:p>
+          <w:p>
+            <w:pPr>
+              <w:spacing w:after="60"/>
+              <w:ind w:left="300" w:hanging="300"/>
+            </w:pPr>
+            <w:sdt>
+              <w:sdtPr>
+                <w14:checkbox>
+                  <w14:checked w14:val="0"/>
+                  <w14:checkedState w14:val="2612" w14:font="MS Gothic"/>
+                  <w14:uncheckedState w14:val="2610" w14:font="MS Gothic"/>
+                </w14:checkbox>
+              </w:sdtPr>
+              <w:sdtContent>
+                <w:r>
+                  <w:sym w:char="2610" w:font="MS Gothic"/>
+                </w:r>
+              </w:sdtContent>
+            </w:sdt>
+            <w:r>
+              <w:rPr>
+                <w:rFonts w:ascii="Calibri" w:cs="Calibri" w:eastAsia="Calibri" w:hAnsi="Calibri"/>
+                <w:color w:val="453A30"/>
+                <w:sz w:val="21"/>
+                <w:szCs w:val="21"/>
+              </w:rPr>
+              <w:t xml:space="preserve">  </w:t>
+            </w:r>
+            <w:r>
+              <w:rPr>
+                <w:rFonts w:ascii="Calibri" w:cs="Calibri" w:eastAsia="Calibri" w:hAnsi="Calibri"/>
                 <w:color w:val="453A30"/>
                 <w:sz w:val="21"/>
                 <w:szCs w:val="21"/>
@@ -3692,6 +4273,91 @@
                 <w:sz w:val="21"/>
                 <w:szCs w:val="21"/>
               </w:rPr>
+              <w:t xml:space="preserve">“Tonight” Story in the afternoon</w:t>
+            </w:r>
+            <w:r>
+              <w:rPr>
+                <w:rFonts w:ascii="Calibri" w:cs="Calibri" w:eastAsia="Calibri" w:hAnsi="Calibri"/>
+                <w:color w:val="6A5B4A"/>
+                <w:sz w:val="18"/>
+                <w:szCs w:val="18"/>
+              </w:rPr>
+              <w:t xml:space="preserve"> · look for the lights</w:t>
+            </w:r>
+          </w:p>
+          <w:p>
+            <w:pPr>
+              <w:spacing w:after="60"/>
+              <w:ind w:left="300" w:hanging="300"/>
+            </w:pPr>
+            <w:sdt>
+              <w:sdtPr>
+                <w14:checkbox>
+                  <w14:checked w14:val="0"/>
+                  <w14:checkedState w14:val="2612" w14:font="MS Gothic"/>
+                  <w14:uncheckedState w14:val="2610" w14:font="MS Gothic"/>
+                </w14:checkbox>
+              </w:sdtPr>
+              <w:sdtContent>
+                <w:r>
+                  <w:sym w:char="2610" w:font="MS Gothic"/>
+                </w:r>
+              </w:sdtContent>
+            </w:sdt>
+            <w:r>
+              <w:rPr>
+                <w:rFonts w:ascii="Calibri" w:cs="Calibri" w:eastAsia="Calibri" w:hAnsi="Calibri"/>
+                <w:color w:val="453A30"/>
+                <w:sz w:val="21"/>
+                <w:szCs w:val="21"/>
+              </w:rPr>
+              <w:t xml:space="preserve">  </w:t>
+            </w:r>
+            <w:r>
+              <w:rPr>
+                <w:rFonts w:ascii="Calibri" w:cs="Calibri" w:eastAsia="Calibri" w:hAnsi="Calibri"/>
+                <w:color w:val="453A30"/>
+                <w:sz w:val="21"/>
+                <w:szCs w:val="21"/>
+              </w:rPr>
+              <w:t xml:space="preserve">Ask every buyer how they heard: post ____ group ____ walked past ____ friend ____</w:t>
+            </w:r>
+          </w:p>
+          <w:p>
+            <w:pPr>
+              <w:spacing w:after="60"/>
+              <w:ind w:left="300" w:hanging="300"/>
+            </w:pPr>
+            <w:sdt>
+              <w:sdtPr>
+                <w14:checkbox>
+                  <w14:checked w14:val="0"/>
+                  <w14:checkedState w14:val="2612" w14:font="MS Gothic"/>
+                  <w14:uncheckedState w14:val="2610" w14:font="MS Gothic"/>
+                </w14:checkbox>
+              </w:sdtPr>
+              <w:sdtContent>
+                <w:r>
+                  <w:sym w:char="2610" w:font="MS Gothic"/>
+                </w:r>
+              </w:sdtContent>
+            </w:sdt>
+            <w:r>
+              <w:rPr>
+                <w:rFonts w:ascii="Calibri" w:cs="Calibri" w:eastAsia="Calibri" w:hAnsi="Calibri"/>
+                <w:color w:val="453A30"/>
+                <w:sz w:val="21"/>
+                <w:szCs w:val="21"/>
+              </w:rPr>
+              <w:t xml:space="preserve">  </w:t>
+            </w:r>
+            <w:r>
+              <w:rPr>
+                <w:rFonts w:ascii="Calibri" w:cs="Calibri" w:eastAsia="Calibri" w:hAnsi="Calibri"/>
+                <w:color w:val="453A30"/>
+                <w:sz w:val="21"/>
+                <w:szCs w:val="21"/>
+              </w:rPr>
               <w:t xml:space="preserve">Set aside 7.6% · total taken: $</w:t>
             </w:r>
             <w:r>
@@ -3789,6 +4455,55 @@
                 <w:szCs w:val="21"/>
               </w:rPr>
               <w:t xml:space="preserve">Tell Claude what sold · box the Halloween leftovers until next September</w:t>
+            </w:r>
+          </w:p>
+          <w:p>
+            <w:pPr>
+              <w:spacing w:after="60"/>
+              <w:ind w:left="300" w:hanging="300"/>
+            </w:pPr>
+            <w:sdt>
+              <w:sdtPr>
+                <w14:checkbox>
+                  <w14:checked w14:val="0"/>
+                  <w14:checkedState w14:val="2612" w14:font="MS Gothic"/>
+                  <w14:uncheckedState w14:val="2610" w14:font="MS Gothic"/>
+                </w14:checkbox>
+              </w:sdtPr>
+              <w:sdtContent>
+                <w:r>
+                  <w:sym w:char="2610" w:font="MS Gothic"/>
+                </w:r>
+              </w:sdtContent>
+            </w:sdt>
+            <w:r>
+              <w:rPr>
+                <w:rFonts w:ascii="Calibri" w:cs="Calibri" w:eastAsia="Calibri" w:hAnsi="Calibri"/>
+                <w:color w:val="453A30"/>
+                <w:sz w:val="21"/>
+                <w:szCs w:val="21"/>
+              </w:rPr>
+              <w:t xml:space="preserve">  </w:t>
+            </w:r>
+            <w:r>
+              <w:rPr>
+                <w:rFonts w:ascii="Calibri" w:cs="Calibri" w:eastAsia="Calibri" w:hAnsi="Calibri"/>
+                <w:b/>
+                <w:bCs/>
+                <w:color w:val="453A30"/>
+                <w:sz w:val="21"/>
+                <w:szCs w:val="21"/>
+              </w:rPr>
+              <w:t xml:space="preserve">Then</w:t>
+            </w:r>
+            <w:r>
+              <w:rPr>
+                <w:rFonts w:ascii="Calibri" w:cs="Calibri" w:eastAsia="Calibri" w:hAnsi="Calibri"/>
+                <w:color w:val="453A30"/>
+                <w:sz w:val="21"/>
+                <w:szCs w:val="21"/>
+              </w:rPr>
+              <w:t xml:space="preserve"> post the thank-you</w:t>
             </w:r>
           </w:p>
         </w:tc>
@@ -4325,6 +5040,90 @@
                 <w:szCs w:val="20"/>
               </w:rPr>
               <w:t xml:space="preserve">  Water, chair, sunscreen</w:t>
+            </w:r>
+          </w:p>
+          <w:p>
+            <w:pPr>
+              <w:spacing w:after="50"/>
+            </w:pPr>
+            <w:sdt>
+              <w:sdtPr>
+                <w14:checkbox>
+                  <w14:checked w14:val="0"/>
+                  <w14:checkedState w14:val="2612" w14:font="MS Gothic"/>
+                  <w14:uncheckedState w14:val="2610" w14:font="MS Gothic"/>
+                </w14:checkbox>
+              </w:sdtPr>
+              <w:sdtContent>
+                <w:r>
+                  <w:sym w:char="2610" w:font="MS Gothic"/>
+                </w:r>
+              </w:sdtContent>
+            </w:sdt>
+            <w:r>
+              <w:rPr>
+                <w:rFonts w:ascii="Calibri" w:cs="Calibri" w:eastAsia="Calibri" w:hAnsi="Calibri"/>
+                <w:color w:val="453A30"/>
+                <w:sz w:val="20"/>
+                <w:szCs w:val="20"/>
+              </w:rPr>
+              <w:t xml:space="preserve">  Mirror</w:t>
+            </w:r>
+          </w:p>
+          <w:p>
+            <w:pPr>
+              <w:spacing w:after="50"/>
+            </w:pPr>
+            <w:sdt>
+              <w:sdtPr>
+                <w14:checkbox>
+                  <w14:checked w14:val="0"/>
+                  <w14:checkedState w14:val="2612" w14:font="MS Gothic"/>
+                  <w14:uncheckedState w14:val="2610" w14:font="MS Gothic"/>
+                </w14:checkbox>
+              </w:sdtPr>
+              <w:sdtContent>
+                <w:r>
+                  <w:sym w:char="2610" w:font="MS Gothic"/>
+                </w:r>
+              </w:sdtContent>
+            </w:sdt>
+            <w:r>
+              <w:rPr>
+                <w:rFonts w:ascii="Calibri" w:cs="Calibri" w:eastAsia="Calibri" w:hAnsi="Calibri"/>
+                <w:color w:val="453A30"/>
+                <w:sz w:val="20"/>
+                <w:szCs w:val="20"/>
+              </w:rPr>
+              <w:t xml:space="preserve">  Try-on bow + scrunchie basket</w:t>
+            </w:r>
+          </w:p>
+          <w:p>
+            <w:pPr>
+              <w:spacing w:after="50"/>
+            </w:pPr>
+            <w:sdt>
+              <w:sdtPr>
+                <w14:checkbox>
+                  <w14:checked w14:val="0"/>
+                  <w14:checkedState w14:val="2612" w14:font="MS Gothic"/>
+                  <w14:uncheckedState w14:val="2610" w14:font="MS Gothic"/>
+                </w14:checkbox>
+              </w:sdtPr>
+              <w:sdtContent>
+                <w:r>
+                  <w:sym w:char="2610" w:font="MS Gothic"/>
+                </w:r>
+              </w:sdtContent>
+            </w:sdt>
+            <w:r>
+              <w:rPr>
+                <w:rFonts w:ascii="Calibri" w:cs="Calibri" w:eastAsia="Calibri" w:hAnsi="Calibri"/>
+                <w:color w:val="453A30"/>
+                <w:sz w:val="20"/>
+                <w:szCs w:val="20"/>
+              </w:rPr>
+              <w:t xml:space="preserve">  Display dog + bandana</w:t>
             </w:r>
           </w:p>
         </w:tc>

</xml_diff>

<commit_message>
Market fabric picks: printable cut list, checklist brought in line
Bows, bandanas and scrunchies for Oct 10 now name their prints and yardage.
Pumpkin Patch Picnic comes off the bow list (too large a print) and Amber
Wildflowers goes on; the Word copy and TASKS.md match.

Co-Authored-By: Claude Opus 5 <noreply@anthropic.com>
</commit_message>
<xml_diff>
--- a/marketing/october-market-prep.docx
+++ b/marketing/october-market-prep.docx
@@ -590,7 +590,7 @@
                 <w:sz w:val="18"/>
                 <w:szCs w:val="18"/>
               </w:rPr>
-              <w:t xml:space="preserve">— the market batch needs about 4–4½ yd of Christmas fabric</w:t>
+              <w:t xml:space="preserve">— Scarlet needs 2¾, Cream 1½ · the other prints are on the Market Cut List</w:t>
             </w:r>
           </w:p>
           <w:p>
@@ -628,7 +628,7 @@
                 <w:sz w:val="21"/>
                 <w:szCs w:val="21"/>
               </w:rPr>
-              <w:t xml:space="preserve">Buy only the gap — about 2 yd, two new prints (a plaid is the safe one)  </w:t>
+              <w:t xml:space="preserve">Short on Bowknots? Keep Scarlet for bows and bandanas, make the gift card holders in Cream, and buy only what's still short</w:t>
             </w:r>
             <w:r>
               <w:rPr>
@@ -637,7 +637,7 @@
                 <w:sz w:val="18"/>
                 <w:szCs w:val="18"/>
               </w:rPr>
-              <w:t xml:space="preserve">~$25–40</w:t>
+              <w:t xml:space="preserve"/>
             </w:r>
           </w:p>
           <w:p>
@@ -894,7 +894,7 @@
                 <w:sz w:val="18"/>
                 <w:szCs w:val="18"/>
               </w:rPr>
-              <w:t xml:space="preserve">  · Bowknots + new prints</w:t>
+              <w:t xml:space="preserve">  · Bowknots in Scarlet</w:t>
             </w:r>
             <w:r>
               <w:rPr>
@@ -1020,88 +1020,19 @@
               </w:rPr>
               <w:t xml:space="preserve"> </w:t>
             </w:r>
-            <w:sdt>
-              <w:sdtPr>
-                <w14:checkbox>
-                  <w14:checked w14:val="0"/>
-                  <w14:checkedState w14:val="2612" w14:font="MS Gothic"/>
-                  <w14:uncheckedState w14:val="2610" w14:font="MS Gothic"/>
-                </w14:checkbox>
-              </w:sdtPr>
-              <w:sdtContent>
-                <w:r>
-                  <w:sym w:char="2610" w:font="MS Gothic"/>
-                </w:r>
-              </w:sdtContent>
-            </w:sdt>
-            <w:r>
-              <w:rPr>
-                <w:rFonts w:ascii="Calibri" w:cs="Calibri" w:eastAsia="Calibri" w:hAnsi="Calibri"/>
-                <w:color w:val="453A30"/>
-                <w:sz w:val="21"/>
-                <w:szCs w:val="21"/>
-              </w:rPr>
-              <w:t xml:space="preserve"> </w:t>
-            </w:r>
-            <w:sdt>
-              <w:sdtPr>
-                <w14:checkbox>
-                  <w14:checked w14:val="0"/>
-                  <w14:checkedState w14:val="2612" w14:font="MS Gothic"/>
-                  <w14:uncheckedState w14:val="2610" w14:font="MS Gothic"/>
-                </w14:checkbox>
-              </w:sdtPr>
-              <w:sdtContent>
-                <w:r>
-                  <w:sym w:char="2610" w:font="MS Gothic"/>
-                </w:r>
-              </w:sdtContent>
-            </w:sdt>
-            <w:r>
-              <w:rPr>
-                <w:rFonts w:ascii="Calibri" w:cs="Calibri" w:eastAsia="Calibri" w:hAnsi="Calibri"/>
-                <w:color w:val="453A30"/>
-                <w:sz w:val="21"/>
-                <w:szCs w:val="21"/>
-              </w:rPr>
-              <w:t xml:space="preserve"> </w:t>
-            </w:r>
-            <w:sdt>
-              <w:sdtPr>
-                <w14:checkbox>
-                  <w14:checked w14:val="0"/>
-                  <w14:checkedState w14:val="2612" w14:font="MS Gothic"/>
-                  <w14:uncheckedState w14:val="2610" w14:font="MS Gothic"/>
-                </w14:checkbox>
-              </w:sdtPr>
-              <w:sdtContent>
-                <w:r>
-                  <w:sym w:char="2610" w:font="MS Gothic"/>
-                </w:r>
-              </w:sdtContent>
-            </w:sdt>
-            <w:r>
-              <w:rPr>
-                <w:rFonts w:ascii="Calibri" w:cs="Calibri" w:eastAsia="Calibri" w:hAnsi="Calibri"/>
-                <w:color w:val="453A30"/>
-                <w:sz w:val="21"/>
-                <w:szCs w:val="21"/>
-              </w:rPr>
-              <w:t xml:space="preserve"/>
-            </w:r>
-          </w:p>
-          <w:p>
-            <w:pPr>
-              <w:spacing w:after="40"/>
-            </w:pPr>
-            <w:r>
-              <w:rPr>
-                <w:rFonts w:ascii="Calibri" w:cs="Calibri" w:eastAsia="Calibri" w:hAnsi="Calibri"/>
-                <w:color w:val="453A30"/>
-                <w:sz w:val="21"/>
-                <w:szCs w:val="21"/>
-              </w:rPr>
-              <w:t xml:space="preserve">Halloween bows</w:t>
+          </w:p>
+          <w:p>
+            <w:pPr>
+              <w:spacing w:after="60"/>
+            </w:pPr>
+            <w:r>
+              <w:rPr>
+                <w:rFonts w:ascii="Calibri" w:cs="Calibri" w:eastAsia="Calibri" w:hAnsi="Calibri"/>
+                <w:color w:val="453A30"/>
+                <w:sz w:val="21"/>
+                <w:szCs w:val="21"/>
+              </w:rPr>
+              <w:t xml:space="preserve">Christmas bows</w:t>
             </w:r>
             <w:r>
               <w:rPr>
@@ -1110,6 +1041,107 @@
                 <w:sz w:val="18"/>
                 <w:szCs w:val="18"/>
               </w:rPr>
+              <w:t xml:space="preserve">  · Bowknots in Cream</w:t>
+            </w:r>
+            <w:r>
+              <w:rPr>
+                <w:rFonts w:ascii="Calibri" w:cs="Calibri" w:eastAsia="Calibri" w:hAnsi="Calibri"/>
+                <w:color w:val="453A30"/>
+                <w:sz w:val="21"/>
+                <w:szCs w:val="21"/>
+              </w:rPr>
+              <w:t xml:space="preserve">   </w:t>
+            </w:r>
+            <w:sdt>
+              <w:sdtPr>
+                <w14:checkbox>
+                  <w14:checked w14:val="0"/>
+                  <w14:checkedState w14:val="2612" w14:font="MS Gothic"/>
+                  <w14:uncheckedState w14:val="2610" w14:font="MS Gothic"/>
+                </w14:checkbox>
+              </w:sdtPr>
+              <w:sdtContent>
+                <w:r>
+                  <w:sym w:char="2610" w:font="MS Gothic"/>
+                </w:r>
+              </w:sdtContent>
+            </w:sdt>
+            <w:r>
+              <w:rPr>
+                <w:rFonts w:ascii="Calibri" w:cs="Calibri" w:eastAsia="Calibri" w:hAnsi="Calibri"/>
+                <w:color w:val="453A30"/>
+                <w:sz w:val="21"/>
+                <w:szCs w:val="21"/>
+              </w:rPr>
+              <w:t xml:space="preserve"> </w:t>
+            </w:r>
+            <w:sdt>
+              <w:sdtPr>
+                <w14:checkbox>
+                  <w14:checked w14:val="0"/>
+                  <w14:checkedState w14:val="2612" w14:font="MS Gothic"/>
+                  <w14:uncheckedState w14:val="2610" w14:font="MS Gothic"/>
+                </w14:checkbox>
+              </w:sdtPr>
+              <w:sdtContent>
+                <w:r>
+                  <w:sym w:char="2610" w:font="MS Gothic"/>
+                </w:r>
+              </w:sdtContent>
+            </w:sdt>
+            <w:r>
+              <w:rPr>
+                <w:rFonts w:ascii="Calibri" w:cs="Calibri" w:eastAsia="Calibri" w:hAnsi="Calibri"/>
+                <w:color w:val="453A30"/>
+                <w:sz w:val="21"/>
+                <w:szCs w:val="21"/>
+              </w:rPr>
+              <w:t xml:space="preserve"> </w:t>
+            </w:r>
+            <w:sdt>
+              <w:sdtPr>
+                <w14:checkbox>
+                  <w14:checked w14:val="0"/>
+                  <w14:checkedState w14:val="2612" w14:font="MS Gothic"/>
+                  <w14:uncheckedState w14:val="2610" w14:font="MS Gothic"/>
+                </w14:checkbox>
+              </w:sdtPr>
+              <w:sdtContent>
+                <w:r>
+                  <w:sym w:char="2610" w:font="MS Gothic"/>
+                </w:r>
+              </w:sdtContent>
+            </w:sdt>
+            <w:r>
+              <w:rPr>
+                <w:rFonts w:ascii="Calibri" w:cs="Calibri" w:eastAsia="Calibri" w:hAnsi="Calibri"/>
+                <w:color w:val="453A30"/>
+                <w:sz w:val="21"/>
+                <w:szCs w:val="21"/>
+              </w:rPr>
+              <w:t xml:space="preserve"> </w:t>
+            </w:r>
+          </w:p>
+          <w:p>
+            <w:pPr>
+              <w:spacing w:after="40"/>
+            </w:pPr>
+            <w:r>
+              <w:rPr>
+                <w:rFonts w:ascii="Calibri" w:cs="Calibri" w:eastAsia="Calibri" w:hAnsi="Calibri"/>
+                <w:color w:val="453A30"/>
+                <w:sz w:val="21"/>
+                <w:szCs w:val="21"/>
+              </w:rPr>
+              <w:t xml:space="preserve">Fall and Halloween bows</w:t>
+            </w:r>
+            <w:r>
+              <w:rPr>
+                <w:rFonts w:ascii="Calibri" w:cs="Calibri" w:eastAsia="Calibri" w:hAnsi="Calibri"/>
+                <w:color w:val="6A5B4A"/>
+                <w:sz w:val="18"/>
+                <w:szCs w:val="18"/>
+              </w:rPr>
               <w:t xml:space="preserve">  · one of each, to learn which sells</w:t>
             </w:r>
           </w:p>
@@ -1184,7 +1216,7 @@
                 <w:sz w:val="19"/>
                 <w:szCs w:val="19"/>
               </w:rPr>
-              <w:t xml:space="preserve"> Pumpkin Patch Picnic      </w:t>
+              <w:t xml:space="preserve"> Spider web      </w:t>
             </w:r>
             <w:sdt>
               <w:sdtPr>
@@ -1207,7 +1239,7 @@
                 <w:sz w:val="19"/>
                 <w:szCs w:val="19"/>
               </w:rPr>
-              <w:t xml:space="preserve"> Spider web      </w:t>
+              <w:t xml:space="preserve"> Amber Wildflowers      </w:t>
             </w:r>
           </w:p>
         </w:tc>
@@ -1618,7 +1650,7 @@
                 <w:sz w:val="18"/>
                 <w:szCs w:val="18"/>
               </w:rPr>
-              <w:t xml:space="preserve">  · one print</w:t>
+              <w:t xml:space="preserve">  · Bowknots in Scarlet</w:t>
             </w:r>
             <w:r>
               <w:rPr>
@@ -1812,7 +1844,7 @@
                 <w:sz w:val="18"/>
                 <w:szCs w:val="18"/>
               </w:rPr>
-              <w:t xml:space="preserve">  · 13–18″ neck</w:t>
+              <w:t xml:space="preserve">  · Scarlet/Cream · Hauntings/Midnight Harvest</w:t>
             </w:r>
             <w:r>
               <w:rPr>
@@ -1890,7 +1922,7 @@
                 <w:sz w:val="18"/>
                 <w:szCs w:val="18"/>
               </w:rPr>
-              <w:t xml:space="preserve">  · 18–23″ neck</w:t>
+              <w:t xml:space="preserve">  · Scarlet/Cream · Pumpkin Patch/Amber</w:t>
             </w:r>
             <w:r>
               <w:rPr>

</xml_diff>

<commit_message>
Hair whimsys on the market plan; Stripe catalog cleanup recorded
Six $5 hair whimsys (2 Scarlet, 2 Nesta's Cats, 1 Amber, 1 windowpane) added
to the cut list, checklist and Word copy, with updated yardage and hours.
TASKS.md records the Stripe catalog repricing and deactivated payment links.

Co-Authored-By: Claude Opus 5 <noreply@anthropic.com>
</commit_message>
<xml_diff>
--- a/marketing/october-market-prep.docx
+++ b/marketing/october-market-prep.docx
@@ -1301,7 +1301,7 @@
                 <w:szCs w:val="16"/>
                 <w:shd w:fill="DCEBEB" w:color="auto" w:val="clear"/>
               </w:rPr>
-              <w:t xml:space="preserve"> ~5 HOURS </w:t>
+              <w:t xml:space="preserve"> ~7 HOURS </w:t>
             </w:r>
           </w:p>
         </w:tc>
@@ -1332,7 +1332,7 @@
                 <w:sz w:val="22"/>
                 <w:szCs w:val="22"/>
               </w:rPr>
-              <w:t xml:space="preserve">Gift card holders and scrunchies</w:t>
+              <w:t xml:space="preserve">Gift card holders, scrunchies and hair whimsys</w:t>
             </w:r>
           </w:p>
           <w:p>
@@ -1660,6 +1660,176 @@
                 <w:szCs w:val="21"/>
               </w:rPr>
               <w:t xml:space="preserve">   </w:t>
+            </w:r>
+            <w:sdt>
+              <w:sdtPr>
+                <w14:checkbox>
+                  <w14:checked w14:val="0"/>
+                  <w14:checkedState w14:val="2612" w14:font="MS Gothic"/>
+                  <w14:uncheckedState w14:val="2610" w14:font="MS Gothic"/>
+                </w14:checkbox>
+              </w:sdtPr>
+              <w:sdtContent>
+                <w:r>
+                  <w:sym w:char="2610" w:font="MS Gothic"/>
+                </w:r>
+              </w:sdtContent>
+            </w:sdt>
+            <w:r>
+              <w:rPr>
+                <w:rFonts w:ascii="Calibri" w:cs="Calibri" w:eastAsia="Calibri" w:hAnsi="Calibri"/>
+                <w:color w:val="453A30"/>
+                <w:sz w:val="21"/>
+                <w:szCs w:val="21"/>
+              </w:rPr>
+              <w:t xml:space="preserve"> </w:t>
+            </w:r>
+            <w:sdt>
+              <w:sdtPr>
+                <w14:checkbox>
+                  <w14:checked w14:val="0"/>
+                  <w14:checkedState w14:val="2612" w14:font="MS Gothic"/>
+                  <w14:uncheckedState w14:val="2610" w14:font="MS Gothic"/>
+                </w14:checkbox>
+              </w:sdtPr>
+              <w:sdtContent>
+                <w:r>
+                  <w:sym w:char="2610" w:font="MS Gothic"/>
+                </w:r>
+              </w:sdtContent>
+            </w:sdt>
+            <w:r>
+              <w:rPr>
+                <w:rFonts w:ascii="Calibri" w:cs="Calibri" w:eastAsia="Calibri" w:hAnsi="Calibri"/>
+                <w:color w:val="453A30"/>
+                <w:sz w:val="21"/>
+                <w:szCs w:val="21"/>
+              </w:rPr>
+              <w:t xml:space="preserve"> </w:t>
+            </w:r>
+            <w:sdt>
+              <w:sdtPr>
+                <w14:checkbox>
+                  <w14:checked w14:val="0"/>
+                  <w14:checkedState w14:val="2612" w14:font="MS Gothic"/>
+                  <w14:uncheckedState w14:val="2610" w14:font="MS Gothic"/>
+                </w14:checkbox>
+              </w:sdtPr>
+              <w:sdtContent>
+                <w:r>
+                  <w:sym w:char="2610" w:font="MS Gothic"/>
+                </w:r>
+              </w:sdtContent>
+            </w:sdt>
+            <w:r>
+              <w:rPr>
+                <w:rFonts w:ascii="Calibri" w:cs="Calibri" w:eastAsia="Calibri" w:hAnsi="Calibri"/>
+                <w:color w:val="453A30"/>
+                <w:sz w:val="21"/>
+                <w:szCs w:val="21"/>
+              </w:rPr>
+              <w:t xml:space="preserve"/>
+            </w:r>
+          </w:p>
+          <w:p>
+            <w:pPr>
+              <w:spacing w:after="60"/>
+            </w:pPr>
+            <w:r>
+              <w:rPr>
+                <w:rFonts w:ascii="Calibri" w:cs="Calibri" w:eastAsia="Calibri" w:hAnsi="Calibri"/>
+                <w:color w:val="453A30"/>
+                <w:sz w:val="21"/>
+                <w:szCs w:val="21"/>
+              </w:rPr>
+              <w:t xml:space="preserve">Hair whimsys</w:t>
+            </w:r>
+            <w:r>
+              <w:rPr>
+                <w:rFonts w:ascii="Calibri" w:cs="Calibri" w:eastAsia="Calibri" w:hAnsi="Calibri"/>
+                <w:color w:val="6A5B4A"/>
+                <w:sz w:val="18"/>
+                <w:szCs w:val="18"/>
+              </w:rPr>
+              <w:t xml:space="preserve">  · 2 Scarlet · 2 Nesta's Cats · 1 Amber · 1 windowpane</w:t>
+            </w:r>
+            <w:r>
+              <w:rPr>
+                <w:rFonts w:ascii="Calibri" w:cs="Calibri" w:eastAsia="Calibri" w:hAnsi="Calibri"/>
+                <w:color w:val="453A30"/>
+                <w:sz w:val="21"/>
+                <w:szCs w:val="21"/>
+              </w:rPr>
+              <w:t xml:space="preserve">   </w:t>
+            </w:r>
+            <w:sdt>
+              <w:sdtPr>
+                <w14:checkbox>
+                  <w14:checked w14:val="0"/>
+                  <w14:checkedState w14:val="2612" w14:font="MS Gothic"/>
+                  <w14:uncheckedState w14:val="2610" w14:font="MS Gothic"/>
+                </w14:checkbox>
+              </w:sdtPr>
+              <w:sdtContent>
+                <w:r>
+                  <w:sym w:char="2610" w:font="MS Gothic"/>
+                </w:r>
+              </w:sdtContent>
+            </w:sdt>
+            <w:r>
+              <w:rPr>
+                <w:rFonts w:ascii="Calibri" w:cs="Calibri" w:eastAsia="Calibri" w:hAnsi="Calibri"/>
+                <w:color w:val="453A30"/>
+                <w:sz w:val="21"/>
+                <w:szCs w:val="21"/>
+              </w:rPr>
+              <w:t xml:space="preserve"> </w:t>
+            </w:r>
+            <w:sdt>
+              <w:sdtPr>
+                <w14:checkbox>
+                  <w14:checked w14:val="0"/>
+                  <w14:checkedState w14:val="2612" w14:font="MS Gothic"/>
+                  <w14:uncheckedState w14:val="2610" w14:font="MS Gothic"/>
+                </w14:checkbox>
+              </w:sdtPr>
+              <w:sdtContent>
+                <w:r>
+                  <w:sym w:char="2610" w:font="MS Gothic"/>
+                </w:r>
+              </w:sdtContent>
+            </w:sdt>
+            <w:r>
+              <w:rPr>
+                <w:rFonts w:ascii="Calibri" w:cs="Calibri" w:eastAsia="Calibri" w:hAnsi="Calibri"/>
+                <w:color w:val="453A30"/>
+                <w:sz w:val="21"/>
+                <w:szCs w:val="21"/>
+              </w:rPr>
+              <w:t xml:space="preserve"> </w:t>
+            </w:r>
+            <w:sdt>
+              <w:sdtPr>
+                <w14:checkbox>
+                  <w14:checked w14:val="0"/>
+                  <w14:checkedState w14:val="2612" w14:font="MS Gothic"/>
+                  <w14:uncheckedState w14:val="2610" w14:font="MS Gothic"/>
+                </w14:checkbox>
+              </w:sdtPr>
+              <w:sdtContent>
+                <w:r>
+                  <w:sym w:char="2610" w:font="MS Gothic"/>
+                </w:r>
+              </w:sdtContent>
+            </w:sdt>
+            <w:r>
+              <w:rPr>
+                <w:rFonts w:ascii="Calibri" w:cs="Calibri" w:eastAsia="Calibri" w:hAnsi="Calibri"/>
+                <w:color w:val="453A30"/>
+                <w:sz w:val="21"/>
+                <w:szCs w:val="21"/>
+              </w:rPr>
+              <w:t xml:space="preserve"> </w:t>
             </w:r>
             <w:sdt>
               <w:sdtPr>
@@ -2015,7 +2185,7 @@
                 <w:sz w:val="21"/>
                 <w:szCs w:val="21"/>
               </w:rPr>
-              <w:t xml:space="preserve">Price signs — Bows $12 · Scrunchies $6, 3 for $15 · Gift card holders $10 · Bandanas $18–22</w:t>
+              <w:t xml:space="preserve">Price signs — Bows $12 · Scrunchies $6, 3 for $15 · Hair whimsys $5 · Gift card holders $10 · Bandanas $18–22</w:t>
             </w:r>
           </w:p>
           <w:p>
@@ -2600,7 +2770,7 @@
           <w:sz w:val="18"/>
           <w:szCs w:val="18"/>
         </w:rPr>
-        <w:t xml:space="preserve">~16 hours</w:t>
+        <w:t xml:space="preserve">~18 hours</w:t>
       </w:r>
       <w:r>
         <w:rPr>
@@ -2620,7 +2790,7 @@
           <w:sz w:val="18"/>
           <w:szCs w:val="18"/>
         </w:rPr>
-        <w:t xml:space="preserve">~50 pieces already made + ~30 new</w:t>
+        <w:t xml:space="preserve">~50 pieces already made + ~35 new</w:t>
       </w:r>
       <w:r>
         <w:rPr>
@@ -5433,7 +5603,7 @@
           <w:sz w:val="18"/>
           <w:szCs w:val="18"/>
         </w:rPr>
-        <w:t xml:space="preserve">~22–24 hours over seven weeks</w:t>
+        <w:t xml:space="preserve">~24–26 hours over seven weeks</w:t>
       </w:r>
       <w:r>
         <w:rPr>

</xml_diff>

<commit_message>
Market plan: 13 new fat quarters for bows, bandanas and whimsys
The new prints (named, not on the website) become 7 bows, 2 Medium bandanas
and 6 hair whimsys, replacing Friendly Hauntings, Midnight Harvest and the
Scarlet/Amber/windowpane whimsys. Bows go to 14, bandanas to 5, whimsys to 8;
Bowknots needed drops to 2½ yd Scarlet and 1¼ yd Cream. Sewing list, checklist,
Word copy and TASKS.md agree. New fabrics appear as colour chips, not photos.

Co-Authored-By: Claude Opus 5 <noreply@anthropic.com>
</commit_message>
<xml_diff>
--- a/marketing/october-market-prep.docx
+++ b/marketing/october-market-prep.docx
@@ -590,7 +590,7 @@
                 <w:sz w:val="18"/>
                 <w:szCs w:val="18"/>
               </w:rPr>
-              <w:t xml:space="preserve">— Scarlet needs 2¾, Cream 1½ · the other prints are on the Market Cut List</w:t>
+              <w:t xml:space="preserve">— Scarlet needs 2½, Cream 1¼ · everything else is on the Market Sewing List</w:t>
             </w:r>
           </w:p>
           <w:p>
@@ -840,7 +840,7 @@
                 <w:szCs w:val="16"/>
                 <w:shd w:fill="DCEBEB" w:color="auto" w:val="clear"/>
               </w:rPr>
-              <w:t xml:space="preserve"> ~6 HOURS </w:t>
+              <w:t xml:space="preserve"> ~7 HOURS </w:t>
             </w:r>
           </w:p>
         </w:tc>
@@ -871,7 +871,7 @@
                 <w:sz w:val="22"/>
                 <w:szCs w:val="22"/>
               </w:rPr>
-              <w:t xml:space="preserve">Bows — cut all twelve in one sitting</w:t>
+              <w:t xml:space="preserve">Bows — cut all fourteen in one sitting</w:t>
             </w:r>
           </w:p>
           <w:p>
@@ -997,29 +997,6 @@
               </w:rPr>
               <w:t xml:space="preserve"> </w:t>
             </w:r>
-            <w:sdt>
-              <w:sdtPr>
-                <w14:checkbox>
-                  <w14:checked w14:val="0"/>
-                  <w14:checkedState w14:val="2612" w14:font="MS Gothic"/>
-                  <w14:uncheckedState w14:val="2610" w14:font="MS Gothic"/>
-                </w14:checkbox>
-              </w:sdtPr>
-              <w:sdtContent>
-                <w:r>
-                  <w:sym w:char="2610" w:font="MS Gothic"/>
-                </w:r>
-              </w:sdtContent>
-            </w:sdt>
-            <w:r>
-              <w:rPr>
-                <w:rFonts w:ascii="Calibri" w:cs="Calibri" w:eastAsia="Calibri" w:hAnsi="Calibri"/>
-                <w:color w:val="453A30"/>
-                <w:sz w:val="21"/>
-                <w:szCs w:val="21"/>
-              </w:rPr>
-              <w:t xml:space="preserve"> </w:t>
-            </w:r>
           </w:p>
           <w:p>
             <w:pPr>
@@ -1098,29 +1075,6 @@
               </w:rPr>
               <w:t xml:space="preserve"> </w:t>
             </w:r>
-            <w:sdt>
-              <w:sdtPr>
-                <w14:checkbox>
-                  <w14:checked w14:val="0"/>
-                  <w14:checkedState w14:val="2612" w14:font="MS Gothic"/>
-                  <w14:uncheckedState w14:val="2610" w14:font="MS Gothic"/>
-                </w14:checkbox>
-              </w:sdtPr>
-              <w:sdtContent>
-                <w:r>
-                  <w:sym w:char="2610" w:font="MS Gothic"/>
-                </w:r>
-              </w:sdtContent>
-            </w:sdt>
-            <w:r>
-              <w:rPr>
-                <w:rFonts w:ascii="Calibri" w:cs="Calibri" w:eastAsia="Calibri" w:hAnsi="Calibri"/>
-                <w:color w:val="453A30"/>
-                <w:sz w:val="21"/>
-                <w:szCs w:val="21"/>
-              </w:rPr>
-              <w:t xml:space="preserve"> </w:t>
-            </w:r>
           </w:p>
           <w:p>
             <w:pPr>
@@ -1133,7 +1087,7 @@
                 <w:sz w:val="21"/>
                 <w:szCs w:val="21"/>
               </w:rPr>
-              <w:t xml:space="preserve">Fall and Halloween bows</w:t>
+              <w:t xml:space="preserve">Christmas bows</w:t>
             </w:r>
             <w:r>
               <w:rPr>
@@ -1142,7 +1096,7 @@
                 <w:sz w:val="18"/>
                 <w:szCs w:val="18"/>
               </w:rPr>
-              <w:t xml:space="preserve">  · one of each, to learn which sells</w:t>
+              <w:t xml:space="preserve">  · one each</w:t>
             </w:r>
           </w:p>
           <w:p>
@@ -1170,7 +1124,7 @@
                 <w:sz w:val="19"/>
                 <w:szCs w:val="19"/>
               </w:rPr>
-              <w:t xml:space="preserve"> Friendly Hauntings      </w:t>
+              <w:t xml:space="preserve"> Starfall Pines      </w:t>
             </w:r>
             <w:sdt>
               <w:sdtPr>
@@ -1193,8 +1147,36 @@
                 <w:sz w:val="19"/>
                 <w:szCs w:val="19"/>
               </w:rPr>
-              <w:t xml:space="preserve"> Midnight Harvest      </w:t>
-            </w:r>
+              <w:t xml:space="preserve"> Solstice Tartan      </w:t>
+            </w:r>
+          </w:p>
+          <w:p>
+            <w:pPr>
+              <w:spacing w:after="40"/>
+            </w:pPr>
+            <w:r>
+              <w:rPr>
+                <w:rFonts w:ascii="Calibri" w:cs="Calibri" w:eastAsia="Calibri" w:hAnsi="Calibri"/>
+                <w:color w:val="453A30"/>
+                <w:sz w:val="21"/>
+                <w:szCs w:val="21"/>
+              </w:rPr>
+              <w:t xml:space="preserve">Fall and Halloween bows</w:t>
+            </w:r>
+            <w:r>
+              <w:rPr>
+                <w:rFonts w:ascii="Calibri" w:cs="Calibri" w:eastAsia="Calibri" w:hAnsi="Calibri"/>
+                <w:color w:val="6A5B4A"/>
+                <w:sz w:val="18"/>
+                <w:szCs w:val="18"/>
+              </w:rPr>
+              <w:t xml:space="preserve">  · one of each, to learn which sells</w:t>
+            </w:r>
+          </w:p>
+          <w:p>
+            <w:pPr>
+              <w:spacing w:after="60"/>
+            </w:pPr>
             <w:sdt>
               <w:sdtPr>
                 <w14:checkbox>
@@ -1216,7 +1198,7 @@
                 <w:sz w:val="19"/>
                 <w:szCs w:val="19"/>
               </w:rPr>
-              <w:t xml:space="preserve"> Spider web      </w:t>
+              <w:t xml:space="preserve"> Weaver's Web      </w:t>
             </w:r>
             <w:sdt>
               <w:sdtPr>
@@ -1239,7 +1221,127 @@
                 <w:sz w:val="19"/>
                 <w:szCs w:val="19"/>
               </w:rPr>
+              <w:t xml:space="preserve"> Nesta's Familiars      </w:t>
+            </w:r>
+            <w:sdt>
+              <w:sdtPr>
+                <w14:checkbox>
+                  <w14:checked w14:val="0"/>
+                  <w14:checkedState w14:val="2612" w14:font="MS Gothic"/>
+                  <w14:uncheckedState w14:val="2610" w14:font="MS Gothic"/>
+                </w14:checkbox>
+              </w:sdtPr>
+              <w:sdtContent>
+                <w:r>
+                  <w:sym w:char="2610" w:font="MS Gothic"/>
+                </w:r>
+              </w:sdtContent>
+            </w:sdt>
+            <w:r>
+              <w:rPr>
+                <w:rFonts w:ascii="Calibri" w:cs="Calibri" w:eastAsia="Calibri" w:hAnsi="Calibri"/>
+                <w:color w:val="453A30"/>
+                <w:sz w:val="19"/>
+                <w:szCs w:val="19"/>
+              </w:rPr>
+              <w:t xml:space="preserve"> Rita's Harlequin      </w:t>
+            </w:r>
+            <w:sdt>
+              <w:sdtPr>
+                <w14:checkbox>
+                  <w14:checked w14:val="0"/>
+                  <w14:checkedState w14:val="2612" w14:font="MS Gothic"/>
+                  <w14:uncheckedState w14:val="2610" w14:font="MS Gothic"/>
+                </w14:checkbox>
+              </w:sdtPr>
+              <w:sdtContent>
+                <w:r>
+                  <w:sym w:char="2610" w:font="MS Gothic"/>
+                </w:r>
+              </w:sdtContent>
+            </w:sdt>
+            <w:r>
+              <w:rPr>
+                <w:rFonts w:ascii="Calibri" w:cs="Calibri" w:eastAsia="Calibri" w:hAnsi="Calibri"/>
+                <w:color w:val="453A30"/>
+                <w:sz w:val="19"/>
+                <w:szCs w:val="19"/>
+              </w:rPr>
               <w:t xml:space="preserve"> Amber Wildflowers      </w:t>
+            </w:r>
+          </w:p>
+          <w:p>
+            <w:pPr>
+              <w:spacing w:after="40"/>
+            </w:pPr>
+            <w:r>
+              <w:rPr>
+                <w:rFonts w:ascii="Calibri" w:cs="Calibri" w:eastAsia="Calibri" w:hAnsi="Calibri"/>
+                <w:color w:val="453A30"/>
+                <w:sz w:val="21"/>
+                <w:szCs w:val="21"/>
+              </w:rPr>
+              <w:t xml:space="preserve">Any-season bows</w:t>
+            </w:r>
+            <w:r>
+              <w:rPr>
+                <w:rFonts w:ascii="Calibri" w:cs="Calibri" w:eastAsia="Calibri" w:hAnsi="Calibri"/>
+                <w:color w:val="6A5B4A"/>
+                <w:sz w:val="18"/>
+                <w:szCs w:val="18"/>
+              </w:rPr>
+              <w:t xml:space="preserve">  · one each</w:t>
+            </w:r>
+          </w:p>
+          <w:p>
+            <w:pPr>
+              <w:spacing w:after="60"/>
+            </w:pPr>
+            <w:sdt>
+              <w:sdtPr>
+                <w14:checkbox>
+                  <w14:checked w14:val="0"/>
+                  <w14:checkedState w14:val="2612" w14:font="MS Gothic"/>
+                  <w14:uncheckedState w14:val="2610" w14:font="MS Gothic"/>
+                </w14:checkbox>
+              </w:sdtPr>
+              <w:sdtContent>
+                <w:r>
+                  <w:sym w:char="2610" w:font="MS Gothic"/>
+                </w:r>
+              </w:sdtContent>
+            </w:sdt>
+            <w:r>
+              <w:rPr>
+                <w:rFonts w:ascii="Calibri" w:cs="Calibri" w:eastAsia="Calibri" w:hAnsi="Calibri"/>
+                <w:color w:val="453A30"/>
+                <w:sz w:val="19"/>
+                <w:szCs w:val="19"/>
+              </w:rPr>
+              <w:t xml:space="preserve"> Middengard Wyrms      </w:t>
+            </w:r>
+            <w:sdt>
+              <w:sdtPr>
+                <w14:checkbox>
+                  <w14:checked w14:val="0"/>
+                  <w14:checkedState w14:val="2612" w14:font="MS Gothic"/>
+                  <w14:uncheckedState w14:val="2610" w14:font="MS Gothic"/>
+                </w14:checkbox>
+              </w:sdtPr>
+              <w:sdtContent>
+                <w:r>
+                  <w:sym w:char="2610" w:font="MS Gothic"/>
+                </w:r>
+              </w:sdtContent>
+            </w:sdt>
+            <w:r>
+              <w:rPr>
+                <w:rFonts w:ascii="Calibri" w:cs="Calibri" w:eastAsia="Calibri" w:hAnsi="Calibri"/>
+                <w:color w:val="453A30"/>
+                <w:sz w:val="19"/>
+                <w:szCs w:val="19"/>
+              </w:rPr>
+              <w:t xml:space="preserve"> Dawn Court Dots      </w:t>
             </w:r>
           </w:p>
         </w:tc>
@@ -1751,7 +1853,7 @@
                 <w:sz w:val="18"/>
                 <w:szCs w:val="18"/>
               </w:rPr>
-              <w:t xml:space="preserve">  · 2 Scarlet · 2 Nesta's Cats · 1 Amber · 1 windowpane</w:t>
+              <w:t xml:space="preserve">  · 3 Night Court Stripe · 3 Hewn City Stripe · 2 Nesta's Cats</w:t>
             </w:r>
             <w:r>
               <w:rPr>
@@ -1761,6 +1863,52 @@
                 <w:szCs w:val="21"/>
               </w:rPr>
               <w:t xml:space="preserve">   </w:t>
+            </w:r>
+            <w:sdt>
+              <w:sdtPr>
+                <w14:checkbox>
+                  <w14:checked w14:val="0"/>
+                  <w14:checkedState w14:val="2612" w14:font="MS Gothic"/>
+                  <w14:uncheckedState w14:val="2610" w14:font="MS Gothic"/>
+                </w14:checkbox>
+              </w:sdtPr>
+              <w:sdtContent>
+                <w:r>
+                  <w:sym w:char="2610" w:font="MS Gothic"/>
+                </w:r>
+              </w:sdtContent>
+            </w:sdt>
+            <w:r>
+              <w:rPr>
+                <w:rFonts w:ascii="Calibri" w:cs="Calibri" w:eastAsia="Calibri" w:hAnsi="Calibri"/>
+                <w:color w:val="453A30"/>
+                <w:sz w:val="21"/>
+                <w:szCs w:val="21"/>
+              </w:rPr>
+              <w:t xml:space="preserve"> </w:t>
+            </w:r>
+            <w:sdt>
+              <w:sdtPr>
+                <w14:checkbox>
+                  <w14:checked w14:val="0"/>
+                  <w14:checkedState w14:val="2612" w14:font="MS Gothic"/>
+                  <w14:uncheckedState w14:val="2610" w14:font="MS Gothic"/>
+                </w14:checkbox>
+              </w:sdtPr>
+              <w:sdtContent>
+                <w:r>
+                  <w:sym w:char="2610" w:font="MS Gothic"/>
+                </w:r>
+              </w:sdtContent>
+            </w:sdt>
+            <w:r>
+              <w:rPr>
+                <w:rFonts w:ascii="Calibri" w:cs="Calibri" w:eastAsia="Calibri" w:hAnsi="Calibri"/>
+                <w:color w:val="453A30"/>
+                <w:sz w:val="21"/>
+                <w:szCs w:val="21"/>
+              </w:rPr>
+              <w:t xml:space="preserve"> </w:t>
             </w:r>
             <w:sdt>
               <w:sdtPr>
@@ -1960,7 +2108,7 @@
                 <w:szCs w:val="16"/>
                 <w:shd w:fill="DCEBEB" w:color="auto" w:val="clear"/>
               </w:rPr>
-              <w:t xml:space="preserve"> ~5 HOURS </w:t>
+              <w:t xml:space="preserve"> ~6 HOURS </w:t>
             </w:r>
           </w:p>
         </w:tc>
@@ -2014,7 +2162,7 @@
                 <w:sz w:val="18"/>
                 <w:szCs w:val="18"/>
               </w:rPr>
-              <w:t xml:space="preserve">  · Scarlet/Cream · Hauntings/Midnight Harvest</w:t>
+              <w:t xml:space="preserve">  · Scarlet/Cream · Bone Carver's Candy/Elain's Gingham · Autumn Court Gourds/Lucien's Patch</w:t>
             </w:r>
             <w:r>
               <w:rPr>
@@ -2024,6 +2172,29 @@
                 <w:szCs w:val="21"/>
               </w:rPr>
               <w:t xml:space="preserve">   </w:t>
+            </w:r>
+            <w:sdt>
+              <w:sdtPr>
+                <w14:checkbox>
+                  <w14:checked w14:val="0"/>
+                  <w14:checkedState w14:val="2612" w14:font="MS Gothic"/>
+                  <w14:uncheckedState w14:val="2610" w14:font="MS Gothic"/>
+                </w14:checkbox>
+              </w:sdtPr>
+              <w:sdtContent>
+                <w:r>
+                  <w:sym w:char="2610" w:font="MS Gothic"/>
+                </w:r>
+              </w:sdtContent>
+            </w:sdt>
+            <w:r>
+              <w:rPr>
+                <w:rFonts w:ascii="Calibri" w:cs="Calibri" w:eastAsia="Calibri" w:hAnsi="Calibri"/>
+                <w:color w:val="453A30"/>
+                <w:sz w:val="21"/>
+                <w:szCs w:val="21"/>
+              </w:rPr>
+              <w:t xml:space="preserve"> </w:t>
             </w:r>
             <w:sdt>
               <w:sdtPr>
@@ -2770,7 +2941,7 @@
           <w:sz w:val="18"/>
           <w:szCs w:val="18"/>
         </w:rPr>
-        <w:t xml:space="preserve">~18 hours</w:t>
+        <w:t xml:space="preserve">~20 hours</w:t>
       </w:r>
       <w:r>
         <w:rPr>
@@ -2790,7 +2961,7 @@
           <w:sz w:val="18"/>
           <w:szCs w:val="18"/>
         </w:rPr>
-        <w:t xml:space="preserve">~50 pieces already made + ~35 new</w:t>
+        <w:t xml:space="preserve">~50 pieces already made + ~40 new</w:t>
       </w:r>
       <w:r>
         <w:rPr>
@@ -5603,7 +5774,7 @@
           <w:sz w:val="18"/>
           <w:szCs w:val="18"/>
         </w:rPr>
-        <w:t xml:space="preserve">~24–26 hours over seven weeks</w:t>
+        <w:t xml:space="preserve">~27–29 hours over seven weeks</w:t>
       </w:r>
       <w:r>
         <w:rPr>

</xml_diff>

<commit_message>
Market checklist: signs, price tags, holders, banner and permit copy
Oct 3-8 now covers printing and test-scanning the signs, cutting the price
tags, sign holders, a name banner, the permit copy, asking about insurance
and the local tax rate, and a Tap to Pay practice sale. The pack list gains
the same items. TASKS.md records the finished signs, tags and flyer, which
live in Downloads rather than the repo.

Co-Authored-By: Claude Opus 5 <noreply@anthropic.com>
</commit_message>
<xml_diff>
--- a/marketing/october-market-prep.docx
+++ b/marketing/october-market-prep.docx
@@ -2356,7 +2356,7 @@
                 <w:sz w:val="21"/>
                 <w:szCs w:val="21"/>
               </w:rPr>
-              <w:t xml:space="preserve">Price signs — Bows $12 · Scrunchies $6, 3 for $15 · Hair whimsys $5 · Gift card holders $10 · Bandanas $18–22</w:t>
+              <w:t xml:space="preserve">Print the price sign + QR sign — scan each QR with your phone · print + cut the price tags (totes, sleeve, tea cover, Suriel set, headband, gift card holders)</w:t>
             </w:r>
           </w:p>
           <w:p>
@@ -2394,7 +2394,83 @@
                 <w:sz w:val="21"/>
                 <w:szCs w:val="21"/>
               </w:rPr>
-              <w:t xml:space="preserve">QR sign — the shop · join the Nest · custom orders</w:t>
+              <w:t xml:space="preserve">Two sign holders · a name banner for the table front · a copy of the sales tax permit</w:t>
+            </w:r>
+          </w:p>
+          <w:p>
+            <w:pPr>
+              <w:spacing w:after="60"/>
+              <w:ind w:left="300" w:hanging="300"/>
+            </w:pPr>
+            <w:sdt>
+              <w:sdtPr>
+                <w14:checkbox>
+                  <w14:checked w14:val="0"/>
+                  <w14:checkedState w14:val="2612" w14:font="MS Gothic"/>
+                  <w14:uncheckedState w14:val="2610" w14:font="MS Gothic"/>
+                </w14:checkbox>
+              </w:sdtPr>
+              <w:sdtContent>
+                <w:r>
+                  <w:sym w:char="2610" w:font="MS Gothic"/>
+                </w:r>
+              </w:sdtContent>
+            </w:sdt>
+            <w:r>
+              <w:rPr>
+                <w:rFonts w:ascii="Calibri" w:cs="Calibri" w:eastAsia="Calibri" w:hAnsi="Calibri"/>
+                <w:color w:val="453A30"/>
+                <w:sz w:val="21"/>
+                <w:szCs w:val="21"/>
+              </w:rPr>
+              <w:t xml:space="preserve">  </w:t>
+            </w:r>
+            <w:r>
+              <w:rPr>
+                <w:rFonts w:ascii="Calibri" w:cs="Calibri" w:eastAsia="Calibri" w:hAnsi="Calibri"/>
+                <w:color w:val="453A30"/>
+                <w:sz w:val="21"/>
+                <w:szCs w:val="21"/>
+              </w:rPr>
+              <w:t xml:space="preserve">Ask the market: liability insurance? · check the tax rate if it's outside San Antonio (the 7.6% assumes 8.25%)</w:t>
+            </w:r>
+          </w:p>
+          <w:p>
+            <w:pPr>
+              <w:spacing w:after="60"/>
+              <w:ind w:left="300" w:hanging="300"/>
+            </w:pPr>
+            <w:sdt>
+              <w:sdtPr>
+                <w14:checkbox>
+                  <w14:checked w14:val="0"/>
+                  <w14:checkedState w14:val="2612" w14:font="MS Gothic"/>
+                  <w14:uncheckedState w14:val="2610" w14:font="MS Gothic"/>
+                </w14:checkbox>
+              </w:sdtPr>
+              <w:sdtContent>
+                <w:r>
+                  <w:sym w:char="2610" w:font="MS Gothic"/>
+                </w:r>
+              </w:sdtContent>
+            </w:sdt>
+            <w:r>
+              <w:rPr>
+                <w:rFonts w:ascii="Calibri" w:cs="Calibri" w:eastAsia="Calibri" w:hAnsi="Calibri"/>
+                <w:color w:val="453A30"/>
+                <w:sz w:val="21"/>
+                <w:szCs w:val="21"/>
+              </w:rPr>
+              <w:t xml:space="preserve">  </w:t>
+            </w:r>
+            <w:r>
+              <w:rPr>
+                <w:rFonts w:ascii="Calibri" w:cs="Calibri" w:eastAsia="Calibri" w:hAnsi="Calibri"/>
+                <w:color w:val="453A30"/>
+                <w:sz w:val="21"/>
+                <w:szCs w:val="21"/>
+              </w:rPr>
+              <w:t xml:space="preserve">Tap to Pay: $1 test charge + refund · practise a 3-for-$15 scrunchie sale</w:t>
             </w:r>
           </w:p>
           <w:p>
@@ -5160,6 +5236,118 @@
                 <w:szCs w:val="20"/>
               </w:rPr>
               <w:t xml:space="preserve">  Price signs + QR sign</w:t>
+            </w:r>
+          </w:p>
+          <w:p>
+            <w:pPr>
+              <w:spacing w:after="50"/>
+            </w:pPr>
+            <w:sdt>
+              <w:sdtPr>
+                <w14:checkbox>
+                  <w14:checked w14:val="0"/>
+                  <w14:checkedState w14:val="2612" w14:font="MS Gothic"/>
+                  <w14:uncheckedState w14:val="2610" w14:font="MS Gothic"/>
+                </w14:checkbox>
+              </w:sdtPr>
+              <w:sdtContent>
+                <w:r>
+                  <w:sym w:char="2610" w:font="MS Gothic"/>
+                </w:r>
+              </w:sdtContent>
+            </w:sdt>
+            <w:r>
+              <w:rPr>
+                <w:rFonts w:ascii="Calibri" w:cs="Calibri" w:eastAsia="Calibri" w:hAnsi="Calibri"/>
+                <w:color w:val="453A30"/>
+                <w:sz w:val="20"/>
+                <w:szCs w:val="20"/>
+              </w:rPr>
+              <w:t xml:space="preserve">  Sign holders</w:t>
+            </w:r>
+          </w:p>
+          <w:p>
+            <w:pPr>
+              <w:spacing w:after="50"/>
+            </w:pPr>
+            <w:sdt>
+              <w:sdtPr>
+                <w14:checkbox>
+                  <w14:checked w14:val="0"/>
+                  <w14:checkedState w14:val="2612" w14:font="MS Gothic"/>
+                  <w14:uncheckedState w14:val="2610" w14:font="MS Gothic"/>
+                </w14:checkbox>
+              </w:sdtPr>
+              <w:sdtContent>
+                <w:r>
+                  <w:sym w:char="2610" w:font="MS Gothic"/>
+                </w:r>
+              </w:sdtContent>
+            </w:sdt>
+            <w:r>
+              <w:rPr>
+                <w:rFonts w:ascii="Calibri" w:cs="Calibri" w:eastAsia="Calibri" w:hAnsi="Calibri"/>
+                <w:color w:val="453A30"/>
+                <w:sz w:val="20"/>
+                <w:szCs w:val="20"/>
+              </w:rPr>
+              <w:t xml:space="preserve">  Price tags + safety pins</w:t>
+            </w:r>
+          </w:p>
+          <w:p>
+            <w:pPr>
+              <w:spacing w:after="50"/>
+            </w:pPr>
+            <w:sdt>
+              <w:sdtPr>
+                <w14:checkbox>
+                  <w14:checked w14:val="0"/>
+                  <w14:checkedState w14:val="2612" w14:font="MS Gothic"/>
+                  <w14:uncheckedState w14:val="2610" w14:font="MS Gothic"/>
+                </w14:checkbox>
+              </w:sdtPr>
+              <w:sdtContent>
+                <w:r>
+                  <w:sym w:char="2610" w:font="MS Gothic"/>
+                </w:r>
+              </w:sdtContent>
+            </w:sdt>
+            <w:r>
+              <w:rPr>
+                <w:rFonts w:ascii="Calibri" w:cs="Calibri" w:eastAsia="Calibri" w:hAnsi="Calibri"/>
+                <w:color w:val="453A30"/>
+                <w:sz w:val="20"/>
+                <w:szCs w:val="20"/>
+              </w:rPr>
+              <w:t xml:space="preserve">  Name banner</w:t>
+            </w:r>
+          </w:p>
+          <w:p>
+            <w:pPr>
+              <w:spacing w:after="50"/>
+            </w:pPr>
+            <w:sdt>
+              <w:sdtPr>
+                <w14:checkbox>
+                  <w14:checked w14:val="0"/>
+                  <w14:checkedState w14:val="2612" w14:font="MS Gothic"/>
+                  <w14:uncheckedState w14:val="2610" w14:font="MS Gothic"/>
+                </w14:checkbox>
+              </w:sdtPr>
+              <w:sdtContent>
+                <w:r>
+                  <w:sym w:char="2610" w:font="MS Gothic"/>
+                </w:r>
+              </w:sdtContent>
+            </w:sdt>
+            <w:r>
+              <w:rPr>
+                <w:rFonts w:ascii="Calibri" w:cs="Calibri" w:eastAsia="Calibri" w:hAnsi="Calibri"/>
+                <w:color w:val="453A30"/>
+                <w:sz w:val="20"/>
+                <w:szCs w:val="20"/>
+              </w:rPr>
+              <w:t xml:space="preserve">  Sales tax permit copy</w:t>
             </w:r>
           </w:p>
         </w:tc>

</xml_diff>

<commit_message>
Sep 26 evening market added; booth prep pulled forward
A third market (Sat Sep 26, indoor, evening, $20) becomes the first. Bows and
hair whimsys move to Sep 19-24, the booth work moves up from Oct 3-8, and the
checklist gains Fri Sep 25, Sat Sep 26 and Sun Sep 27. October markets are
renumbered 2 and 3, fees total $80. Sewing list, Word copy and TASKS.md match.

Co-Authored-By: Claude Opus 5 <noreply@anthropic.com>
</commit_message>
<xml_diff>
--- a/marketing/october-market-prep.docx
+++ b/marketing/october-market-prep.docx
@@ -42,7 +42,7 @@
           <w:sz w:val="18"/>
           <w:szCs w:val="18"/>
         </w:rPr>
-        <w:t xml:space="preserve">Two outdoor markets · 6-ft table (mine) · canopy to borrow · $30 each      </w:t>
+        <w:t xml:space="preserve">Three markets · Sep 26 indoor evening, $20 · Oct 10 and Oct 30 outdoor, $30 each · 6-ft table (mine)      </w:t>
       </w:r>
       <w:r>
         <w:rPr>
@@ -53,7 +53,7 @@
           <w:sz w:val="20"/>
           <w:szCs w:val="20"/>
         </w:rPr>
-        <w:t xml:space="preserve">Sat Oct 10 — day   ·   Fri Oct 30 — night</w:t>
+        <w:t xml:space="preserve">Sat Sep 26 — evening   ·   Sat Oct 10 — day   ·   Fri Oct 30 — night</w:t>
       </w:r>
     </w:p>
     <w:tbl>
@@ -96,11 +96,11 @@
                 <w:rFonts w:ascii="Georgia" w:cs="Georgia" w:eastAsia="Georgia" w:hAnsi="Georgia"/>
                 <w:b/>
                 <w:bCs/>
-                <w:color w:val="B9862A"/>
+                <w:color w:val="453A30"/>
                 <w:sz w:val="22"/>
                 <w:szCs w:val="22"/>
               </w:rPr>
-              <w:t xml:space="preserve">Sep 15</w:t>
+              <w:t xml:space="preserve">Sep 18</w:t>
             </w:r>
           </w:p>
           <w:p>
@@ -111,7 +111,7 @@
                 <w:sz w:val="18"/>
                 <w:szCs w:val="18"/>
               </w:rPr>
-              <w:t xml:space="preserve">Federal estimated tax</w:t>
+              <w:t xml:space="preserve">Shadow box due to Linda</w:t>
             </w:r>
           </w:p>
         </w:tc>
@@ -135,11 +135,11 @@
                 <w:rFonts w:ascii="Georgia" w:cs="Georgia" w:eastAsia="Georgia" w:hAnsi="Georgia"/>
                 <w:b/>
                 <w:bCs/>
-                <w:color w:val="453A30"/>
+                <w:color w:val="A34A6B"/>
                 <w:sz w:val="22"/>
                 <w:szCs w:val="22"/>
               </w:rPr>
-              <w:t xml:space="preserve">Sep 18</w:t>
+              <w:t xml:space="preserve">Sep 26</w:t>
             </w:r>
           </w:p>
           <w:p>
@@ -150,7 +150,7 @@
                 <w:sz w:val="18"/>
                 <w:szCs w:val="18"/>
               </w:rPr>
-              <w:t xml:space="preserve">Shadow box due to Linda</w:t>
+              <w:t xml:space="preserve">Market 1 · evening</w:t>
             </w:r>
           </w:p>
         </w:tc>
@@ -189,7 +189,7 @@
                 <w:sz w:val="18"/>
                 <w:szCs w:val="18"/>
               </w:rPr>
-              <w:t xml:space="preserve">Market 1 · day</w:t>
+              <w:t xml:space="preserve">Market 2 · day</w:t>
             </w:r>
           </w:p>
         </w:tc>
@@ -267,7 +267,7 @@
                 <w:sz w:val="18"/>
                 <w:szCs w:val="18"/>
               </w:rPr>
-              <w:t xml:space="preserve">Market 2 · night</w:t>
+              <w:t xml:space="preserve">Market 3 · night</w:t>
             </w:r>
           </w:p>
         </w:tc>
@@ -812,7 +812,7 @@
                 <w:sz w:val="24"/>
                 <w:szCs w:val="24"/>
               </w:rPr>
-              <w:t xml:space="preserve">Sep 19 – 25</w:t>
+              <w:t xml:space="preserve">Sep 19 – 24</w:t>
             </w:r>
           </w:p>
           <w:p>
@@ -823,7 +823,7 @@
                 <w:sz w:val="18"/>
                 <w:szCs w:val="18"/>
               </w:rPr>
-              <w:t xml:space="preserve">Sat – Fri</w:t>
+              <w:t xml:space="preserve">Sat – Thu</w:t>
             </w:r>
           </w:p>
           <w:p>
@@ -840,7 +840,7 @@
                 <w:szCs w:val="16"/>
                 <w:shd w:fill="DCEBEB" w:color="auto" w:val="clear"/>
               </w:rPr>
-              <w:t xml:space="preserve"> ~7 HOURS </w:t>
+              <w:t xml:space="preserve"> ~10 HOURS </w:t>
             </w:r>
           </w:p>
         </w:tc>
@@ -871,7 +871,7 @@
                 <w:sz w:val="22"/>
                 <w:szCs w:val="22"/>
               </w:rPr>
-              <w:t xml:space="preserve">Bows — cut all fourteen in one sitting</w:t>
+              <w:t xml:space="preserve">Bows and hair whimsys — ready for Sep 26</w:t>
             </w:r>
           </w:p>
           <w:p>
@@ -1342,6 +1342,222 @@
                 <w:szCs w:val="19"/>
               </w:rPr>
               <w:t xml:space="preserve"> Dawn Court Dots      </w:t>
+            </w:r>
+          </w:p>
+          <w:p>
+            <w:pPr>
+              <w:spacing w:after="60"/>
+            </w:pPr>
+            <w:r>
+              <w:rPr>
+                <w:rFonts w:ascii="Calibri" w:cs="Calibri" w:eastAsia="Calibri" w:hAnsi="Calibri"/>
+                <w:color w:val="453A30"/>
+                <w:sz w:val="21"/>
+                <w:szCs w:val="21"/>
+              </w:rPr>
+              <w:t xml:space="preserve">Hair whimsys</w:t>
+            </w:r>
+            <w:r>
+              <w:rPr>
+                <w:rFonts w:ascii="Calibri" w:cs="Calibri" w:eastAsia="Calibri" w:hAnsi="Calibri"/>
+                <w:color w:val="6A5B4A"/>
+                <w:sz w:val="18"/>
+                <w:szCs w:val="18"/>
+              </w:rPr>
+              <w:t xml:space="preserve">  · 3 Night Court Stripe · 3 Hewn City Stripe · 2 Nesta's Cats</w:t>
+            </w:r>
+            <w:r>
+              <w:rPr>
+                <w:rFonts w:ascii="Calibri" w:cs="Calibri" w:eastAsia="Calibri" w:hAnsi="Calibri"/>
+                <w:color w:val="453A30"/>
+                <w:sz w:val="21"/>
+                <w:szCs w:val="21"/>
+              </w:rPr>
+              <w:t xml:space="preserve">   </w:t>
+            </w:r>
+            <w:sdt>
+              <w:sdtPr>
+                <w14:checkbox>
+                  <w14:checked w14:val="0"/>
+                  <w14:checkedState w14:val="2612" w14:font="MS Gothic"/>
+                  <w14:uncheckedState w14:val="2610" w14:font="MS Gothic"/>
+                </w14:checkbox>
+              </w:sdtPr>
+              <w:sdtContent>
+                <w:r>
+                  <w:sym w:char="2610" w:font="MS Gothic"/>
+                </w:r>
+              </w:sdtContent>
+            </w:sdt>
+            <w:r>
+              <w:rPr>
+                <w:rFonts w:ascii="Calibri" w:cs="Calibri" w:eastAsia="Calibri" w:hAnsi="Calibri"/>
+                <w:color w:val="453A30"/>
+                <w:sz w:val="21"/>
+                <w:szCs w:val="21"/>
+              </w:rPr>
+              <w:t xml:space="preserve"> </w:t>
+            </w:r>
+            <w:sdt>
+              <w:sdtPr>
+                <w14:checkbox>
+                  <w14:checked w14:val="0"/>
+                  <w14:checkedState w14:val="2612" w14:font="MS Gothic"/>
+                  <w14:uncheckedState w14:val="2610" w14:font="MS Gothic"/>
+                </w14:checkbox>
+              </w:sdtPr>
+              <w:sdtContent>
+                <w:r>
+                  <w:sym w:char="2610" w:font="MS Gothic"/>
+                </w:r>
+              </w:sdtContent>
+            </w:sdt>
+            <w:r>
+              <w:rPr>
+                <w:rFonts w:ascii="Calibri" w:cs="Calibri" w:eastAsia="Calibri" w:hAnsi="Calibri"/>
+                <w:color w:val="453A30"/>
+                <w:sz w:val="21"/>
+                <w:szCs w:val="21"/>
+              </w:rPr>
+              <w:t xml:space="preserve"> </w:t>
+            </w:r>
+            <w:sdt>
+              <w:sdtPr>
+                <w14:checkbox>
+                  <w14:checked w14:val="0"/>
+                  <w14:checkedState w14:val="2612" w14:font="MS Gothic"/>
+                  <w14:uncheckedState w14:val="2610" w14:font="MS Gothic"/>
+                </w14:checkbox>
+              </w:sdtPr>
+              <w:sdtContent>
+                <w:r>
+                  <w:sym w:char="2610" w:font="MS Gothic"/>
+                </w:r>
+              </w:sdtContent>
+            </w:sdt>
+            <w:r>
+              <w:rPr>
+                <w:rFonts w:ascii="Calibri" w:cs="Calibri" w:eastAsia="Calibri" w:hAnsi="Calibri"/>
+                <w:color w:val="453A30"/>
+                <w:sz w:val="21"/>
+                <w:szCs w:val="21"/>
+              </w:rPr>
+              <w:t xml:space="preserve"> </w:t>
+            </w:r>
+            <w:sdt>
+              <w:sdtPr>
+                <w14:checkbox>
+                  <w14:checked w14:val="0"/>
+                  <w14:checkedState w14:val="2612" w14:font="MS Gothic"/>
+                  <w14:uncheckedState w14:val="2610" w14:font="MS Gothic"/>
+                </w14:checkbox>
+              </w:sdtPr>
+              <w:sdtContent>
+                <w:r>
+                  <w:sym w:char="2610" w:font="MS Gothic"/>
+                </w:r>
+              </w:sdtContent>
+            </w:sdt>
+            <w:r>
+              <w:rPr>
+                <w:rFonts w:ascii="Calibri" w:cs="Calibri" w:eastAsia="Calibri" w:hAnsi="Calibri"/>
+                <w:color w:val="453A30"/>
+                <w:sz w:val="21"/>
+                <w:szCs w:val="21"/>
+              </w:rPr>
+              <w:t xml:space="preserve"> </w:t>
+            </w:r>
+            <w:sdt>
+              <w:sdtPr>
+                <w14:checkbox>
+                  <w14:checked w14:val="0"/>
+                  <w14:checkedState w14:val="2612" w14:font="MS Gothic"/>
+                  <w14:uncheckedState w14:val="2610" w14:font="MS Gothic"/>
+                </w14:checkbox>
+              </w:sdtPr>
+              <w:sdtContent>
+                <w:r>
+                  <w:sym w:char="2610" w:font="MS Gothic"/>
+                </w:r>
+              </w:sdtContent>
+            </w:sdt>
+            <w:r>
+              <w:rPr>
+                <w:rFonts w:ascii="Calibri" w:cs="Calibri" w:eastAsia="Calibri" w:hAnsi="Calibri"/>
+                <w:color w:val="453A30"/>
+                <w:sz w:val="21"/>
+                <w:szCs w:val="21"/>
+              </w:rPr>
+              <w:t xml:space="preserve"> </w:t>
+            </w:r>
+            <w:sdt>
+              <w:sdtPr>
+                <w14:checkbox>
+                  <w14:checked w14:val="0"/>
+                  <w14:checkedState w14:val="2612" w14:font="MS Gothic"/>
+                  <w14:uncheckedState w14:val="2610" w14:font="MS Gothic"/>
+                </w14:checkbox>
+              </w:sdtPr>
+              <w:sdtContent>
+                <w:r>
+                  <w:sym w:char="2610" w:font="MS Gothic"/>
+                </w:r>
+              </w:sdtContent>
+            </w:sdt>
+            <w:r>
+              <w:rPr>
+                <w:rFonts w:ascii="Calibri" w:cs="Calibri" w:eastAsia="Calibri" w:hAnsi="Calibri"/>
+                <w:color w:val="453A30"/>
+                <w:sz w:val="21"/>
+                <w:szCs w:val="21"/>
+              </w:rPr>
+              <w:t xml:space="preserve"> </w:t>
+            </w:r>
+            <w:sdt>
+              <w:sdtPr>
+                <w14:checkbox>
+                  <w14:checked w14:val="0"/>
+                  <w14:checkedState w14:val="2612" w14:font="MS Gothic"/>
+                  <w14:uncheckedState w14:val="2610" w14:font="MS Gothic"/>
+                </w14:checkbox>
+              </w:sdtPr>
+              <w:sdtContent>
+                <w:r>
+                  <w:sym w:char="2610" w:font="MS Gothic"/>
+                </w:r>
+              </w:sdtContent>
+            </w:sdt>
+            <w:r>
+              <w:rPr>
+                <w:rFonts w:ascii="Calibri" w:cs="Calibri" w:eastAsia="Calibri" w:hAnsi="Calibri"/>
+                <w:color w:val="453A30"/>
+                <w:sz w:val="21"/>
+                <w:szCs w:val="21"/>
+              </w:rPr>
+              <w:t xml:space="preserve"> </w:t>
+            </w:r>
+            <w:sdt>
+              <w:sdtPr>
+                <w14:checkbox>
+                  <w14:checked w14:val="0"/>
+                  <w14:checkedState w14:val="2612" w14:font="MS Gothic"/>
+                  <w14:uncheckedState w14:val="2610" w14:font="MS Gothic"/>
+                </w14:checkbox>
+              </w:sdtPr>
+              <w:sdtContent>
+                <w:r>
+                  <w:sym w:char="2610" w:font="MS Gothic"/>
+                </w:r>
+              </w:sdtContent>
+            </w:sdt>
+            <w:r>
+              <w:rPr>
+                <w:rFonts w:ascii="Calibri" w:cs="Calibri" w:eastAsia="Calibri" w:hAnsi="Calibri"/>
+                <w:color w:val="453A30"/>
+                <w:sz w:val="21"/>
+                <w:szCs w:val="21"/>
+              </w:rPr>
+              <w:t xml:space="preserve"/>
             </w:r>
           </w:p>
         </w:tc>
@@ -1375,7 +1591,7 @@
                 <w:sz w:val="24"/>
                 <w:szCs w:val="24"/>
               </w:rPr>
-              <w:t xml:space="preserve">Sep 26 – Oct 2</w:t>
+              <w:t xml:space="preserve">Sep 19 – 24</w:t>
             </w:r>
           </w:p>
           <w:p>
@@ -1386,7 +1602,7 @@
                 <w:sz w:val="18"/>
                 <w:szCs w:val="18"/>
               </w:rPr>
-              <w:t xml:space="preserve">Sat – Fri</w:t>
+              <w:t xml:space="preserve">alongside the sewing</w:t>
             </w:r>
           </w:p>
           <w:p>
@@ -1403,7 +1619,7 @@
                 <w:szCs w:val="16"/>
                 <w:shd w:fill="DCEBEB" w:color="auto" w:val="clear"/>
               </w:rPr>
-              <w:t xml:space="preserve"> ~7 HOURS </w:t>
+              <w:t xml:space="preserve"> THE BOOTH </w:t>
             </w:r>
           </w:p>
         </w:tc>
@@ -1434,7 +1650,7 @@
                 <w:sz w:val="22"/>
                 <w:szCs w:val="22"/>
               </w:rPr>
-              <w:t xml:space="preserve">Gift card holders, scrunchies and hair whimsys</w:t>
+              <w:t xml:space="preserve">Get the table ready for Sep 26</w:t>
             </w:r>
           </w:p>
           <w:p>
@@ -1472,39 +1688,197 @@
                 <w:sz w:val="21"/>
                 <w:szCs w:val="21"/>
               </w:rPr>
-              <w:t xml:space="preserve">Make ONE gift card holder and time it: </w:t>
-            </w:r>
-            <w:r>
-              <w:rPr>
-                <w:rFonts w:ascii="Calibri" w:cs="Calibri" w:eastAsia="Calibri" w:hAnsi="Calibri"/>
-                <w:color w:val="453A30"/>
-                <w:sz w:val="21"/>
-                <w:szCs w:val="21"/>
-              </w:rPr>
-              <w:t xml:space="preserve">______</w:t>
-            </w:r>
-            <w:r>
-              <w:rPr>
-                <w:rFonts w:ascii="Calibri" w:cs="Calibri" w:eastAsia="Calibri" w:hAnsi="Calibri"/>
-                <w:color w:val="453A30"/>
-                <w:sz w:val="21"/>
-                <w:szCs w:val="21"/>
-              </w:rPr>
-              <w:t xml:space="preserve"> min</w:t>
+              <w:t xml:space="preserve">Print the price sign + QR sign — scan each QR with your phone · print + cut the price tags (totes, sleeve, tea cover, Suriel set, headband, gift card holders)</w:t>
             </w:r>
           </w:p>
           <w:p>
             <w:pPr>
               <w:spacing w:after="60"/>
-            </w:pPr>
-            <w:r>
-              <w:rPr>
-                <w:rFonts w:ascii="Calibri" w:cs="Calibri" w:eastAsia="Calibri" w:hAnsi="Calibri"/>
-                <w:color w:val="453A30"/>
-                <w:sz w:val="21"/>
-                <w:szCs w:val="21"/>
-              </w:rPr>
-              <w:t xml:space="preserve">Gift card holders</w:t>
+              <w:ind w:left="300" w:hanging="300"/>
+            </w:pPr>
+            <w:sdt>
+              <w:sdtPr>
+                <w14:checkbox>
+                  <w14:checked w14:val="0"/>
+                  <w14:checkedState w14:val="2612" w14:font="MS Gothic"/>
+                  <w14:uncheckedState w14:val="2610" w14:font="MS Gothic"/>
+                </w14:checkbox>
+              </w:sdtPr>
+              <w:sdtContent>
+                <w:r>
+                  <w:sym w:char="2610" w:font="MS Gothic"/>
+                </w:r>
+              </w:sdtContent>
+            </w:sdt>
+            <w:r>
+              <w:rPr>
+                <w:rFonts w:ascii="Calibri" w:cs="Calibri" w:eastAsia="Calibri" w:hAnsi="Calibri"/>
+                <w:color w:val="453A30"/>
+                <w:sz w:val="21"/>
+                <w:szCs w:val="21"/>
+              </w:rPr>
+              <w:t xml:space="preserve">  </w:t>
+            </w:r>
+            <w:r>
+              <w:rPr>
+                <w:rFonts w:ascii="Calibri" w:cs="Calibri" w:eastAsia="Calibri" w:hAnsi="Calibri"/>
+                <w:color w:val="453A30"/>
+                <w:sz w:val="21"/>
+                <w:szCs w:val="21"/>
+              </w:rPr>
+              <w:t xml:space="preserve">Two sign holders · a name banner for the table front · a copy of the sales tax permit</w:t>
+            </w:r>
+          </w:p>
+          <w:p>
+            <w:pPr>
+              <w:spacing w:after="60"/>
+              <w:ind w:left="300" w:hanging="300"/>
+            </w:pPr>
+            <w:sdt>
+              <w:sdtPr>
+                <w14:checkbox>
+                  <w14:checked w14:val="0"/>
+                  <w14:checkedState w14:val="2612" w14:font="MS Gothic"/>
+                  <w14:uncheckedState w14:val="2610" w14:font="MS Gothic"/>
+                </w14:checkbox>
+              </w:sdtPr>
+              <w:sdtContent>
+                <w:r>
+                  <w:sym w:char="2610" w:font="MS Gothic"/>
+                </w:r>
+              </w:sdtContent>
+            </w:sdt>
+            <w:r>
+              <w:rPr>
+                <w:rFonts w:ascii="Calibri" w:cs="Calibri" w:eastAsia="Calibri" w:hAnsi="Calibri"/>
+                <w:color w:val="453A30"/>
+                <w:sz w:val="21"/>
+                <w:szCs w:val="21"/>
+              </w:rPr>
+              <w:t xml:space="preserve">  </w:t>
+            </w:r>
+            <w:r>
+              <w:rPr>
+                <w:rFonts w:ascii="Calibri" w:cs="Calibri" w:eastAsia="Calibri" w:hAnsi="Calibri"/>
+                <w:color w:val="453A30"/>
+                <w:sz w:val="21"/>
+                <w:szCs w:val="21"/>
+              </w:rPr>
+              <w:t xml:space="preserve">Ask the Sep 26 organiser: table provided? · power? · set-up time · liability insurance? · check the tax rate if it's outside San Antonio (the 7.6% assumes 8.25%)</w:t>
+            </w:r>
+          </w:p>
+          <w:p>
+            <w:pPr>
+              <w:spacing w:after="60"/>
+              <w:ind w:left="300" w:hanging="300"/>
+            </w:pPr>
+            <w:sdt>
+              <w:sdtPr>
+                <w14:checkbox>
+                  <w14:checked w14:val="0"/>
+                  <w14:checkedState w14:val="2612" w14:font="MS Gothic"/>
+                  <w14:uncheckedState w14:val="2610" w14:font="MS Gothic"/>
+                </w14:checkbox>
+              </w:sdtPr>
+              <w:sdtContent>
+                <w:r>
+                  <w:sym w:char="2610" w:font="MS Gothic"/>
+                </w:r>
+              </w:sdtContent>
+            </w:sdt>
+            <w:r>
+              <w:rPr>
+                <w:rFonts w:ascii="Calibri" w:cs="Calibri" w:eastAsia="Calibri" w:hAnsi="Calibri"/>
+                <w:color w:val="453A30"/>
+                <w:sz w:val="21"/>
+                <w:szCs w:val="21"/>
+              </w:rPr>
+              <w:t xml:space="preserve">  </w:t>
+            </w:r>
+            <w:r>
+              <w:rPr>
+                <w:rFonts w:ascii="Calibri" w:cs="Calibri" w:eastAsia="Calibri" w:hAnsi="Calibri"/>
+                <w:color w:val="453A30"/>
+                <w:sz w:val="21"/>
+                <w:szCs w:val="21"/>
+              </w:rPr>
+              <w:t xml:space="preserve">Tap to Pay: $1 test charge + refund · practise a 3-for-$15 scrunchie sale</w:t>
+            </w:r>
+          </w:p>
+          <w:p>
+            <w:pPr>
+              <w:spacing w:after="60"/>
+              <w:ind w:left="300" w:hanging="300"/>
+            </w:pPr>
+            <w:sdt>
+              <w:sdtPr>
+                <w14:checkbox>
+                  <w14:checked w14:val="0"/>
+                  <w14:checkedState w14:val="2612" w14:font="MS Gothic"/>
+                  <w14:uncheckedState w14:val="2610" w14:font="MS Gothic"/>
+                </w14:checkbox>
+              </w:sdtPr>
+              <w:sdtContent>
+                <w:r>
+                  <w:sym w:char="2610" w:font="MS Gothic"/>
+                </w:r>
+              </w:sdtContent>
+            </w:sdt>
+            <w:r>
+              <w:rPr>
+                <w:rFonts w:ascii="Calibri" w:cs="Calibri" w:eastAsia="Calibri" w:hAnsi="Calibri"/>
+                <w:color w:val="453A30"/>
+                <w:sz w:val="21"/>
+                <w:szCs w:val="21"/>
+              </w:rPr>
+              <w:t xml:space="preserve">  </w:t>
+            </w:r>
+            <w:r>
+              <w:rPr>
+                <w:rFonts w:ascii="Calibri" w:cs="Calibri" w:eastAsia="Calibri" w:hAnsi="Calibri"/>
+                <w:color w:val="453A30"/>
+                <w:sz w:val="21"/>
+                <w:szCs w:val="21"/>
+              </w:rPr>
+              <w:t xml:space="preserve">Bow board or ribbon line · scrunchie stand</w:t>
+            </w:r>
+          </w:p>
+          <w:p>
+            <w:pPr>
+              <w:spacing w:after="60"/>
+              <w:ind w:left="300" w:hanging="300"/>
+            </w:pPr>
+            <w:sdt>
+              <w:sdtPr>
+                <w14:checkbox>
+                  <w14:checked w14:val="0"/>
+                  <w14:checkedState w14:val="2612" w14:font="MS Gothic"/>
+                  <w14:uncheckedState w14:val="2610" w14:font="MS Gothic"/>
+                </w14:checkbox>
+              </w:sdtPr>
+              <w:sdtContent>
+                <w:r>
+                  <w:sym w:char="2610" w:font="MS Gothic"/>
+                </w:r>
+              </w:sdtContent>
+            </w:sdt>
+            <w:r>
+              <w:rPr>
+                <w:rFonts w:ascii="Calibri" w:cs="Calibri" w:eastAsia="Calibri" w:hAnsi="Calibri"/>
+                <w:color w:val="453A30"/>
+                <w:sz w:val="21"/>
+                <w:szCs w:val="21"/>
+              </w:rPr>
+              <w:t xml:space="preserve">  </w:t>
+            </w:r>
+            <w:r>
+              <w:rPr>
+                <w:rFonts w:ascii="Calibri" w:cs="Calibri" w:eastAsia="Calibri" w:hAnsi="Calibri"/>
+                <w:color w:val="453A30"/>
+                <w:sz w:val="21"/>
+                <w:szCs w:val="21"/>
+              </w:rPr>
+              <w:t xml:space="preserve">A mirror on the table</w:t>
             </w:r>
             <w:r>
               <w:rPr>
@@ -1513,540 +1887,159 @@
                 <w:sz w:val="18"/>
                 <w:szCs w:val="18"/>
               </w:rPr>
-              <w:t xml:space="preserve">  · 7–9 more, $10 each</w:t>
-            </w:r>
-            <w:r>
-              <w:rPr>
-                <w:rFonts w:ascii="Calibri" w:cs="Calibri" w:eastAsia="Calibri" w:hAnsi="Calibri"/>
-                <w:color w:val="453A30"/>
-                <w:sz w:val="21"/>
-                <w:szCs w:val="21"/>
-              </w:rPr>
-              <w:t xml:space="preserve">   </w:t>
-            </w:r>
-            <w:sdt>
-              <w:sdtPr>
-                <w14:checkbox>
-                  <w14:checked w14:val="0"/>
-                  <w14:checkedState w14:val="2612" w14:font="MS Gothic"/>
-                  <w14:uncheckedState w14:val="2610" w14:font="MS Gothic"/>
-                </w14:checkbox>
-              </w:sdtPr>
-              <w:sdtContent>
-                <w:r>
-                  <w:sym w:char="2610" w:font="MS Gothic"/>
-                </w:r>
-              </w:sdtContent>
-            </w:sdt>
-            <w:r>
-              <w:rPr>
-                <w:rFonts w:ascii="Calibri" w:cs="Calibri" w:eastAsia="Calibri" w:hAnsi="Calibri"/>
-                <w:color w:val="453A30"/>
-                <w:sz w:val="21"/>
-                <w:szCs w:val="21"/>
-              </w:rPr>
-              <w:t xml:space="preserve"> </w:t>
-            </w:r>
-            <w:sdt>
-              <w:sdtPr>
-                <w14:checkbox>
-                  <w14:checked w14:val="0"/>
-                  <w14:checkedState w14:val="2612" w14:font="MS Gothic"/>
-                  <w14:uncheckedState w14:val="2610" w14:font="MS Gothic"/>
-                </w14:checkbox>
-              </w:sdtPr>
-              <w:sdtContent>
-                <w:r>
-                  <w:sym w:char="2610" w:font="MS Gothic"/>
-                </w:r>
-              </w:sdtContent>
-            </w:sdt>
-            <w:r>
-              <w:rPr>
-                <w:rFonts w:ascii="Calibri" w:cs="Calibri" w:eastAsia="Calibri" w:hAnsi="Calibri"/>
-                <w:color w:val="453A30"/>
-                <w:sz w:val="21"/>
-                <w:szCs w:val="21"/>
-              </w:rPr>
-              <w:t xml:space="preserve"> </w:t>
-            </w:r>
-            <w:sdt>
-              <w:sdtPr>
-                <w14:checkbox>
-                  <w14:checked w14:val="0"/>
-                  <w14:checkedState w14:val="2612" w14:font="MS Gothic"/>
-                  <w14:uncheckedState w14:val="2610" w14:font="MS Gothic"/>
-                </w14:checkbox>
-              </w:sdtPr>
-              <w:sdtContent>
-                <w:r>
-                  <w:sym w:char="2610" w:font="MS Gothic"/>
-                </w:r>
-              </w:sdtContent>
-            </w:sdt>
-            <w:r>
-              <w:rPr>
-                <w:rFonts w:ascii="Calibri" w:cs="Calibri" w:eastAsia="Calibri" w:hAnsi="Calibri"/>
-                <w:color w:val="453A30"/>
-                <w:sz w:val="21"/>
-                <w:szCs w:val="21"/>
-              </w:rPr>
-              <w:t xml:space="preserve"> </w:t>
-            </w:r>
-            <w:sdt>
-              <w:sdtPr>
-                <w14:checkbox>
-                  <w14:checked w14:val="0"/>
-                  <w14:checkedState w14:val="2612" w14:font="MS Gothic"/>
-                  <w14:uncheckedState w14:val="2610" w14:font="MS Gothic"/>
-                </w14:checkbox>
-              </w:sdtPr>
-              <w:sdtContent>
-                <w:r>
-                  <w:sym w:char="2610" w:font="MS Gothic"/>
-                </w:r>
-              </w:sdtContent>
-            </w:sdt>
-            <w:r>
-              <w:rPr>
-                <w:rFonts w:ascii="Calibri" w:cs="Calibri" w:eastAsia="Calibri" w:hAnsi="Calibri"/>
-                <w:color w:val="453A30"/>
-                <w:sz w:val="21"/>
-                <w:szCs w:val="21"/>
-              </w:rPr>
-              <w:t xml:space="preserve"> </w:t>
-            </w:r>
-            <w:sdt>
-              <w:sdtPr>
-                <w14:checkbox>
-                  <w14:checked w14:val="0"/>
-                  <w14:checkedState w14:val="2612" w14:font="MS Gothic"/>
-                  <w14:uncheckedState w14:val="2610" w14:font="MS Gothic"/>
-                </w14:checkbox>
-              </w:sdtPr>
-              <w:sdtContent>
-                <w:r>
-                  <w:sym w:char="2610" w:font="MS Gothic"/>
-                </w:r>
-              </w:sdtContent>
-            </w:sdt>
-            <w:r>
-              <w:rPr>
-                <w:rFonts w:ascii="Calibri" w:cs="Calibri" w:eastAsia="Calibri" w:hAnsi="Calibri"/>
-                <w:color w:val="453A30"/>
-                <w:sz w:val="21"/>
-                <w:szCs w:val="21"/>
-              </w:rPr>
-              <w:t xml:space="preserve"> </w:t>
-            </w:r>
-            <w:sdt>
-              <w:sdtPr>
-                <w14:checkbox>
-                  <w14:checked w14:val="0"/>
-                  <w14:checkedState w14:val="2612" w14:font="MS Gothic"/>
-                  <w14:uncheckedState w14:val="2610" w14:font="MS Gothic"/>
-                </w14:checkbox>
-              </w:sdtPr>
-              <w:sdtContent>
-                <w:r>
-                  <w:sym w:char="2610" w:font="MS Gothic"/>
-                </w:r>
-              </w:sdtContent>
-            </w:sdt>
-            <w:r>
-              <w:rPr>
-                <w:rFonts w:ascii="Calibri" w:cs="Calibri" w:eastAsia="Calibri" w:hAnsi="Calibri"/>
-                <w:color w:val="453A30"/>
-                <w:sz w:val="21"/>
-                <w:szCs w:val="21"/>
-              </w:rPr>
-              <w:t xml:space="preserve"> </w:t>
-            </w:r>
-            <w:sdt>
-              <w:sdtPr>
-                <w14:checkbox>
-                  <w14:checked w14:val="0"/>
-                  <w14:checkedState w14:val="2612" w14:font="MS Gothic"/>
-                  <w14:uncheckedState w14:val="2610" w14:font="MS Gothic"/>
-                </w14:checkbox>
-              </w:sdtPr>
-              <w:sdtContent>
-                <w:r>
-                  <w:sym w:char="2610" w:font="MS Gothic"/>
-                </w:r>
-              </w:sdtContent>
-            </w:sdt>
-            <w:r>
-              <w:rPr>
-                <w:rFonts w:ascii="Calibri" w:cs="Calibri" w:eastAsia="Calibri" w:hAnsi="Calibri"/>
-                <w:color w:val="453A30"/>
-                <w:sz w:val="21"/>
-                <w:szCs w:val="21"/>
-              </w:rPr>
-              <w:t xml:space="preserve"> </w:t>
-            </w:r>
-            <w:sdt>
-              <w:sdtPr>
-                <w14:checkbox>
-                  <w14:checked w14:val="0"/>
-                  <w14:checkedState w14:val="2612" w14:font="MS Gothic"/>
-                  <w14:uncheckedState w14:val="2610" w14:font="MS Gothic"/>
-                </w14:checkbox>
-              </w:sdtPr>
-              <w:sdtContent>
-                <w:r>
-                  <w:sym w:char="2610" w:font="MS Gothic"/>
-                </w:r>
-              </w:sdtContent>
-            </w:sdt>
-            <w:r>
-              <w:rPr>
-                <w:rFonts w:ascii="Calibri" w:cs="Calibri" w:eastAsia="Calibri" w:hAnsi="Calibri"/>
-                <w:color w:val="453A30"/>
-                <w:sz w:val="21"/>
-                <w:szCs w:val="21"/>
-              </w:rPr>
-              <w:t xml:space="preserve"> </w:t>
-            </w:r>
-            <w:sdt>
-              <w:sdtPr>
-                <w14:checkbox>
-                  <w14:checked w14:val="0"/>
-                  <w14:checkedState w14:val="2612" w14:font="MS Gothic"/>
-                  <w14:uncheckedState w14:val="2610" w14:font="MS Gothic"/>
-                </w14:checkbox>
-              </w:sdtPr>
-              <w:sdtContent>
-                <w:r>
-                  <w:sym w:char="2610" w:font="MS Gothic"/>
-                </w:r>
-              </w:sdtContent>
-            </w:sdt>
-            <w:r>
-              <w:rPr>
-                <w:rFonts w:ascii="Calibri" w:cs="Calibri" w:eastAsia="Calibri" w:hAnsi="Calibri"/>
-                <w:color w:val="453A30"/>
-                <w:sz w:val="21"/>
-                <w:szCs w:val="21"/>
-              </w:rPr>
-              <w:t xml:space="preserve"/>
+              <w:t xml:space="preserve"> — bows and scrunchies get tried on, and a mirror draws people in</w:t>
             </w:r>
           </w:p>
           <w:p>
             <w:pPr>
               <w:spacing w:after="60"/>
-            </w:pPr>
-            <w:r>
-              <w:rPr>
-                <w:rFonts w:ascii="Calibri" w:cs="Calibri" w:eastAsia="Calibri" w:hAnsi="Calibri"/>
-                <w:color w:val="453A30"/>
-                <w:sz w:val="21"/>
-                <w:szCs w:val="21"/>
-              </w:rPr>
-              <w:t xml:space="preserve">Christmas scrunchies</w:t>
-            </w:r>
-            <w:r>
-              <w:rPr>
-                <w:rFonts w:ascii="Calibri" w:cs="Calibri" w:eastAsia="Calibri" w:hAnsi="Calibri"/>
-                <w:color w:val="6A5B4A"/>
-                <w:sz w:val="18"/>
-                <w:szCs w:val="18"/>
-              </w:rPr>
-              <w:t xml:space="preserve">  · Bowknots in Scarlet</w:t>
-            </w:r>
-            <w:r>
-              <w:rPr>
-                <w:rFonts w:ascii="Calibri" w:cs="Calibri" w:eastAsia="Calibri" w:hAnsi="Calibri"/>
-                <w:color w:val="453A30"/>
-                <w:sz w:val="21"/>
-                <w:szCs w:val="21"/>
-              </w:rPr>
-              <w:t xml:space="preserve">   </w:t>
-            </w:r>
-            <w:sdt>
-              <w:sdtPr>
-                <w14:checkbox>
-                  <w14:checked w14:val="0"/>
-                  <w14:checkedState w14:val="2612" w14:font="MS Gothic"/>
-                  <w14:uncheckedState w14:val="2610" w14:font="MS Gothic"/>
-                </w14:checkbox>
-              </w:sdtPr>
-              <w:sdtContent>
-                <w:r>
-                  <w:sym w:char="2610" w:font="MS Gothic"/>
-                </w:r>
-              </w:sdtContent>
-            </w:sdt>
-            <w:r>
-              <w:rPr>
-                <w:rFonts w:ascii="Calibri" w:cs="Calibri" w:eastAsia="Calibri" w:hAnsi="Calibri"/>
-                <w:color w:val="453A30"/>
-                <w:sz w:val="21"/>
-                <w:szCs w:val="21"/>
-              </w:rPr>
-              <w:t xml:space="preserve"> </w:t>
-            </w:r>
-            <w:sdt>
-              <w:sdtPr>
-                <w14:checkbox>
-                  <w14:checked w14:val="0"/>
-                  <w14:checkedState w14:val="2612" w14:font="MS Gothic"/>
-                  <w14:uncheckedState w14:val="2610" w14:font="MS Gothic"/>
-                </w14:checkbox>
-              </w:sdtPr>
-              <w:sdtContent>
-                <w:r>
-                  <w:sym w:char="2610" w:font="MS Gothic"/>
-                </w:r>
-              </w:sdtContent>
-            </w:sdt>
-            <w:r>
-              <w:rPr>
-                <w:rFonts w:ascii="Calibri" w:cs="Calibri" w:eastAsia="Calibri" w:hAnsi="Calibri"/>
-                <w:color w:val="453A30"/>
-                <w:sz w:val="21"/>
-                <w:szCs w:val="21"/>
-              </w:rPr>
-              <w:t xml:space="preserve"> </w:t>
-            </w:r>
-            <w:sdt>
-              <w:sdtPr>
-                <w14:checkbox>
-                  <w14:checked w14:val="0"/>
-                  <w14:checkedState w14:val="2612" w14:font="MS Gothic"/>
-                  <w14:uncheckedState w14:val="2610" w14:font="MS Gothic"/>
-                </w14:checkbox>
-              </w:sdtPr>
-              <w:sdtContent>
-                <w:r>
-                  <w:sym w:char="2610" w:font="MS Gothic"/>
-                </w:r>
-              </w:sdtContent>
-            </w:sdt>
-            <w:r>
-              <w:rPr>
-                <w:rFonts w:ascii="Calibri" w:cs="Calibri" w:eastAsia="Calibri" w:hAnsi="Calibri"/>
-                <w:color w:val="453A30"/>
-                <w:sz w:val="21"/>
-                <w:szCs w:val="21"/>
-              </w:rPr>
-              <w:t xml:space="preserve"/>
+              <w:ind w:left="300" w:hanging="300"/>
+            </w:pPr>
+            <w:sdt>
+              <w:sdtPr>
+                <w14:checkbox>
+                  <w14:checked w14:val="0"/>
+                  <w14:checkedState w14:val="2612" w14:font="MS Gothic"/>
+                  <w14:uncheckedState w14:val="2610" w14:font="MS Gothic"/>
+                </w14:checkbox>
+              </w:sdtPr>
+              <w:sdtContent>
+                <w:r>
+                  <w:sym w:char="2610" w:font="MS Gothic"/>
+                </w:r>
+              </w:sdtContent>
+            </w:sdt>
+            <w:r>
+              <w:rPr>
+                <w:rFonts w:ascii="Calibri" w:cs="Calibri" w:eastAsia="Calibri" w:hAnsi="Calibri"/>
+                <w:color w:val="453A30"/>
+                <w:sz w:val="21"/>
+                <w:szCs w:val="21"/>
+              </w:rPr>
+              <w:t xml:space="preserve">  </w:t>
+            </w:r>
+            <w:r>
+              <w:rPr>
+                <w:rFonts w:ascii="Calibri" w:cs="Calibri" w:eastAsia="Calibri" w:hAnsi="Calibri"/>
+                <w:color w:val="453A30"/>
+                <w:sz w:val="21"/>
+                <w:szCs w:val="21"/>
+              </w:rPr>
+              <w:t xml:space="preserve">Try-on bow on a clip · a basket of scrunchies to handle · a stuffed dog wearing a bandana</w:t>
             </w:r>
           </w:p>
           <w:p>
             <w:pPr>
               <w:spacing w:after="60"/>
-            </w:pPr>
-            <w:r>
-              <w:rPr>
-                <w:rFonts w:ascii="Calibri" w:cs="Calibri" w:eastAsia="Calibri" w:hAnsi="Calibri"/>
-                <w:color w:val="453A30"/>
-                <w:sz w:val="21"/>
-                <w:szCs w:val="21"/>
-              </w:rPr>
-              <w:t xml:space="preserve">Hair whimsys</w:t>
-            </w:r>
-            <w:r>
-              <w:rPr>
-                <w:rFonts w:ascii="Calibri" w:cs="Calibri" w:eastAsia="Calibri" w:hAnsi="Calibri"/>
-                <w:color w:val="6A5B4A"/>
-                <w:sz w:val="18"/>
-                <w:szCs w:val="18"/>
-              </w:rPr>
-              <w:t xml:space="preserve">  · 3 Night Court Stripe · 3 Hewn City Stripe · 2 Nesta's Cats</w:t>
-            </w:r>
-            <w:r>
-              <w:rPr>
-                <w:rFonts w:ascii="Calibri" w:cs="Calibri" w:eastAsia="Calibri" w:hAnsi="Calibri"/>
-                <w:color w:val="453A30"/>
-                <w:sz w:val="21"/>
-                <w:szCs w:val="21"/>
-              </w:rPr>
-              <w:t xml:space="preserve">   </w:t>
-            </w:r>
-            <w:sdt>
-              <w:sdtPr>
-                <w14:checkbox>
-                  <w14:checked w14:val="0"/>
-                  <w14:checkedState w14:val="2612" w14:font="MS Gothic"/>
-                  <w14:uncheckedState w14:val="2610" w14:font="MS Gothic"/>
-                </w14:checkbox>
-              </w:sdtPr>
-              <w:sdtContent>
-                <w:r>
-                  <w:sym w:char="2610" w:font="MS Gothic"/>
-                </w:r>
-              </w:sdtContent>
-            </w:sdt>
-            <w:r>
-              <w:rPr>
-                <w:rFonts w:ascii="Calibri" w:cs="Calibri" w:eastAsia="Calibri" w:hAnsi="Calibri"/>
-                <w:color w:val="453A30"/>
-                <w:sz w:val="21"/>
-                <w:szCs w:val="21"/>
-              </w:rPr>
-              <w:t xml:space="preserve"> </w:t>
-            </w:r>
-            <w:sdt>
-              <w:sdtPr>
-                <w14:checkbox>
-                  <w14:checked w14:val="0"/>
-                  <w14:checkedState w14:val="2612" w14:font="MS Gothic"/>
-                  <w14:uncheckedState w14:val="2610" w14:font="MS Gothic"/>
-                </w14:checkbox>
-              </w:sdtPr>
-              <w:sdtContent>
-                <w:r>
-                  <w:sym w:char="2610" w:font="MS Gothic"/>
-                </w:r>
-              </w:sdtContent>
-            </w:sdt>
-            <w:r>
-              <w:rPr>
-                <w:rFonts w:ascii="Calibri" w:cs="Calibri" w:eastAsia="Calibri" w:hAnsi="Calibri"/>
-                <w:color w:val="453A30"/>
-                <w:sz w:val="21"/>
-                <w:szCs w:val="21"/>
-              </w:rPr>
-              <w:t xml:space="preserve"> </w:t>
-            </w:r>
-            <w:sdt>
-              <w:sdtPr>
-                <w14:checkbox>
-                  <w14:checked w14:val="0"/>
-                  <w14:checkedState w14:val="2612" w14:font="MS Gothic"/>
-                  <w14:uncheckedState w14:val="2610" w14:font="MS Gothic"/>
-                </w14:checkbox>
-              </w:sdtPr>
-              <w:sdtContent>
-                <w:r>
-                  <w:sym w:char="2610" w:font="MS Gothic"/>
-                </w:r>
-              </w:sdtContent>
-            </w:sdt>
-            <w:r>
-              <w:rPr>
-                <w:rFonts w:ascii="Calibri" w:cs="Calibri" w:eastAsia="Calibri" w:hAnsi="Calibri"/>
-                <w:color w:val="453A30"/>
-                <w:sz w:val="21"/>
-                <w:szCs w:val="21"/>
-              </w:rPr>
-              <w:t xml:space="preserve"> </w:t>
-            </w:r>
-            <w:sdt>
-              <w:sdtPr>
-                <w14:checkbox>
-                  <w14:checked w14:val="0"/>
-                  <w14:checkedState w14:val="2612" w14:font="MS Gothic"/>
-                  <w14:uncheckedState w14:val="2610" w14:font="MS Gothic"/>
-                </w14:checkbox>
-              </w:sdtPr>
-              <w:sdtContent>
-                <w:r>
-                  <w:sym w:char="2610" w:font="MS Gothic"/>
-                </w:r>
-              </w:sdtContent>
-            </w:sdt>
-            <w:r>
-              <w:rPr>
-                <w:rFonts w:ascii="Calibri" w:cs="Calibri" w:eastAsia="Calibri" w:hAnsi="Calibri"/>
-                <w:color w:val="453A30"/>
-                <w:sz w:val="21"/>
-                <w:szCs w:val="21"/>
-              </w:rPr>
-              <w:t xml:space="preserve"> </w:t>
-            </w:r>
-            <w:sdt>
-              <w:sdtPr>
-                <w14:checkbox>
-                  <w14:checked w14:val="0"/>
-                  <w14:checkedState w14:val="2612" w14:font="MS Gothic"/>
-                  <w14:uncheckedState w14:val="2610" w14:font="MS Gothic"/>
-                </w14:checkbox>
-              </w:sdtPr>
-              <w:sdtContent>
-                <w:r>
-                  <w:sym w:char="2610" w:font="MS Gothic"/>
-                </w:r>
-              </w:sdtContent>
-            </w:sdt>
-            <w:r>
-              <w:rPr>
-                <w:rFonts w:ascii="Calibri" w:cs="Calibri" w:eastAsia="Calibri" w:hAnsi="Calibri"/>
-                <w:color w:val="453A30"/>
-                <w:sz w:val="21"/>
-                <w:szCs w:val="21"/>
-              </w:rPr>
-              <w:t xml:space="preserve"> </w:t>
-            </w:r>
-            <w:sdt>
-              <w:sdtPr>
-                <w14:checkbox>
-                  <w14:checked w14:val="0"/>
-                  <w14:checkedState w14:val="2612" w14:font="MS Gothic"/>
-                  <w14:uncheckedState w14:val="2610" w14:font="MS Gothic"/>
-                </w14:checkbox>
-              </w:sdtPr>
-              <w:sdtContent>
-                <w:r>
-                  <w:sym w:char="2610" w:font="MS Gothic"/>
-                </w:r>
-              </w:sdtContent>
-            </w:sdt>
-            <w:r>
-              <w:rPr>
-                <w:rFonts w:ascii="Calibri" w:cs="Calibri" w:eastAsia="Calibri" w:hAnsi="Calibri"/>
-                <w:color w:val="453A30"/>
-                <w:sz w:val="21"/>
-                <w:szCs w:val="21"/>
-              </w:rPr>
-              <w:t xml:space="preserve"> </w:t>
-            </w:r>
-            <w:sdt>
-              <w:sdtPr>
-                <w14:checkbox>
-                  <w14:checked w14:val="0"/>
-                  <w14:checkedState w14:val="2612" w14:font="MS Gothic"/>
-                  <w14:uncheckedState w14:val="2610" w14:font="MS Gothic"/>
-                </w14:checkbox>
-              </w:sdtPr>
-              <w:sdtContent>
-                <w:r>
-                  <w:sym w:char="2610" w:font="MS Gothic"/>
-                </w:r>
-              </w:sdtContent>
-            </w:sdt>
-            <w:r>
-              <w:rPr>
-                <w:rFonts w:ascii="Calibri" w:cs="Calibri" w:eastAsia="Calibri" w:hAnsi="Calibri"/>
-                <w:color w:val="453A30"/>
-                <w:sz w:val="21"/>
-                <w:szCs w:val="21"/>
-              </w:rPr>
-              <w:t xml:space="preserve"> </w:t>
-            </w:r>
-            <w:sdt>
-              <w:sdtPr>
-                <w14:checkbox>
-                  <w14:checked w14:val="0"/>
-                  <w14:checkedState w14:val="2612" w14:font="MS Gothic"/>
-                  <w14:uncheckedState w14:val="2610" w14:font="MS Gothic"/>
-                </w14:checkbox>
-              </w:sdtPr>
-              <w:sdtContent>
-                <w:r>
-                  <w:sym w:char="2610" w:font="MS Gothic"/>
-                </w:r>
-              </w:sdtContent>
-            </w:sdt>
-            <w:r>
-              <w:rPr>
-                <w:rFonts w:ascii="Calibri" w:cs="Calibri" w:eastAsia="Calibri" w:hAnsi="Calibri"/>
-                <w:color w:val="453A30"/>
-                <w:sz w:val="21"/>
-                <w:szCs w:val="21"/>
-              </w:rPr>
-              <w:t xml:space="preserve"/>
+              <w:ind w:left="300" w:hanging="300"/>
+            </w:pPr>
+            <w:sdt>
+              <w:sdtPr>
+                <w14:checkbox>
+                  <w14:checked w14:val="0"/>
+                  <w14:checkedState w14:val="2612" w14:font="MS Gothic"/>
+                  <w14:uncheckedState w14:val="2610" w14:font="MS Gothic"/>
+                </w14:checkbox>
+              </w:sdtPr>
+              <w:sdtContent>
+                <w:r>
+                  <w:sym w:char="2610" w:font="MS Gothic"/>
+                </w:r>
+              </w:sdtContent>
+            </w:sdt>
+            <w:r>
+              <w:rPr>
+                <w:rFonts w:ascii="Calibri" w:cs="Calibri" w:eastAsia="Calibri" w:hAnsi="Calibri"/>
+                <w:color w:val="453A30"/>
+                <w:sz w:val="21"/>
+                <w:szCs w:val="21"/>
+              </w:rPr>
+              <w:t xml:space="preserve">  </w:t>
+            </w:r>
+            <w:r>
+              <w:rPr>
+                <w:rFonts w:ascii="Calibri" w:cs="Calibri" w:eastAsia="Calibri" w:hAnsi="Calibri"/>
+                <w:color w:val="453A30"/>
+                <w:sz w:val="21"/>
+                <w:szCs w:val="21"/>
+              </w:rPr>
+              <w:t xml:space="preserve">Inventory list — every piece going to the table</w:t>
+            </w:r>
+          </w:p>
+          <w:p>
+            <w:pPr>
+              <w:spacing w:after="60"/>
+              <w:ind w:left="300" w:hanging="300"/>
+            </w:pPr>
+            <w:sdt>
+              <w:sdtPr>
+                <w14:checkbox>
+                  <w14:checked w14:val="0"/>
+                  <w14:checkedState w14:val="2612" w14:font="MS Gothic"/>
+                  <w14:uncheckedState w14:val="2610" w14:font="MS Gothic"/>
+                </w14:checkbox>
+              </w:sdtPr>
+              <w:sdtContent>
+                <w:r>
+                  <w:sym w:char="2610" w:font="MS Gothic"/>
+                </w:r>
+              </w:sdtContent>
+            </w:sdt>
+            <w:r>
+              <w:rPr>
+                <w:rFonts w:ascii="Calibri" w:cs="Calibri" w:eastAsia="Calibri" w:hAnsi="Calibri"/>
+                <w:color w:val="453A30"/>
+                <w:sz w:val="21"/>
+                <w:szCs w:val="21"/>
+              </w:rPr>
+              <w:t xml:space="preserve">  </w:t>
+            </w:r>
+            <w:r>
+              <w:rPr>
+                <w:rFonts w:ascii="Calibri" w:cs="Calibri" w:eastAsia="Calibri" w:hAnsi="Calibri"/>
+                <w:color w:val="453A30"/>
+                <w:sz w:val="21"/>
+                <w:szCs w:val="21"/>
+              </w:rPr>
+              <w:t xml:space="preserve">Set the table up once at home and photograph it</w:t>
+            </w:r>
+          </w:p>
+          <w:p>
+            <w:pPr>
+              <w:spacing w:after="60"/>
+              <w:ind w:left="300" w:hanging="300"/>
+            </w:pPr>
+            <w:sdt>
+              <w:sdtPr>
+                <w14:checkbox>
+                  <w14:checked w14:val="0"/>
+                  <w14:checkedState w14:val="2612" w14:font="MS Gothic"/>
+                  <w14:uncheckedState w14:val="2610" w14:font="MS Gothic"/>
+                </w14:checkbox>
+              </w:sdtPr>
+              <w:sdtContent>
+                <w:r>
+                  <w:sym w:char="2610" w:font="MS Gothic"/>
+                </w:r>
+              </w:sdtContent>
+            </w:sdt>
+            <w:r>
+              <w:rPr>
+                <w:rFonts w:ascii="Calibri" w:cs="Calibri" w:eastAsia="Calibri" w:hAnsi="Calibri"/>
+                <w:color w:val="453A30"/>
+                <w:sz w:val="21"/>
+                <w:szCs w:val="21"/>
+              </w:rPr>
+              <w:t xml:space="preserve">  </w:t>
+            </w:r>
+            <w:r>
+              <w:rPr>
+                <w:rFonts w:ascii="Calibri" w:cs="Calibri" w:eastAsia="Calibri" w:hAnsi="Calibri"/>
+                <w:color w:val="453A30"/>
+                <w:sz w:val="21"/>
+                <w:szCs w:val="21"/>
+              </w:rPr>
+              <w:t xml:space="preserve">Posts for Sep 26: announcement · Sep 19–20, use the table photo · two local groups, different words · Sep 21 and 23</w:t>
             </w:r>
           </w:p>
         </w:tc>
@@ -2080,7 +2073,7 @@
                 <w:sz w:val="24"/>
                 <w:szCs w:val="24"/>
               </w:rPr>
-              <w:t xml:space="preserve">Oct 3 – 8</w:t>
+              <w:t xml:space="preserve">Fri Sep 25</w:t>
             </w:r>
           </w:p>
           <w:p>
@@ -2091,24 +2084,7 @@
                 <w:sz w:val="18"/>
                 <w:szCs w:val="18"/>
               </w:rPr>
-              <w:t xml:space="preserve">Sat – Thu</w:t>
-            </w:r>
-          </w:p>
-          <w:p>
-            <w:pPr>
-              <w:spacing w:before="60"/>
-            </w:pPr>
-            <w:r>
-              <w:rPr>
-                <w:rFonts w:ascii="Calibri" w:cs="Calibri" w:eastAsia="Calibri" w:hAnsi="Calibri"/>
-                <w:b/>
-                <w:bCs/>
-                <w:color w:val="2F6B72"/>
-                <w:sz w:val="16"/>
-                <w:szCs w:val="16"/>
-                <w:shd w:fill="DCEBEB" w:color="auto" w:val="clear"/>
-              </w:rPr>
-              <w:t xml:space="preserve"> ~6 HOURS </w:t>
+              <w:t xml:space="preserve">the night before</w:t>
             </w:r>
           </w:p>
         </w:tc>
@@ -2128,197 +2104,60 @@
           </w:tcPr>
           <w:p>
             <w:pPr>
-              <w:spacing w:after="80"/>
-            </w:pPr>
-            <w:r>
-              <w:rPr>
-                <w:rFonts w:ascii="Georgia" w:cs="Georgia" w:eastAsia="Georgia" w:hAnsi="Georgia"/>
+              <w:spacing w:after="60"/>
+              <w:ind w:left="300" w:hanging="300"/>
+            </w:pPr>
+            <w:sdt>
+              <w:sdtPr>
+                <w14:checkbox>
+                  <w14:checked w14:val="0"/>
+                  <w14:checkedState w14:val="2612" w14:font="MS Gothic"/>
+                  <w14:uncheckedState w14:val="2610" w14:font="MS Gothic"/>
+                </w14:checkbox>
+              </w:sdtPr>
+              <w:sdtContent>
+                <w:r>
+                  <w:sym w:char="2610" w:font="MS Gothic"/>
+                </w:r>
+              </w:sdtContent>
+            </w:sdt>
+            <w:r>
+              <w:rPr>
+                <w:rFonts w:ascii="Calibri" w:cs="Calibri" w:eastAsia="Calibri" w:hAnsi="Calibri"/>
+                <w:color w:val="453A30"/>
+                <w:sz w:val="21"/>
+                <w:szCs w:val="21"/>
+              </w:rPr>
+              <w:t xml:space="preserve">  </w:t>
+            </w:r>
+            <w:r>
+              <w:rPr>
+                <w:rFonts w:ascii="Calibri" w:cs="Calibri" w:eastAsia="Calibri" w:hAnsi="Calibri"/>
+                <w:color w:val="453A30"/>
+                <w:sz w:val="21"/>
+                <w:szCs w:val="21"/>
+              </w:rPr>
+              <w:t xml:space="preserve">Pack from the list on page 2 — indoor, so no canopy, weights, rain sheet or sunscreen · </w:t>
+            </w:r>
+            <w:r>
+              <w:rPr>
+                <w:rFonts w:ascii="Calibri" w:cs="Calibri" w:eastAsia="Calibri" w:hAnsi="Calibri"/>
                 <w:b/>
                 <w:bCs/>
                 <w:color w:val="453A30"/>
-                <w:sz w:val="22"/>
-                <w:szCs w:val="22"/>
-              </w:rPr>
-              <w:t xml:space="preserve">Bandanas, then the booth itself</w:t>
-            </w:r>
-          </w:p>
-          <w:p>
-            <w:pPr>
-              <w:spacing w:after="60"/>
-            </w:pPr>
-            <w:r>
-              <w:rPr>
-                <w:rFonts w:ascii="Calibri" w:cs="Calibri" w:eastAsia="Calibri" w:hAnsi="Calibri"/>
-                <w:color w:val="453A30"/>
-                <w:sz w:val="21"/>
-                <w:szCs w:val="21"/>
-              </w:rPr>
-              <w:t xml:space="preserve">Dog bandanas — Medium</w:t>
-            </w:r>
-            <w:r>
-              <w:rPr>
-                <w:rFonts w:ascii="Calibri" w:cs="Calibri" w:eastAsia="Calibri" w:hAnsi="Calibri"/>
-                <w:color w:val="6A5B4A"/>
-                <w:sz w:val="18"/>
-                <w:szCs w:val="18"/>
-              </w:rPr>
-              <w:t xml:space="preserve">  · Scarlet/Cream · Bone Carver's Candy/Elain's Gingham · Autumn Court Gourds/Lucien's Patch</w:t>
-            </w:r>
-            <w:r>
-              <w:rPr>
-                <w:rFonts w:ascii="Calibri" w:cs="Calibri" w:eastAsia="Calibri" w:hAnsi="Calibri"/>
-                <w:color w:val="453A30"/>
-                <w:sz w:val="21"/>
-                <w:szCs w:val="21"/>
-              </w:rPr>
-              <w:t xml:space="preserve">   </w:t>
-            </w:r>
-            <w:sdt>
-              <w:sdtPr>
-                <w14:checkbox>
-                  <w14:checked w14:val="0"/>
-                  <w14:checkedState w14:val="2612" w14:font="MS Gothic"/>
-                  <w14:uncheckedState w14:val="2610" w14:font="MS Gothic"/>
-                </w14:checkbox>
-              </w:sdtPr>
-              <w:sdtContent>
-                <w:r>
-                  <w:sym w:char="2610" w:font="MS Gothic"/>
-                </w:r>
-              </w:sdtContent>
-            </w:sdt>
-            <w:r>
-              <w:rPr>
-                <w:rFonts w:ascii="Calibri" w:cs="Calibri" w:eastAsia="Calibri" w:hAnsi="Calibri"/>
-                <w:color w:val="453A30"/>
-                <w:sz w:val="21"/>
-                <w:szCs w:val="21"/>
-              </w:rPr>
-              <w:t xml:space="preserve"> </w:t>
-            </w:r>
-            <w:sdt>
-              <w:sdtPr>
-                <w14:checkbox>
-                  <w14:checked w14:val="0"/>
-                  <w14:checkedState w14:val="2612" w14:font="MS Gothic"/>
-                  <w14:uncheckedState w14:val="2610" w14:font="MS Gothic"/>
-                </w14:checkbox>
-              </w:sdtPr>
-              <w:sdtContent>
-                <w:r>
-                  <w:sym w:char="2610" w:font="MS Gothic"/>
-                </w:r>
-              </w:sdtContent>
-            </w:sdt>
-            <w:r>
-              <w:rPr>
-                <w:rFonts w:ascii="Calibri" w:cs="Calibri" w:eastAsia="Calibri" w:hAnsi="Calibri"/>
-                <w:color w:val="453A30"/>
-                <w:sz w:val="21"/>
-                <w:szCs w:val="21"/>
-              </w:rPr>
-              <w:t xml:space="preserve"> </w:t>
-            </w:r>
-            <w:sdt>
-              <w:sdtPr>
-                <w14:checkbox>
-                  <w14:checked w14:val="0"/>
-                  <w14:checkedState w14:val="2612" w14:font="MS Gothic"/>
-                  <w14:uncheckedState w14:val="2610" w14:font="MS Gothic"/>
-                </w14:checkbox>
-              </w:sdtPr>
-              <w:sdtContent>
-                <w:r>
-                  <w:sym w:char="2610" w:font="MS Gothic"/>
-                </w:r>
-              </w:sdtContent>
-            </w:sdt>
-            <w:r>
-              <w:rPr>
-                <w:rFonts w:ascii="Calibri" w:cs="Calibri" w:eastAsia="Calibri" w:hAnsi="Calibri"/>
-                <w:color w:val="453A30"/>
-                <w:sz w:val="21"/>
-                <w:szCs w:val="21"/>
-              </w:rPr>
-              <w:t xml:space="preserve"/>
-            </w:r>
-          </w:p>
-          <w:p>
-            <w:pPr>
-              <w:spacing w:after="60"/>
-            </w:pPr>
-            <w:r>
-              <w:rPr>
-                <w:rFonts w:ascii="Calibri" w:cs="Calibri" w:eastAsia="Calibri" w:hAnsi="Calibri"/>
-                <w:color w:val="453A30"/>
-                <w:sz w:val="21"/>
-                <w:szCs w:val="21"/>
-              </w:rPr>
-              <w:t xml:space="preserve">Dog bandanas — Large</w:t>
-            </w:r>
-            <w:r>
-              <w:rPr>
-                <w:rFonts w:ascii="Calibri" w:cs="Calibri" w:eastAsia="Calibri" w:hAnsi="Calibri"/>
-                <w:color w:val="6A5B4A"/>
-                <w:sz w:val="18"/>
-                <w:szCs w:val="18"/>
-              </w:rPr>
-              <w:t xml:space="preserve">  · Scarlet/Cream · Pumpkin Patch/Amber</w:t>
-            </w:r>
-            <w:r>
-              <w:rPr>
-                <w:rFonts w:ascii="Calibri" w:cs="Calibri" w:eastAsia="Calibri" w:hAnsi="Calibri"/>
-                <w:color w:val="453A30"/>
-                <w:sz w:val="21"/>
-                <w:szCs w:val="21"/>
-              </w:rPr>
-              <w:t xml:space="preserve">   </w:t>
-            </w:r>
-            <w:sdt>
-              <w:sdtPr>
-                <w14:checkbox>
-                  <w14:checked w14:val="0"/>
-                  <w14:checkedState w14:val="2612" w14:font="MS Gothic"/>
-                  <w14:uncheckedState w14:val="2610" w14:font="MS Gothic"/>
-                </w14:checkbox>
-              </w:sdtPr>
-              <w:sdtContent>
-                <w:r>
-                  <w:sym w:char="2610" w:font="MS Gothic"/>
-                </w:r>
-              </w:sdtContent>
-            </w:sdt>
-            <w:r>
-              <w:rPr>
-                <w:rFonts w:ascii="Calibri" w:cs="Calibri" w:eastAsia="Calibri" w:hAnsi="Calibri"/>
-                <w:color w:val="453A30"/>
-                <w:sz w:val="21"/>
-                <w:szCs w:val="21"/>
-              </w:rPr>
-              <w:t xml:space="preserve"> </w:t>
-            </w:r>
-            <w:sdt>
-              <w:sdtPr>
-                <w14:checkbox>
-                  <w14:checked w14:val="0"/>
-                  <w14:checkedState w14:val="2612" w14:font="MS Gothic"/>
-                  <w14:uncheckedState w14:val="2610" w14:font="MS Gothic"/>
-                </w14:checkbox>
-              </w:sdtPr>
-              <w:sdtContent>
-                <w:r>
-                  <w:sym w:char="2610" w:font="MS Gothic"/>
-                </w:r>
-              </w:sdtContent>
-            </w:sdt>
-            <w:r>
-              <w:rPr>
-                <w:rFonts w:ascii="Calibri" w:cs="Calibri" w:eastAsia="Calibri" w:hAnsi="Calibri"/>
-                <w:color w:val="453A30"/>
-                <w:sz w:val="21"/>
-                <w:szCs w:val="21"/>
-              </w:rPr>
-              <w:t xml:space="preserve"/>
+                <w:sz w:val="21"/>
+                <w:szCs w:val="21"/>
+              </w:rPr>
+              <w:t xml:space="preserve">$75–100 in small bills</w:t>
+            </w:r>
+            <w:r>
+              <w:rPr>
+                <w:rFonts w:ascii="Calibri" w:cs="Calibri" w:eastAsia="Calibri" w:hAnsi="Calibri"/>
+                <w:color w:val="453A30"/>
+                <w:sz w:val="21"/>
+                <w:szCs w:val="21"/>
+              </w:rPr>
+              <w:t xml:space="preserve"> · charge the phone</w:t>
             </w:r>
           </w:p>
           <w:p>
@@ -2356,481 +2195,7 @@
                 <w:sz w:val="21"/>
                 <w:szCs w:val="21"/>
               </w:rPr>
-              <w:t xml:space="preserve">Print the price sign + QR sign — scan each QR with your phone · print + cut the price tags (totes, sleeve, tea cover, Suriel set, headband, gift card holders)</w:t>
-            </w:r>
-          </w:p>
-          <w:p>
-            <w:pPr>
-              <w:spacing w:after="60"/>
-              <w:ind w:left="300" w:hanging="300"/>
-            </w:pPr>
-            <w:sdt>
-              <w:sdtPr>
-                <w14:checkbox>
-                  <w14:checked w14:val="0"/>
-                  <w14:checkedState w14:val="2612" w14:font="MS Gothic"/>
-                  <w14:uncheckedState w14:val="2610" w14:font="MS Gothic"/>
-                </w14:checkbox>
-              </w:sdtPr>
-              <w:sdtContent>
-                <w:r>
-                  <w:sym w:char="2610" w:font="MS Gothic"/>
-                </w:r>
-              </w:sdtContent>
-            </w:sdt>
-            <w:r>
-              <w:rPr>
-                <w:rFonts w:ascii="Calibri" w:cs="Calibri" w:eastAsia="Calibri" w:hAnsi="Calibri"/>
-                <w:color w:val="453A30"/>
-                <w:sz w:val="21"/>
-                <w:szCs w:val="21"/>
-              </w:rPr>
-              <w:t xml:space="preserve">  </w:t>
-            </w:r>
-            <w:r>
-              <w:rPr>
-                <w:rFonts w:ascii="Calibri" w:cs="Calibri" w:eastAsia="Calibri" w:hAnsi="Calibri"/>
-                <w:color w:val="453A30"/>
-                <w:sz w:val="21"/>
-                <w:szCs w:val="21"/>
-              </w:rPr>
-              <w:t xml:space="preserve">Two sign holders · a name banner for the table front · a copy of the sales tax permit</w:t>
-            </w:r>
-          </w:p>
-          <w:p>
-            <w:pPr>
-              <w:spacing w:after="60"/>
-              <w:ind w:left="300" w:hanging="300"/>
-            </w:pPr>
-            <w:sdt>
-              <w:sdtPr>
-                <w14:checkbox>
-                  <w14:checked w14:val="0"/>
-                  <w14:checkedState w14:val="2612" w14:font="MS Gothic"/>
-                  <w14:uncheckedState w14:val="2610" w14:font="MS Gothic"/>
-                </w14:checkbox>
-              </w:sdtPr>
-              <w:sdtContent>
-                <w:r>
-                  <w:sym w:char="2610" w:font="MS Gothic"/>
-                </w:r>
-              </w:sdtContent>
-            </w:sdt>
-            <w:r>
-              <w:rPr>
-                <w:rFonts w:ascii="Calibri" w:cs="Calibri" w:eastAsia="Calibri" w:hAnsi="Calibri"/>
-                <w:color w:val="453A30"/>
-                <w:sz w:val="21"/>
-                <w:szCs w:val="21"/>
-              </w:rPr>
-              <w:t xml:space="preserve">  </w:t>
-            </w:r>
-            <w:r>
-              <w:rPr>
-                <w:rFonts w:ascii="Calibri" w:cs="Calibri" w:eastAsia="Calibri" w:hAnsi="Calibri"/>
-                <w:color w:val="453A30"/>
-                <w:sz w:val="21"/>
-                <w:szCs w:val="21"/>
-              </w:rPr>
-              <w:t xml:space="preserve">Ask the market: liability insurance? · check the tax rate if it's outside San Antonio (the 7.6% assumes 8.25%)</w:t>
-            </w:r>
-          </w:p>
-          <w:p>
-            <w:pPr>
-              <w:spacing w:after="60"/>
-              <w:ind w:left="300" w:hanging="300"/>
-            </w:pPr>
-            <w:sdt>
-              <w:sdtPr>
-                <w14:checkbox>
-                  <w14:checked w14:val="0"/>
-                  <w14:checkedState w14:val="2612" w14:font="MS Gothic"/>
-                  <w14:uncheckedState w14:val="2610" w14:font="MS Gothic"/>
-                </w14:checkbox>
-              </w:sdtPr>
-              <w:sdtContent>
-                <w:r>
-                  <w:sym w:char="2610" w:font="MS Gothic"/>
-                </w:r>
-              </w:sdtContent>
-            </w:sdt>
-            <w:r>
-              <w:rPr>
-                <w:rFonts w:ascii="Calibri" w:cs="Calibri" w:eastAsia="Calibri" w:hAnsi="Calibri"/>
-                <w:color w:val="453A30"/>
-                <w:sz w:val="21"/>
-                <w:szCs w:val="21"/>
-              </w:rPr>
-              <w:t xml:space="preserve">  </w:t>
-            </w:r>
-            <w:r>
-              <w:rPr>
-                <w:rFonts w:ascii="Calibri" w:cs="Calibri" w:eastAsia="Calibri" w:hAnsi="Calibri"/>
-                <w:color w:val="453A30"/>
-                <w:sz w:val="21"/>
-                <w:szCs w:val="21"/>
-              </w:rPr>
-              <w:t xml:space="preserve">Tap to Pay: $1 test charge + refund · practise a 3-for-$15 scrunchie sale</w:t>
-            </w:r>
-          </w:p>
-          <w:p>
-            <w:pPr>
-              <w:spacing w:after="60"/>
-              <w:ind w:left="300" w:hanging="300"/>
-            </w:pPr>
-            <w:sdt>
-              <w:sdtPr>
-                <w14:checkbox>
-                  <w14:checked w14:val="0"/>
-                  <w14:checkedState w14:val="2612" w14:font="MS Gothic"/>
-                  <w14:uncheckedState w14:val="2610" w14:font="MS Gothic"/>
-                </w14:checkbox>
-              </w:sdtPr>
-              <w:sdtContent>
-                <w:r>
-                  <w:sym w:char="2610" w:font="MS Gothic"/>
-                </w:r>
-              </w:sdtContent>
-            </w:sdt>
-            <w:r>
-              <w:rPr>
-                <w:rFonts w:ascii="Calibri" w:cs="Calibri" w:eastAsia="Calibri" w:hAnsi="Calibri"/>
-                <w:color w:val="453A30"/>
-                <w:sz w:val="21"/>
-                <w:szCs w:val="21"/>
-              </w:rPr>
-              <w:t xml:space="preserve">  </w:t>
-            </w:r>
-            <w:r>
-              <w:rPr>
-                <w:rFonts w:ascii="Calibri" w:cs="Calibri" w:eastAsia="Calibri" w:hAnsi="Calibri"/>
-                <w:color w:val="453A30"/>
-                <w:sz w:val="21"/>
-                <w:szCs w:val="21"/>
-              </w:rPr>
-              <w:t xml:space="preserve">Bow board or ribbon line · scrunchie stand</w:t>
-            </w:r>
-          </w:p>
-          <w:p>
-            <w:pPr>
-              <w:spacing w:after="60"/>
-              <w:ind w:left="300" w:hanging="300"/>
-            </w:pPr>
-            <w:sdt>
-              <w:sdtPr>
-                <w14:checkbox>
-                  <w14:checked w14:val="0"/>
-                  <w14:checkedState w14:val="2612" w14:font="MS Gothic"/>
-                  <w14:uncheckedState w14:val="2610" w14:font="MS Gothic"/>
-                </w14:checkbox>
-              </w:sdtPr>
-              <w:sdtContent>
-                <w:r>
-                  <w:sym w:char="2610" w:font="MS Gothic"/>
-                </w:r>
-              </w:sdtContent>
-            </w:sdt>
-            <w:r>
-              <w:rPr>
-                <w:rFonts w:ascii="Calibri" w:cs="Calibri" w:eastAsia="Calibri" w:hAnsi="Calibri"/>
-                <w:color w:val="453A30"/>
-                <w:sz w:val="21"/>
-                <w:szCs w:val="21"/>
-              </w:rPr>
-              <w:t xml:space="preserve">  </w:t>
-            </w:r>
-            <w:r>
-              <w:rPr>
-                <w:rFonts w:ascii="Calibri" w:cs="Calibri" w:eastAsia="Calibri" w:hAnsi="Calibri"/>
-                <w:color w:val="453A30"/>
-                <w:sz w:val="21"/>
-                <w:szCs w:val="21"/>
-              </w:rPr>
-              <w:t xml:space="preserve">A mirror on the table</w:t>
-            </w:r>
-            <w:r>
-              <w:rPr>
-                <w:rFonts w:ascii="Calibri" w:cs="Calibri" w:eastAsia="Calibri" w:hAnsi="Calibri"/>
-                <w:color w:val="6A5B4A"/>
-                <w:sz w:val="18"/>
-                <w:szCs w:val="18"/>
-              </w:rPr>
-              <w:t xml:space="preserve"> — bows and scrunchies get tried on, and a mirror draws people in</w:t>
-            </w:r>
-          </w:p>
-          <w:p>
-            <w:pPr>
-              <w:spacing w:after="60"/>
-              <w:ind w:left="300" w:hanging="300"/>
-            </w:pPr>
-            <w:sdt>
-              <w:sdtPr>
-                <w14:checkbox>
-                  <w14:checked w14:val="0"/>
-                  <w14:checkedState w14:val="2612" w14:font="MS Gothic"/>
-                  <w14:uncheckedState w14:val="2610" w14:font="MS Gothic"/>
-                </w14:checkbox>
-              </w:sdtPr>
-              <w:sdtContent>
-                <w:r>
-                  <w:sym w:char="2610" w:font="MS Gothic"/>
-                </w:r>
-              </w:sdtContent>
-            </w:sdt>
-            <w:r>
-              <w:rPr>
-                <w:rFonts w:ascii="Calibri" w:cs="Calibri" w:eastAsia="Calibri" w:hAnsi="Calibri"/>
-                <w:color w:val="453A30"/>
-                <w:sz w:val="21"/>
-                <w:szCs w:val="21"/>
-              </w:rPr>
-              <w:t xml:space="preserve">  </w:t>
-            </w:r>
-            <w:r>
-              <w:rPr>
-                <w:rFonts w:ascii="Calibri" w:cs="Calibri" w:eastAsia="Calibri" w:hAnsi="Calibri"/>
-                <w:color w:val="453A30"/>
-                <w:sz w:val="21"/>
-                <w:szCs w:val="21"/>
-              </w:rPr>
-              <w:t xml:space="preserve">Try-on bow on a clip · a basket of scrunchies to handle · a stuffed dog wearing a bandana</w:t>
-            </w:r>
-          </w:p>
-          <w:p>
-            <w:pPr>
-              <w:spacing w:after="60"/>
-              <w:ind w:left="300" w:hanging="300"/>
-            </w:pPr>
-            <w:sdt>
-              <w:sdtPr>
-                <w14:checkbox>
-                  <w14:checked w14:val="0"/>
-                  <w14:checkedState w14:val="2612" w14:font="MS Gothic"/>
-                  <w14:uncheckedState w14:val="2610" w14:font="MS Gothic"/>
-                </w14:checkbox>
-              </w:sdtPr>
-              <w:sdtContent>
-                <w:r>
-                  <w:sym w:char="2610" w:font="MS Gothic"/>
-                </w:r>
-              </w:sdtContent>
-            </w:sdt>
-            <w:r>
-              <w:rPr>
-                <w:rFonts w:ascii="Calibri" w:cs="Calibri" w:eastAsia="Calibri" w:hAnsi="Calibri"/>
-                <w:color w:val="453A30"/>
-                <w:sz w:val="21"/>
-                <w:szCs w:val="21"/>
-              </w:rPr>
-              <w:t xml:space="preserve">  </w:t>
-            </w:r>
-            <w:r>
-              <w:rPr>
-                <w:rFonts w:ascii="Calibri" w:cs="Calibri" w:eastAsia="Calibri" w:hAnsi="Calibri"/>
-                <w:color w:val="453A30"/>
-                <w:sz w:val="21"/>
-                <w:szCs w:val="21"/>
-              </w:rPr>
-              <w:t xml:space="preserve">Inventory list — every piece going to the table</w:t>
-            </w:r>
-          </w:p>
-          <w:p>
-            <w:pPr>
-              <w:spacing w:after="60"/>
-              <w:ind w:left="300" w:hanging="300"/>
-            </w:pPr>
-            <w:sdt>
-              <w:sdtPr>
-                <w14:checkbox>
-                  <w14:checked w14:val="0"/>
-                  <w14:checkedState w14:val="2612" w14:font="MS Gothic"/>
-                  <w14:uncheckedState w14:val="2610" w14:font="MS Gothic"/>
-                </w14:checkbox>
-              </w:sdtPr>
-              <w:sdtContent>
-                <w:r>
-                  <w:sym w:char="2610" w:font="MS Gothic"/>
-                </w:r>
-              </w:sdtContent>
-            </w:sdt>
-            <w:r>
-              <w:rPr>
-                <w:rFonts w:ascii="Calibri" w:cs="Calibri" w:eastAsia="Calibri" w:hAnsi="Calibri"/>
-                <w:color w:val="453A30"/>
-                <w:sz w:val="21"/>
-                <w:szCs w:val="21"/>
-              </w:rPr>
-              <w:t xml:space="preserve">  </w:t>
-            </w:r>
-            <w:r>
-              <w:rPr>
-                <w:rFonts w:ascii="Calibri" w:cs="Calibri" w:eastAsia="Calibri" w:hAnsi="Calibri"/>
-                <w:color w:val="453A30"/>
-                <w:sz w:val="21"/>
-                <w:szCs w:val="21"/>
-              </w:rPr>
-              <w:t xml:space="preserve">Set the table up once at home and photograph it</w:t>
-            </w:r>
-          </w:p>
-          <w:p>
-            <w:pPr>
-              <w:spacing w:after="60"/>
-              <w:ind w:left="300" w:hanging="300"/>
-            </w:pPr>
-            <w:sdt>
-              <w:sdtPr>
-                <w14:checkbox>
-                  <w14:checked w14:val="0"/>
-                  <w14:checkedState w14:val="2612" w14:font="MS Gothic"/>
-                  <w14:uncheckedState w14:val="2610" w14:font="MS Gothic"/>
-                </w14:checkbox>
-              </w:sdtPr>
-              <w:sdtContent>
-                <w:r>
-                  <w:sym w:char="2610" w:font="MS Gothic"/>
-                </w:r>
-              </w:sdtContent>
-            </w:sdt>
-            <w:r>
-              <w:rPr>
-                <w:rFonts w:ascii="Calibri" w:cs="Calibri" w:eastAsia="Calibri" w:hAnsi="Calibri"/>
-                <w:color w:val="453A30"/>
-                <w:sz w:val="21"/>
-                <w:szCs w:val="21"/>
-              </w:rPr>
-              <w:t xml:space="preserve">  </w:t>
-            </w:r>
-            <w:r>
-              <w:rPr>
-                <w:rFonts w:ascii="Calibri" w:cs="Calibri" w:eastAsia="Calibri" w:hAnsi="Calibri"/>
-                <w:color w:val="453A30"/>
-                <w:sz w:val="21"/>
-                <w:szCs w:val="21"/>
-              </w:rPr>
-              <w:t xml:space="preserve">Fill the </w:t>
-            </w:r>
-            <w:r>
-              <w:rPr>
-                <w:rFonts w:ascii="Calibri" w:cs="Calibri" w:eastAsia="Calibri" w:hAnsi="Calibri"/>
-                <w:b/>
-                <w:bCs/>
-                <w:color w:val="453A30"/>
-                <w:sz w:val="21"/>
-                <w:szCs w:val="21"/>
-              </w:rPr>
-              <w:t xml:space="preserve">[brackets]</w:t>
-            </w:r>
-            <w:r>
-              <w:rPr>
-                <w:rFonts w:ascii="Calibri" w:cs="Calibri" w:eastAsia="Calibri" w:hAnsi="Calibri"/>
-                <w:color w:val="453A30"/>
-                <w:sz w:val="21"/>
-                <w:szCs w:val="21"/>
-              </w:rPr>
-              <w:t xml:space="preserve"> in the market posts · tag the market and share its event page</w:t>
-            </w:r>
-            <w:r>
-              <w:rPr>
-                <w:rFonts w:ascii="Calibri" w:cs="Calibri" w:eastAsia="Calibri" w:hAnsi="Calibri"/>
-                <w:color w:val="6A5B4A"/>
-                <w:sz w:val="18"/>
-                <w:szCs w:val="18"/>
-              </w:rPr>
-              <w:t xml:space="preserve"> — copy is in marketing/october-market-posts.md</w:t>
-            </w:r>
-          </w:p>
-          <w:p>
-            <w:pPr>
-              <w:spacing w:after="60"/>
-              <w:ind w:left="300" w:hanging="300"/>
-            </w:pPr>
-            <w:sdt>
-              <w:sdtPr>
-                <w14:checkbox>
-                  <w14:checked w14:val="0"/>
-                  <w14:checkedState w14:val="2612" w14:font="MS Gothic"/>
-                  <w14:uncheckedState w14:val="2610" w14:font="MS Gothic"/>
-                </w14:checkbox>
-              </w:sdtPr>
-              <w:sdtContent>
-                <w:r>
-                  <w:sym w:char="2610" w:font="MS Gothic"/>
-                </w:r>
-              </w:sdtContent>
-            </w:sdt>
-            <w:r>
-              <w:rPr>
-                <w:rFonts w:ascii="Calibri" w:cs="Calibri" w:eastAsia="Calibri" w:hAnsi="Calibri"/>
-                <w:color w:val="453A30"/>
-                <w:sz w:val="21"/>
-                <w:szCs w:val="21"/>
-              </w:rPr>
-              <w:t xml:space="preserve">  </w:t>
-            </w:r>
-            <w:r>
-              <w:rPr>
-                <w:rFonts w:ascii="Calibri" w:cs="Calibri" w:eastAsia="Calibri" w:hAnsi="Calibri"/>
-                <w:color w:val="453A30"/>
-                <w:sz w:val="21"/>
-                <w:szCs w:val="21"/>
-              </w:rPr>
-              <w:t xml:space="preserve">Post the announcement — your page + Instagram</w:t>
-            </w:r>
-            <w:r>
-              <w:rPr>
-                <w:rFonts w:ascii="Calibri" w:cs="Calibri" w:eastAsia="Calibri" w:hAnsi="Calibri"/>
-                <w:color w:val="6A5B4A"/>
-                <w:sz w:val="18"/>
-                <w:szCs w:val="18"/>
-              </w:rPr>
-              <w:t xml:space="preserve"> · Oct 3–4 · use the table photo</w:t>
-            </w:r>
-          </w:p>
-          <w:p>
-            <w:pPr>
-              <w:spacing w:after="60"/>
-              <w:ind w:left="300" w:hanging="300"/>
-            </w:pPr>
-            <w:sdt>
-              <w:sdtPr>
-                <w14:checkbox>
-                  <w14:checked w14:val="0"/>
-                  <w14:checkedState w14:val="2612" w14:font="MS Gothic"/>
-                  <w14:uncheckedState w14:val="2610" w14:font="MS Gothic"/>
-                </w14:checkbox>
-              </w:sdtPr>
-              <w:sdtContent>
-                <w:r>
-                  <w:sym w:char="2610" w:font="MS Gothic"/>
-                </w:r>
-              </w:sdtContent>
-            </w:sdt>
-            <w:r>
-              <w:rPr>
-                <w:rFonts w:ascii="Calibri" w:cs="Calibri" w:eastAsia="Calibri" w:hAnsi="Calibri"/>
-                <w:color w:val="453A30"/>
-                <w:sz w:val="21"/>
-                <w:szCs w:val="21"/>
-              </w:rPr>
-              <w:t xml:space="preserve">  </w:t>
-            </w:r>
-            <w:r>
-              <w:rPr>
-                <w:rFonts w:ascii="Calibri" w:cs="Calibri" w:eastAsia="Calibri" w:hAnsi="Calibri"/>
-                <w:color w:val="453A30"/>
-                <w:sz w:val="21"/>
-                <w:szCs w:val="21"/>
-              </w:rPr>
-              <w:t xml:space="preserve">Post in two local groups, different words each</w:t>
-            </w:r>
-            <w:r>
-              <w:rPr>
-                <w:rFonts w:ascii="Calibri" w:cs="Calibri" w:eastAsia="Calibri" w:hAnsi="Calibri"/>
-                <w:color w:val="6A5B4A"/>
-                <w:sz w:val="18"/>
-                <w:szCs w:val="18"/>
-              </w:rPr>
-              <w:t xml:space="preserve"> · Oct 5 and Oct 7</w:t>
+              <w:t xml:space="preserve">If there's power: warm string lights for an evening table · post “packed and ready”</w:t>
             </w:r>
           </w:p>
         </w:tc>
@@ -2860,6 +2225,1718 @@
                 <w:rFonts w:ascii="Georgia" w:cs="Georgia" w:eastAsia="Georgia" w:hAnsi="Georgia"/>
                 <w:b/>
                 <w:bCs/>
+                <w:color w:val="A34A6B"/>
+                <w:sz w:val="24"/>
+                <w:szCs w:val="24"/>
+              </w:rPr>
+              <w:t xml:space="preserve">Sat Sep 26</w:t>
+            </w:r>
+          </w:p>
+          <w:p>
+            <w:r>
+              <w:rPr>
+                <w:rFonts w:ascii="Calibri" w:cs="Calibri" w:eastAsia="Calibri" w:hAnsi="Calibri"/>
+                <w:color w:val="6A5B4A"/>
+                <w:sz w:val="18"/>
+                <w:szCs w:val="18"/>
+              </w:rPr>
+              <w:t xml:space="preserve">evening · indoor</w:t>
+            </w:r>
+          </w:p>
+          <w:p>
+            <w:pPr>
+              <w:spacing w:before="60"/>
+            </w:pPr>
+            <w:r>
+              <w:rPr>
+                <w:rFonts w:ascii="Calibri" w:cs="Calibri" w:eastAsia="Calibri" w:hAnsi="Calibri"/>
+                <w:b/>
+                <w:bCs/>
+                <w:color w:val="A34A6B"/>
+                <w:sz w:val="16"/>
+                <w:szCs w:val="16"/>
+                <w:shd w:fill="F6E2E8" w:color="auto" w:val="clear"/>
+              </w:rPr>
+              <w:t xml:space="preserve"> MARKET 1 </w:t>
+            </w:r>
+          </w:p>
+        </w:tc>
+        <w:tc>
+          <w:tcPr>
+            <w:tcW w:type="dxa" w:w="8512"/>
+            <w:tcBorders>
+              <w:top w:val="none" w:color="FFFFFF" w:sz="0"/>
+              <w:left w:val="none" w:color="FFFFFF" w:sz="0"/>
+              <w:bottom w:val="single" w:color="E6DCCB" w:sz="4"/>
+              <w:right w:val="none" w:color="FFFFFF" w:sz="0"/>
+            </w:tcBorders>
+            <w:tcMar>
+              <w:top w:type="dxa" w:w="120"/>
+              <w:bottom w:type="dxa" w:w="120"/>
+            </w:tcMar>
+          </w:tcPr>
+          <w:p>
+            <w:pPr>
+              <w:spacing w:after="60"/>
+              <w:ind w:left="300" w:hanging="300"/>
+            </w:pPr>
+            <w:sdt>
+              <w:sdtPr>
+                <w14:checkbox>
+                  <w14:checked w14:val="0"/>
+                  <w14:checkedState w14:val="2612" w14:font="MS Gothic"/>
+                  <w14:uncheckedState w14:val="2610" w14:font="MS Gothic"/>
+                </w14:checkbox>
+              </w:sdtPr>
+              <w:sdtContent>
+                <w:r>
+                  <w:sym w:char="2610" w:font="MS Gothic"/>
+                </w:r>
+              </w:sdtContent>
+            </w:sdt>
+            <w:r>
+              <w:rPr>
+                <w:rFonts w:ascii="Calibri" w:cs="Calibri" w:eastAsia="Calibri" w:hAnsi="Calibri"/>
+                <w:color w:val="453A30"/>
+                <w:sz w:val="21"/>
+                <w:szCs w:val="21"/>
+              </w:rPr>
+              <w:t xml:space="preserve">  </w:t>
+            </w:r>
+            <w:r>
+              <w:rPr>
+                <w:rFonts w:ascii="Calibri" w:cs="Calibri" w:eastAsia="Calibri" w:hAnsi="Calibri"/>
+                <w:b/>
+                <w:bCs/>
+                <w:color w:val="453A30"/>
+                <w:sz w:val="21"/>
+                <w:szCs w:val="21"/>
+              </w:rPr>
+              <w:t xml:space="preserve">Stand, don't sit · phone away</w:t>
+            </w:r>
+            <w:r>
+              <w:rPr>
+                <w:rFonts w:ascii="Calibri" w:cs="Calibri" w:eastAsia="Calibri" w:hAnsi="Calibri"/>
+                <w:color w:val="453A30"/>
+                <w:sz w:val="21"/>
+                <w:szCs w:val="21"/>
+              </w:rPr>
+              <w:t xml:space="preserve"> · smile, say hello, invite people in to look</w:t>
+            </w:r>
+            <w:r>
+              <w:rPr>
+                <w:rFonts w:ascii="Calibri" w:cs="Calibri" w:eastAsia="Calibri" w:hAnsi="Calibri"/>
+                <w:color w:val="6A5B4A"/>
+                <w:sz w:val="18"/>
+                <w:szCs w:val="18"/>
+              </w:rPr>
+              <w:t xml:space="preserve"> — people buy from someone they enjoyed talking to</w:t>
+            </w:r>
+          </w:p>
+          <w:p>
+            <w:pPr>
+              <w:spacing w:after="60"/>
+              <w:ind w:left="300" w:hanging="300"/>
+            </w:pPr>
+            <w:sdt>
+              <w:sdtPr>
+                <w14:checkbox>
+                  <w14:checked w14:val="0"/>
+                  <w14:checkedState w14:val="2612" w14:font="MS Gothic"/>
+                  <w14:uncheckedState w14:val="2610" w14:font="MS Gothic"/>
+                </w14:checkbox>
+              </w:sdtPr>
+              <w:sdtContent>
+                <w:r>
+                  <w:sym w:char="2610" w:font="MS Gothic"/>
+                </w:r>
+              </w:sdtContent>
+            </w:sdt>
+            <w:r>
+              <w:rPr>
+                <w:rFonts w:ascii="Calibri" w:cs="Calibri" w:eastAsia="Calibri" w:hAnsi="Calibri"/>
+                <w:color w:val="453A30"/>
+                <w:sz w:val="21"/>
+                <w:szCs w:val="21"/>
+              </w:rPr>
+              <w:t xml:space="preserve">  </w:t>
+            </w:r>
+            <w:r>
+              <w:rPr>
+                <w:rFonts w:ascii="Calibri" w:cs="Calibri" w:eastAsia="Calibri" w:hAnsi="Calibri"/>
+                <w:color w:val="453A30"/>
+                <w:sz w:val="21"/>
+                <w:szCs w:val="21"/>
+              </w:rPr>
+              <w:t xml:space="preserve">Let people pick things up and try bows on — keep the table touchable</w:t>
+            </w:r>
+          </w:p>
+          <w:p>
+            <w:pPr>
+              <w:spacing w:after="60"/>
+              <w:ind w:left="300" w:hanging="300"/>
+            </w:pPr>
+            <w:sdt>
+              <w:sdtPr>
+                <w14:checkbox>
+                  <w14:checked w14:val="0"/>
+                  <w14:checkedState w14:val="2612" w14:font="MS Gothic"/>
+                  <w14:uncheckedState w14:val="2610" w14:font="MS Gothic"/>
+                </w14:checkbox>
+              </w:sdtPr>
+              <w:sdtContent>
+                <w:r>
+                  <w:sym w:char="2610" w:font="MS Gothic"/>
+                </w:r>
+              </w:sdtContent>
+            </w:sdt>
+            <w:r>
+              <w:rPr>
+                <w:rFonts w:ascii="Calibri" w:cs="Calibri" w:eastAsia="Calibri" w:hAnsi="Calibri"/>
+                <w:color w:val="453A30"/>
+                <w:sz w:val="21"/>
+                <w:szCs w:val="21"/>
+              </w:rPr>
+              <w:t xml:space="preserve">  </w:t>
+            </w:r>
+            <w:r>
+              <w:rPr>
+                <w:rFonts w:ascii="Calibri" w:cs="Calibri" w:eastAsia="Calibri" w:hAnsi="Calibri"/>
+                <w:color w:val="453A30"/>
+                <w:sz w:val="21"/>
+                <w:szCs w:val="21"/>
+              </w:rPr>
+              <w:t xml:space="preserve">Story once you're set up</w:t>
+            </w:r>
+            <w:r>
+              <w:rPr>
+                <w:rFonts w:ascii="Calibri" w:cs="Calibri" w:eastAsia="Calibri" w:hAnsi="Calibri"/>
+                <w:color w:val="6A5B4A"/>
+                <w:sz w:val="18"/>
+                <w:szCs w:val="18"/>
+              </w:rPr>
+              <w:t xml:space="preserve"> · booth photo + location sticker</w:t>
+            </w:r>
+          </w:p>
+          <w:p>
+            <w:pPr>
+              <w:spacing w:after="60"/>
+              <w:ind w:left="300" w:hanging="300"/>
+            </w:pPr>
+            <w:sdt>
+              <w:sdtPr>
+                <w14:checkbox>
+                  <w14:checked w14:val="0"/>
+                  <w14:checkedState w14:val="2612" w14:font="MS Gothic"/>
+                  <w14:uncheckedState w14:val="2610" w14:font="MS Gothic"/>
+                </w14:checkbox>
+              </w:sdtPr>
+              <w:sdtContent>
+                <w:r>
+                  <w:sym w:char="2610" w:font="MS Gothic"/>
+                </w:r>
+              </w:sdtContent>
+            </w:sdt>
+            <w:r>
+              <w:rPr>
+                <w:rFonts w:ascii="Calibri" w:cs="Calibri" w:eastAsia="Calibri" w:hAnsi="Calibri"/>
+                <w:color w:val="453A30"/>
+                <w:sz w:val="21"/>
+                <w:szCs w:val="21"/>
+              </w:rPr>
+              <w:t xml:space="preserve">  </w:t>
+            </w:r>
+            <w:r>
+              <w:rPr>
+                <w:rFonts w:ascii="Calibri" w:cs="Calibri" w:eastAsia="Calibri" w:hAnsi="Calibri"/>
+                <w:color w:val="453A30"/>
+                <w:sz w:val="21"/>
+                <w:szCs w:val="21"/>
+              </w:rPr>
+              <w:t xml:space="preserve">Mark each sale on the inventory list</w:t>
+            </w:r>
+          </w:p>
+          <w:p>
+            <w:pPr>
+              <w:spacing w:after="60"/>
+              <w:ind w:left="300" w:hanging="300"/>
+            </w:pPr>
+            <w:sdt>
+              <w:sdtPr>
+                <w14:checkbox>
+                  <w14:checked w14:val="0"/>
+                  <w14:checkedState w14:val="2612" w14:font="MS Gothic"/>
+                  <w14:uncheckedState w14:val="2610" w14:font="MS Gothic"/>
+                </w14:checkbox>
+              </w:sdtPr>
+              <w:sdtContent>
+                <w:r>
+                  <w:sym w:char="2610" w:font="MS Gothic"/>
+                </w:r>
+              </w:sdtContent>
+            </w:sdt>
+            <w:r>
+              <w:rPr>
+                <w:rFonts w:ascii="Calibri" w:cs="Calibri" w:eastAsia="Calibri" w:hAnsi="Calibri"/>
+                <w:color w:val="453A30"/>
+                <w:sz w:val="21"/>
+                <w:szCs w:val="21"/>
+              </w:rPr>
+              <w:t xml:space="preserve">  </w:t>
+            </w:r>
+            <w:r>
+              <w:rPr>
+                <w:rFonts w:ascii="Calibri" w:cs="Calibri" w:eastAsia="Calibri" w:hAnsi="Calibri"/>
+                <w:color w:val="453A30"/>
+                <w:sz w:val="21"/>
+                <w:szCs w:val="21"/>
+              </w:rPr>
+              <w:t xml:space="preserve">Ask every buyer how they heard: post ____ group ____ walked past ____ friend ____</w:t>
+            </w:r>
+          </w:p>
+          <w:p>
+            <w:pPr>
+              <w:spacing w:after="60"/>
+              <w:ind w:left="300" w:hanging="300"/>
+            </w:pPr>
+            <w:sdt>
+              <w:sdtPr>
+                <w14:checkbox>
+                  <w14:checked w14:val="0"/>
+                  <w14:checkedState w14:val="2612" w14:font="MS Gothic"/>
+                  <w14:uncheckedState w14:val="2610" w14:font="MS Gothic"/>
+                </w14:checkbox>
+              </w:sdtPr>
+              <w:sdtContent>
+                <w:r>
+                  <w:sym w:char="2610" w:font="MS Gothic"/>
+                </w:r>
+              </w:sdtContent>
+            </w:sdt>
+            <w:r>
+              <w:rPr>
+                <w:rFonts w:ascii="Calibri" w:cs="Calibri" w:eastAsia="Calibri" w:hAnsi="Calibri"/>
+                <w:color w:val="453A30"/>
+                <w:sz w:val="21"/>
+                <w:szCs w:val="21"/>
+              </w:rPr>
+              <w:t xml:space="preserve">  </w:t>
+            </w:r>
+            <w:r>
+              <w:rPr>
+                <w:rFonts w:ascii="Calibri" w:cs="Calibri" w:eastAsia="Calibri" w:hAnsi="Calibri"/>
+                <w:color w:val="453A30"/>
+                <w:sz w:val="21"/>
+                <w:szCs w:val="21"/>
+              </w:rPr>
+              <w:t xml:space="preserve">Set aside </w:t>
+            </w:r>
+            <w:r>
+              <w:rPr>
+                <w:rFonts w:ascii="Calibri" w:cs="Calibri" w:eastAsia="Calibri" w:hAnsi="Calibri"/>
+                <w:b/>
+                <w:bCs/>
+                <w:color w:val="453A30"/>
+                <w:sz w:val="21"/>
+                <w:szCs w:val="21"/>
+              </w:rPr>
+              <w:t xml:space="preserve">7.6%</w:t>
+            </w:r>
+            <w:r>
+              <w:rPr>
+                <w:rFonts w:ascii="Calibri" w:cs="Calibri" w:eastAsia="Calibri" w:hAnsi="Calibri"/>
+                <w:color w:val="453A30"/>
+                <w:sz w:val="21"/>
+                <w:szCs w:val="21"/>
+              </w:rPr>
+              <w:t xml:space="preserve"> of every sale for sales tax  </w:t>
+            </w:r>
+            <w:r>
+              <w:rPr>
+                <w:rFonts w:ascii="Calibri" w:cs="Calibri" w:eastAsia="Calibri" w:hAnsi="Calibri"/>
+                <w:color w:val="6A5B4A"/>
+                <w:sz w:val="18"/>
+                <w:szCs w:val="18"/>
+              </w:rPr>
+              <w:t xml:space="preserve">(prices are tax-included)</w:t>
+            </w:r>
+          </w:p>
+          <w:p>
+            <w:pPr>
+              <w:spacing w:after="60"/>
+              <w:ind w:left="300" w:hanging="300"/>
+            </w:pPr>
+            <w:sdt>
+              <w:sdtPr>
+                <w14:checkbox>
+                  <w14:checked w14:val="0"/>
+                  <w14:checkedState w14:val="2612" w14:font="MS Gothic"/>
+                  <w14:uncheckedState w14:val="2610" w14:font="MS Gothic"/>
+                </w14:checkbox>
+              </w:sdtPr>
+              <w:sdtContent>
+                <w:r>
+                  <w:sym w:char="2610" w:font="MS Gothic"/>
+                </w:r>
+              </w:sdtContent>
+            </w:sdt>
+            <w:r>
+              <w:rPr>
+                <w:rFonts w:ascii="Calibri" w:cs="Calibri" w:eastAsia="Calibri" w:hAnsi="Calibri"/>
+                <w:color w:val="453A30"/>
+                <w:sz w:val="21"/>
+                <w:szCs w:val="21"/>
+              </w:rPr>
+              <w:t xml:space="preserve">  </w:t>
+            </w:r>
+            <w:r>
+              <w:rPr>
+                <w:rFonts w:ascii="Calibri" w:cs="Calibri" w:eastAsia="Calibri" w:hAnsi="Calibri"/>
+                <w:color w:val="453A30"/>
+                <w:sz w:val="21"/>
+                <w:szCs w:val="21"/>
+              </w:rPr>
+              <w:t xml:space="preserve">Total taken: $</w:t>
+            </w:r>
+            <w:r>
+              <w:rPr>
+                <w:rFonts w:ascii="Calibri" w:cs="Calibri" w:eastAsia="Calibri" w:hAnsi="Calibri"/>
+                <w:color w:val="453A30"/>
+                <w:sz w:val="21"/>
+                <w:szCs w:val="21"/>
+              </w:rPr>
+              <w:t xml:space="preserve">________</w:t>
+            </w:r>
+            <w:r>
+              <w:rPr>
+                <w:rFonts w:ascii="Calibri" w:cs="Calibri" w:eastAsia="Calibri" w:hAnsi="Calibri"/>
+                <w:color w:val="453A30"/>
+                <w:sz w:val="21"/>
+                <w:szCs w:val="21"/>
+              </w:rPr>
+              <w:t xml:space="preserve">  </w:t>
+            </w:r>
+            <w:r>
+              <w:rPr>
+                <w:rFonts w:ascii="Calibri" w:cs="Calibri" w:eastAsia="Calibri" w:hAnsi="Calibri"/>
+                <w:color w:val="6A5B4A"/>
+                <w:sz w:val="18"/>
+                <w:szCs w:val="18"/>
+              </w:rPr>
+              <w:t xml:space="preserve">· goal $200–300 · the $20 fee is two bows</w:t>
+            </w:r>
+          </w:p>
+        </w:tc>
+      </w:tr>
+      <w:tr>
+        <w:trPr>
+          <w:cantSplit/>
+        </w:trPr>
+        <w:tc>
+          <w:tcPr>
+            <w:tcW w:type="dxa" w:w="2000"/>
+            <w:tcBorders>
+              <w:top w:val="none" w:color="FFFFFF" w:sz="0"/>
+              <w:left w:val="none" w:color="FFFFFF" w:sz="0"/>
+              <w:bottom w:val="single" w:color="E6DCCB" w:sz="4"/>
+              <w:right w:val="none" w:color="FFFFFF" w:sz="0"/>
+            </w:tcBorders>
+            <w:tcMar>
+              <w:top w:type="dxa" w:w="120"/>
+              <w:bottom w:type="dxa" w:w="120"/>
+              <w:right w:type="dxa" w:w="120"/>
+            </w:tcMar>
+          </w:tcPr>
+          <w:p>
+            <w:r>
+              <w:rPr>
+                <w:rFonts w:ascii="Georgia" w:cs="Georgia" w:eastAsia="Georgia" w:hAnsi="Georgia"/>
+                <w:b/>
+                <w:bCs/>
+                <w:color w:val="453A30"/>
+                <w:sz w:val="24"/>
+                <w:szCs w:val="24"/>
+              </w:rPr>
+              <w:t xml:space="preserve">Sun Sep 27</w:t>
+            </w:r>
+          </w:p>
+        </w:tc>
+        <w:tc>
+          <w:tcPr>
+            <w:tcW w:type="dxa" w:w="8512"/>
+            <w:tcBorders>
+              <w:top w:val="none" w:color="FFFFFF" w:sz="0"/>
+              <w:left w:val="none" w:color="FFFFFF" w:sz="0"/>
+              <w:bottom w:val="single" w:color="E6DCCB" w:sz="4"/>
+              <w:right w:val="none" w:color="FFFFFF" w:sz="0"/>
+            </w:tcBorders>
+            <w:tcMar>
+              <w:top w:type="dxa" w:w="120"/>
+              <w:bottom w:type="dxa" w:w="120"/>
+            </w:tcMar>
+          </w:tcPr>
+          <w:p>
+            <w:pPr>
+              <w:spacing w:after="60"/>
+              <w:ind w:left="300" w:hanging="300"/>
+            </w:pPr>
+            <w:sdt>
+              <w:sdtPr>
+                <w14:checkbox>
+                  <w14:checked w14:val="0"/>
+                  <w14:checkedState w14:val="2612" w14:font="MS Gothic"/>
+                  <w14:uncheckedState w14:val="2610" w14:font="MS Gothic"/>
+                </w14:checkbox>
+              </w:sdtPr>
+              <w:sdtContent>
+                <w:r>
+                  <w:sym w:char="2610" w:font="MS Gothic"/>
+                </w:r>
+              </w:sdtContent>
+            </w:sdt>
+            <w:r>
+              <w:rPr>
+                <w:rFonts w:ascii="Calibri" w:cs="Calibri" w:eastAsia="Calibri" w:hAnsi="Calibri"/>
+                <w:color w:val="453A30"/>
+                <w:sz w:val="21"/>
+                <w:szCs w:val="21"/>
+              </w:rPr>
+              <w:t xml:space="preserve">  </w:t>
+            </w:r>
+            <w:r>
+              <w:rPr>
+                <w:rFonts w:ascii="Calibri" w:cs="Calibri" w:eastAsia="Calibri" w:hAnsi="Calibri"/>
+                <w:color w:val="453A30"/>
+                <w:sz w:val="21"/>
+                <w:szCs w:val="21"/>
+              </w:rPr>
+              <w:t xml:space="preserve">Tell Claude what sold, so it's marked sold out online</w:t>
+            </w:r>
+          </w:p>
+          <w:p>
+            <w:pPr>
+              <w:spacing w:after="60"/>
+              <w:ind w:left="300" w:hanging="300"/>
+            </w:pPr>
+            <w:sdt>
+              <w:sdtPr>
+                <w14:checkbox>
+                  <w14:checked w14:val="0"/>
+                  <w14:checkedState w14:val="2612" w14:font="MS Gothic"/>
+                  <w14:uncheckedState w14:val="2610" w14:font="MS Gothic"/>
+                </w14:checkbox>
+              </w:sdtPr>
+              <w:sdtContent>
+                <w:r>
+                  <w:sym w:char="2610" w:font="MS Gothic"/>
+                </w:r>
+              </w:sdtContent>
+            </w:sdt>
+            <w:r>
+              <w:rPr>
+                <w:rFonts w:ascii="Calibri" w:cs="Calibri" w:eastAsia="Calibri" w:hAnsi="Calibri"/>
+                <w:color w:val="453A30"/>
+                <w:sz w:val="21"/>
+                <w:szCs w:val="21"/>
+              </w:rPr>
+              <w:t xml:space="preserve">  </w:t>
+            </w:r>
+            <w:r>
+              <w:rPr>
+                <w:rFonts w:ascii="Calibri" w:cs="Calibri" w:eastAsia="Calibri" w:hAnsi="Calibri"/>
+                <w:b/>
+                <w:bCs/>
+                <w:color w:val="453A30"/>
+                <w:sz w:val="21"/>
+                <w:szCs w:val="21"/>
+              </w:rPr>
+              <w:t xml:space="preserve">Then</w:t>
+            </w:r>
+            <w:r>
+              <w:rPr>
+                <w:rFonts w:ascii="Calibri" w:cs="Calibri" w:eastAsia="Calibri" w:hAnsi="Calibri"/>
+                <w:color w:val="453A30"/>
+                <w:sz w:val="21"/>
+                <w:szCs w:val="21"/>
+              </w:rPr>
+              <w:t xml:space="preserve"> post the thank-you</w:t>
+            </w:r>
+            <w:r>
+              <w:rPr>
+                <w:rFonts w:ascii="Calibri" w:cs="Calibri" w:eastAsia="Calibri" w:hAnsi="Calibri"/>
+                <w:color w:val="6A5B4A"/>
+                <w:sz w:val="18"/>
+                <w:szCs w:val="18"/>
+              </w:rPr>
+              <w:t xml:space="preserve"> · one real moment from the day</w:t>
+            </w:r>
+          </w:p>
+          <w:p>
+            <w:pPr>
+              <w:spacing w:after="60"/>
+              <w:ind w:left="300" w:hanging="300"/>
+            </w:pPr>
+            <w:sdt>
+              <w:sdtPr>
+                <w14:checkbox>
+                  <w14:checked w14:val="0"/>
+                  <w14:checkedState w14:val="2612" w14:font="MS Gothic"/>
+                  <w14:uncheckedState w14:val="2610" w14:font="MS Gothic"/>
+                </w14:checkbox>
+              </w:sdtPr>
+              <w:sdtContent>
+                <w:r>
+                  <w:sym w:char="2610" w:font="MS Gothic"/>
+                </w:r>
+              </w:sdtContent>
+            </w:sdt>
+            <w:r>
+              <w:rPr>
+                <w:rFonts w:ascii="Calibri" w:cs="Calibri" w:eastAsia="Calibri" w:hAnsi="Calibri"/>
+                <w:color w:val="453A30"/>
+                <w:sz w:val="21"/>
+                <w:szCs w:val="21"/>
+              </w:rPr>
+              <w:t xml:space="preserve">  </w:t>
+            </w:r>
+            <w:r>
+              <w:rPr>
+                <w:rFonts w:ascii="Calibri" w:cs="Calibri" w:eastAsia="Calibri" w:hAnsi="Calibri"/>
+                <w:color w:val="453A30"/>
+                <w:sz w:val="21"/>
+                <w:szCs w:val="21"/>
+              </w:rPr>
+              <w:t xml:space="preserve">Halloween bows sold: </w:t>
+            </w:r>
+            <w:r>
+              <w:rPr>
+                <w:rFonts w:ascii="Calibri" w:cs="Calibri" w:eastAsia="Calibri" w:hAnsi="Calibri"/>
+                <w:color w:val="453A30"/>
+                <w:sz w:val="21"/>
+                <w:szCs w:val="21"/>
+              </w:rPr>
+              <w:t xml:space="preserve">____</w:t>
+            </w:r>
+            <w:r>
+              <w:rPr>
+                <w:rFonts w:ascii="Calibri" w:cs="Calibri" w:eastAsia="Calibri" w:hAnsi="Calibri"/>
+                <w:color w:val="453A30"/>
+                <w:sz w:val="21"/>
+                <w:szCs w:val="21"/>
+              </w:rPr>
+              <w:t xml:space="preserve"> of 4 · best print: </w:t>
+            </w:r>
+            <w:r>
+              <w:rPr>
+                <w:rFonts w:ascii="Calibri" w:cs="Calibri" w:eastAsia="Calibri" w:hAnsi="Calibri"/>
+                <w:color w:val="453A30"/>
+                <w:sz w:val="21"/>
+                <w:szCs w:val="21"/>
+              </w:rPr>
+              <w:t xml:space="preserve">____________________</w:t>
+            </w:r>
+          </w:p>
+          <w:p>
+            <w:pPr>
+              <w:spacing w:after="60"/>
+              <w:ind w:left="300" w:hanging="300"/>
+            </w:pPr>
+            <w:sdt>
+              <w:sdtPr>
+                <w14:checkbox>
+                  <w14:checked w14:val="0"/>
+                  <w14:checkedState w14:val="2612" w14:font="MS Gothic"/>
+                  <w14:uncheckedState w14:val="2610" w14:font="MS Gothic"/>
+                </w14:checkbox>
+              </w:sdtPr>
+              <w:sdtContent>
+                <w:r>
+                  <w:sym w:char="2610" w:font="MS Gothic"/>
+                </w:r>
+              </w:sdtContent>
+            </w:sdt>
+            <w:r>
+              <w:rPr>
+                <w:rFonts w:ascii="Calibri" w:cs="Calibri" w:eastAsia="Calibri" w:hAnsi="Calibri"/>
+                <w:color w:val="453A30"/>
+                <w:sz w:val="21"/>
+                <w:szCs w:val="21"/>
+              </w:rPr>
+              <w:t xml:space="preserve">  </w:t>
+            </w:r>
+            <w:r>
+              <w:rPr>
+                <w:rFonts w:ascii="Calibri" w:cs="Calibri" w:eastAsia="Calibri" w:hAnsi="Calibri"/>
+                <w:color w:val="453A30"/>
+                <w:sz w:val="21"/>
+                <w:szCs w:val="21"/>
+              </w:rPr>
+              <w:t xml:space="preserve">Hair whimsys sold: ____ of 8</w:t>
+            </w:r>
+          </w:p>
+        </w:tc>
+      </w:tr>
+      <w:tr>
+        <w:trPr>
+          <w:cantSplit/>
+        </w:trPr>
+        <w:tc>
+          <w:tcPr>
+            <w:tcW w:type="dxa" w:w="2000"/>
+            <w:tcBorders>
+              <w:top w:val="none" w:color="FFFFFF" w:sz="0"/>
+              <w:left w:val="none" w:color="FFFFFF" w:sz="0"/>
+              <w:bottom w:val="single" w:color="E6DCCB" w:sz="4"/>
+              <w:right w:val="none" w:color="FFFFFF" w:sz="0"/>
+            </w:tcBorders>
+            <w:tcMar>
+              <w:top w:type="dxa" w:w="120"/>
+              <w:bottom w:type="dxa" w:w="120"/>
+              <w:right w:type="dxa" w:w="120"/>
+            </w:tcMar>
+          </w:tcPr>
+          <w:p>
+            <w:r>
+              <w:rPr>
+                <w:rFonts w:ascii="Georgia" w:cs="Georgia" w:eastAsia="Georgia" w:hAnsi="Georgia"/>
+                <w:b/>
+                <w:bCs/>
+                <w:color w:val="453A30"/>
+                <w:sz w:val="24"/>
+                <w:szCs w:val="24"/>
+              </w:rPr>
+              <w:t xml:space="preserve">Sep 27 – Oct 2</w:t>
+            </w:r>
+          </w:p>
+          <w:p>
+            <w:r>
+              <w:rPr>
+                <w:rFonts w:ascii="Calibri" w:cs="Calibri" w:eastAsia="Calibri" w:hAnsi="Calibri"/>
+                <w:color w:val="6A5B4A"/>
+                <w:sz w:val="18"/>
+                <w:szCs w:val="18"/>
+              </w:rPr>
+              <w:t xml:space="preserve">Sun – Fri</w:t>
+            </w:r>
+          </w:p>
+          <w:p>
+            <w:pPr>
+              <w:spacing w:before="60"/>
+            </w:pPr>
+            <w:r>
+              <w:rPr>
+                <w:rFonts w:ascii="Calibri" w:cs="Calibri" w:eastAsia="Calibri" w:hAnsi="Calibri"/>
+                <w:b/>
+                <w:bCs/>
+                <w:color w:val="2F6B72"/>
+                <w:sz w:val="16"/>
+                <w:szCs w:val="16"/>
+                <w:shd w:fill="DCEBEB" w:color="auto" w:val="clear"/>
+              </w:rPr>
+              <w:t xml:space="preserve"> ~7 HOURS </w:t>
+            </w:r>
+          </w:p>
+        </w:tc>
+        <w:tc>
+          <w:tcPr>
+            <w:tcW w:type="dxa" w:w="8512"/>
+            <w:tcBorders>
+              <w:top w:val="none" w:color="FFFFFF" w:sz="0"/>
+              <w:left w:val="none" w:color="FFFFFF" w:sz="0"/>
+              <w:bottom w:val="single" w:color="E6DCCB" w:sz="4"/>
+              <w:right w:val="none" w:color="FFFFFF" w:sz="0"/>
+            </w:tcBorders>
+            <w:tcMar>
+              <w:top w:type="dxa" w:w="120"/>
+              <w:bottom w:type="dxa" w:w="120"/>
+            </w:tcMar>
+          </w:tcPr>
+          <w:p>
+            <w:pPr>
+              <w:spacing w:after="80"/>
+            </w:pPr>
+            <w:r>
+              <w:rPr>
+                <w:rFonts w:ascii="Georgia" w:cs="Georgia" w:eastAsia="Georgia" w:hAnsi="Georgia"/>
+                <w:b/>
+                <w:bCs/>
+                <w:color w:val="453A30"/>
+                <w:sz w:val="22"/>
+                <w:szCs w:val="22"/>
+              </w:rPr>
+              <w:t xml:space="preserve">Gift card holders, scrunchies — and more of whatever sold</w:t>
+            </w:r>
+          </w:p>
+          <w:p>
+            <w:pPr>
+              <w:spacing w:after="60"/>
+              <w:ind w:left="300" w:hanging="300"/>
+            </w:pPr>
+            <w:sdt>
+              <w:sdtPr>
+                <w14:checkbox>
+                  <w14:checked w14:val="0"/>
+                  <w14:checkedState w14:val="2612" w14:font="MS Gothic"/>
+                  <w14:uncheckedState w14:val="2610" w14:font="MS Gothic"/>
+                </w14:checkbox>
+              </w:sdtPr>
+              <w:sdtContent>
+                <w:r>
+                  <w:sym w:char="2610" w:font="MS Gothic"/>
+                </w:r>
+              </w:sdtContent>
+            </w:sdt>
+            <w:r>
+              <w:rPr>
+                <w:rFonts w:ascii="Calibri" w:cs="Calibri" w:eastAsia="Calibri" w:hAnsi="Calibri"/>
+                <w:color w:val="453A30"/>
+                <w:sz w:val="21"/>
+                <w:szCs w:val="21"/>
+              </w:rPr>
+              <w:t xml:space="preserve">  </w:t>
+            </w:r>
+            <w:r>
+              <w:rPr>
+                <w:rFonts w:ascii="Calibri" w:cs="Calibri" w:eastAsia="Calibri" w:hAnsi="Calibri"/>
+                <w:color w:val="453A30"/>
+                <w:sz w:val="21"/>
+                <w:szCs w:val="21"/>
+              </w:rPr>
+              <w:t xml:space="preserve">Make ONE gift card holder and time it: </w:t>
+            </w:r>
+            <w:r>
+              <w:rPr>
+                <w:rFonts w:ascii="Calibri" w:cs="Calibri" w:eastAsia="Calibri" w:hAnsi="Calibri"/>
+                <w:color w:val="453A30"/>
+                <w:sz w:val="21"/>
+                <w:szCs w:val="21"/>
+              </w:rPr>
+              <w:t xml:space="preserve">______</w:t>
+            </w:r>
+            <w:r>
+              <w:rPr>
+                <w:rFonts w:ascii="Calibri" w:cs="Calibri" w:eastAsia="Calibri" w:hAnsi="Calibri"/>
+                <w:color w:val="453A30"/>
+                <w:sz w:val="21"/>
+                <w:szCs w:val="21"/>
+              </w:rPr>
+              <w:t xml:space="preserve"> min</w:t>
+            </w:r>
+          </w:p>
+          <w:p>
+            <w:pPr>
+              <w:spacing w:after="60"/>
+            </w:pPr>
+            <w:r>
+              <w:rPr>
+                <w:rFonts w:ascii="Calibri" w:cs="Calibri" w:eastAsia="Calibri" w:hAnsi="Calibri"/>
+                <w:color w:val="453A30"/>
+                <w:sz w:val="21"/>
+                <w:szCs w:val="21"/>
+              </w:rPr>
+              <w:t xml:space="preserve">Gift card holders</w:t>
+            </w:r>
+            <w:r>
+              <w:rPr>
+                <w:rFonts w:ascii="Calibri" w:cs="Calibri" w:eastAsia="Calibri" w:hAnsi="Calibri"/>
+                <w:color w:val="6A5B4A"/>
+                <w:sz w:val="18"/>
+                <w:szCs w:val="18"/>
+              </w:rPr>
+              <w:t xml:space="preserve">  · 7–9 more, $10 each</w:t>
+            </w:r>
+            <w:r>
+              <w:rPr>
+                <w:rFonts w:ascii="Calibri" w:cs="Calibri" w:eastAsia="Calibri" w:hAnsi="Calibri"/>
+                <w:color w:val="453A30"/>
+                <w:sz w:val="21"/>
+                <w:szCs w:val="21"/>
+              </w:rPr>
+              <w:t xml:space="preserve">   </w:t>
+            </w:r>
+            <w:sdt>
+              <w:sdtPr>
+                <w14:checkbox>
+                  <w14:checked w14:val="0"/>
+                  <w14:checkedState w14:val="2612" w14:font="MS Gothic"/>
+                  <w14:uncheckedState w14:val="2610" w14:font="MS Gothic"/>
+                </w14:checkbox>
+              </w:sdtPr>
+              <w:sdtContent>
+                <w:r>
+                  <w:sym w:char="2610" w:font="MS Gothic"/>
+                </w:r>
+              </w:sdtContent>
+            </w:sdt>
+            <w:r>
+              <w:rPr>
+                <w:rFonts w:ascii="Calibri" w:cs="Calibri" w:eastAsia="Calibri" w:hAnsi="Calibri"/>
+                <w:color w:val="453A30"/>
+                <w:sz w:val="21"/>
+                <w:szCs w:val="21"/>
+              </w:rPr>
+              <w:t xml:space="preserve"> </w:t>
+            </w:r>
+            <w:sdt>
+              <w:sdtPr>
+                <w14:checkbox>
+                  <w14:checked w14:val="0"/>
+                  <w14:checkedState w14:val="2612" w14:font="MS Gothic"/>
+                  <w14:uncheckedState w14:val="2610" w14:font="MS Gothic"/>
+                </w14:checkbox>
+              </w:sdtPr>
+              <w:sdtContent>
+                <w:r>
+                  <w:sym w:char="2610" w:font="MS Gothic"/>
+                </w:r>
+              </w:sdtContent>
+            </w:sdt>
+            <w:r>
+              <w:rPr>
+                <w:rFonts w:ascii="Calibri" w:cs="Calibri" w:eastAsia="Calibri" w:hAnsi="Calibri"/>
+                <w:color w:val="453A30"/>
+                <w:sz w:val="21"/>
+                <w:szCs w:val="21"/>
+              </w:rPr>
+              <w:t xml:space="preserve"> </w:t>
+            </w:r>
+            <w:sdt>
+              <w:sdtPr>
+                <w14:checkbox>
+                  <w14:checked w14:val="0"/>
+                  <w14:checkedState w14:val="2612" w14:font="MS Gothic"/>
+                  <w14:uncheckedState w14:val="2610" w14:font="MS Gothic"/>
+                </w14:checkbox>
+              </w:sdtPr>
+              <w:sdtContent>
+                <w:r>
+                  <w:sym w:char="2610" w:font="MS Gothic"/>
+                </w:r>
+              </w:sdtContent>
+            </w:sdt>
+            <w:r>
+              <w:rPr>
+                <w:rFonts w:ascii="Calibri" w:cs="Calibri" w:eastAsia="Calibri" w:hAnsi="Calibri"/>
+                <w:color w:val="453A30"/>
+                <w:sz w:val="21"/>
+                <w:szCs w:val="21"/>
+              </w:rPr>
+              <w:t xml:space="preserve"> </w:t>
+            </w:r>
+            <w:sdt>
+              <w:sdtPr>
+                <w14:checkbox>
+                  <w14:checked w14:val="0"/>
+                  <w14:checkedState w14:val="2612" w14:font="MS Gothic"/>
+                  <w14:uncheckedState w14:val="2610" w14:font="MS Gothic"/>
+                </w14:checkbox>
+              </w:sdtPr>
+              <w:sdtContent>
+                <w:r>
+                  <w:sym w:char="2610" w:font="MS Gothic"/>
+                </w:r>
+              </w:sdtContent>
+            </w:sdt>
+            <w:r>
+              <w:rPr>
+                <w:rFonts w:ascii="Calibri" w:cs="Calibri" w:eastAsia="Calibri" w:hAnsi="Calibri"/>
+                <w:color w:val="453A30"/>
+                <w:sz w:val="21"/>
+                <w:szCs w:val="21"/>
+              </w:rPr>
+              <w:t xml:space="preserve"> </w:t>
+            </w:r>
+            <w:sdt>
+              <w:sdtPr>
+                <w14:checkbox>
+                  <w14:checked w14:val="0"/>
+                  <w14:checkedState w14:val="2612" w14:font="MS Gothic"/>
+                  <w14:uncheckedState w14:val="2610" w14:font="MS Gothic"/>
+                </w14:checkbox>
+              </w:sdtPr>
+              <w:sdtContent>
+                <w:r>
+                  <w:sym w:char="2610" w:font="MS Gothic"/>
+                </w:r>
+              </w:sdtContent>
+            </w:sdt>
+            <w:r>
+              <w:rPr>
+                <w:rFonts w:ascii="Calibri" w:cs="Calibri" w:eastAsia="Calibri" w:hAnsi="Calibri"/>
+                <w:color w:val="453A30"/>
+                <w:sz w:val="21"/>
+                <w:szCs w:val="21"/>
+              </w:rPr>
+              <w:t xml:space="preserve"> </w:t>
+            </w:r>
+            <w:sdt>
+              <w:sdtPr>
+                <w14:checkbox>
+                  <w14:checked w14:val="0"/>
+                  <w14:checkedState w14:val="2612" w14:font="MS Gothic"/>
+                  <w14:uncheckedState w14:val="2610" w14:font="MS Gothic"/>
+                </w14:checkbox>
+              </w:sdtPr>
+              <w:sdtContent>
+                <w:r>
+                  <w:sym w:char="2610" w:font="MS Gothic"/>
+                </w:r>
+              </w:sdtContent>
+            </w:sdt>
+            <w:r>
+              <w:rPr>
+                <w:rFonts w:ascii="Calibri" w:cs="Calibri" w:eastAsia="Calibri" w:hAnsi="Calibri"/>
+                <w:color w:val="453A30"/>
+                <w:sz w:val="21"/>
+                <w:szCs w:val="21"/>
+              </w:rPr>
+              <w:t xml:space="preserve"> </w:t>
+            </w:r>
+            <w:sdt>
+              <w:sdtPr>
+                <w14:checkbox>
+                  <w14:checked w14:val="0"/>
+                  <w14:checkedState w14:val="2612" w14:font="MS Gothic"/>
+                  <w14:uncheckedState w14:val="2610" w14:font="MS Gothic"/>
+                </w14:checkbox>
+              </w:sdtPr>
+              <w:sdtContent>
+                <w:r>
+                  <w:sym w:char="2610" w:font="MS Gothic"/>
+                </w:r>
+              </w:sdtContent>
+            </w:sdt>
+            <w:r>
+              <w:rPr>
+                <w:rFonts w:ascii="Calibri" w:cs="Calibri" w:eastAsia="Calibri" w:hAnsi="Calibri"/>
+                <w:color w:val="453A30"/>
+                <w:sz w:val="21"/>
+                <w:szCs w:val="21"/>
+              </w:rPr>
+              <w:t xml:space="preserve"> </w:t>
+            </w:r>
+            <w:sdt>
+              <w:sdtPr>
+                <w14:checkbox>
+                  <w14:checked w14:val="0"/>
+                  <w14:checkedState w14:val="2612" w14:font="MS Gothic"/>
+                  <w14:uncheckedState w14:val="2610" w14:font="MS Gothic"/>
+                </w14:checkbox>
+              </w:sdtPr>
+              <w:sdtContent>
+                <w:r>
+                  <w:sym w:char="2610" w:font="MS Gothic"/>
+                </w:r>
+              </w:sdtContent>
+            </w:sdt>
+            <w:r>
+              <w:rPr>
+                <w:rFonts w:ascii="Calibri" w:cs="Calibri" w:eastAsia="Calibri" w:hAnsi="Calibri"/>
+                <w:color w:val="453A30"/>
+                <w:sz w:val="21"/>
+                <w:szCs w:val="21"/>
+              </w:rPr>
+              <w:t xml:space="preserve"> </w:t>
+            </w:r>
+            <w:sdt>
+              <w:sdtPr>
+                <w14:checkbox>
+                  <w14:checked w14:val="0"/>
+                  <w14:checkedState w14:val="2612" w14:font="MS Gothic"/>
+                  <w14:uncheckedState w14:val="2610" w14:font="MS Gothic"/>
+                </w14:checkbox>
+              </w:sdtPr>
+              <w:sdtContent>
+                <w:r>
+                  <w:sym w:char="2610" w:font="MS Gothic"/>
+                </w:r>
+              </w:sdtContent>
+            </w:sdt>
+            <w:r>
+              <w:rPr>
+                <w:rFonts w:ascii="Calibri" w:cs="Calibri" w:eastAsia="Calibri" w:hAnsi="Calibri"/>
+                <w:color w:val="453A30"/>
+                <w:sz w:val="21"/>
+                <w:szCs w:val="21"/>
+              </w:rPr>
+              <w:t xml:space="preserve"/>
+            </w:r>
+          </w:p>
+          <w:p>
+            <w:pPr>
+              <w:spacing w:after="60"/>
+            </w:pPr>
+            <w:r>
+              <w:rPr>
+                <w:rFonts w:ascii="Calibri" w:cs="Calibri" w:eastAsia="Calibri" w:hAnsi="Calibri"/>
+                <w:color w:val="453A30"/>
+                <w:sz w:val="21"/>
+                <w:szCs w:val="21"/>
+              </w:rPr>
+              <w:t xml:space="preserve">Christmas scrunchies</w:t>
+            </w:r>
+            <w:r>
+              <w:rPr>
+                <w:rFonts w:ascii="Calibri" w:cs="Calibri" w:eastAsia="Calibri" w:hAnsi="Calibri"/>
+                <w:color w:val="6A5B4A"/>
+                <w:sz w:val="18"/>
+                <w:szCs w:val="18"/>
+              </w:rPr>
+              <w:t xml:space="preserve">  · Bowknots in Scarlet</w:t>
+            </w:r>
+            <w:r>
+              <w:rPr>
+                <w:rFonts w:ascii="Calibri" w:cs="Calibri" w:eastAsia="Calibri" w:hAnsi="Calibri"/>
+                <w:color w:val="453A30"/>
+                <w:sz w:val="21"/>
+                <w:szCs w:val="21"/>
+              </w:rPr>
+              <w:t xml:space="preserve">   </w:t>
+            </w:r>
+            <w:sdt>
+              <w:sdtPr>
+                <w14:checkbox>
+                  <w14:checked w14:val="0"/>
+                  <w14:checkedState w14:val="2612" w14:font="MS Gothic"/>
+                  <w14:uncheckedState w14:val="2610" w14:font="MS Gothic"/>
+                </w14:checkbox>
+              </w:sdtPr>
+              <w:sdtContent>
+                <w:r>
+                  <w:sym w:char="2610" w:font="MS Gothic"/>
+                </w:r>
+              </w:sdtContent>
+            </w:sdt>
+            <w:r>
+              <w:rPr>
+                <w:rFonts w:ascii="Calibri" w:cs="Calibri" w:eastAsia="Calibri" w:hAnsi="Calibri"/>
+                <w:color w:val="453A30"/>
+                <w:sz w:val="21"/>
+                <w:szCs w:val="21"/>
+              </w:rPr>
+              <w:t xml:space="preserve"> </w:t>
+            </w:r>
+            <w:sdt>
+              <w:sdtPr>
+                <w14:checkbox>
+                  <w14:checked w14:val="0"/>
+                  <w14:checkedState w14:val="2612" w14:font="MS Gothic"/>
+                  <w14:uncheckedState w14:val="2610" w14:font="MS Gothic"/>
+                </w14:checkbox>
+              </w:sdtPr>
+              <w:sdtContent>
+                <w:r>
+                  <w:sym w:char="2610" w:font="MS Gothic"/>
+                </w:r>
+              </w:sdtContent>
+            </w:sdt>
+            <w:r>
+              <w:rPr>
+                <w:rFonts w:ascii="Calibri" w:cs="Calibri" w:eastAsia="Calibri" w:hAnsi="Calibri"/>
+                <w:color w:val="453A30"/>
+                <w:sz w:val="21"/>
+                <w:szCs w:val="21"/>
+              </w:rPr>
+              <w:t xml:space="preserve"> </w:t>
+            </w:r>
+            <w:sdt>
+              <w:sdtPr>
+                <w14:checkbox>
+                  <w14:checked w14:val="0"/>
+                  <w14:checkedState w14:val="2612" w14:font="MS Gothic"/>
+                  <w14:uncheckedState w14:val="2610" w14:font="MS Gothic"/>
+                </w14:checkbox>
+              </w:sdtPr>
+              <w:sdtContent>
+                <w:r>
+                  <w:sym w:char="2610" w:font="MS Gothic"/>
+                </w:r>
+              </w:sdtContent>
+            </w:sdt>
+            <w:r>
+              <w:rPr>
+                <w:rFonts w:ascii="Calibri" w:cs="Calibri" w:eastAsia="Calibri" w:hAnsi="Calibri"/>
+                <w:color w:val="453A30"/>
+                <w:sz w:val="21"/>
+                <w:szCs w:val="21"/>
+              </w:rPr>
+              <w:t xml:space="preserve"/>
+            </w:r>
+          </w:p>
+          <w:p>
+            <w:pPr>
+              <w:spacing w:after="60"/>
+              <w:ind w:left="300" w:hanging="300"/>
+            </w:pPr>
+            <w:sdt>
+              <w:sdtPr>
+                <w14:checkbox>
+                  <w14:checked w14:val="0"/>
+                  <w14:checkedState w14:val="2612" w14:font="MS Gothic"/>
+                  <w14:uncheckedState w14:val="2610" w14:font="MS Gothic"/>
+                </w14:checkbox>
+              </w:sdtPr>
+              <w:sdtContent>
+                <w:r>
+                  <w:sym w:char="2610" w:font="MS Gothic"/>
+                </w:r>
+              </w:sdtContent>
+            </w:sdt>
+            <w:r>
+              <w:rPr>
+                <w:rFonts w:ascii="Calibri" w:cs="Calibri" w:eastAsia="Calibri" w:hAnsi="Calibri"/>
+                <w:color w:val="453A30"/>
+                <w:sz w:val="21"/>
+                <w:szCs w:val="21"/>
+              </w:rPr>
+              <w:t xml:space="preserve">  </w:t>
+            </w:r>
+            <w:r>
+              <w:rPr>
+                <w:rFonts w:ascii="Calibri" w:cs="Calibri" w:eastAsia="Calibri" w:hAnsi="Calibri"/>
+                <w:color w:val="453A30"/>
+                <w:sz w:val="21"/>
+                <w:szCs w:val="21"/>
+              </w:rPr>
+              <w:t xml:space="preserve">Halloween bows: if 3–4 of 4 went on Sep 26, make 4 more in the prints that sold — they now have two more markets to sell at</w:t>
+            </w:r>
+          </w:p>
+        </w:tc>
+      </w:tr>
+      <w:tr>
+        <w:trPr>
+          <w:cantSplit/>
+        </w:trPr>
+        <w:tc>
+          <w:tcPr>
+            <w:tcW w:type="dxa" w:w="2000"/>
+            <w:tcBorders>
+              <w:top w:val="none" w:color="FFFFFF" w:sz="0"/>
+              <w:left w:val="none" w:color="FFFFFF" w:sz="0"/>
+              <w:bottom w:val="single" w:color="E6DCCB" w:sz="4"/>
+              <w:right w:val="none" w:color="FFFFFF" w:sz="0"/>
+            </w:tcBorders>
+            <w:tcMar>
+              <w:top w:type="dxa" w:w="120"/>
+              <w:bottom w:type="dxa" w:w="120"/>
+              <w:right w:type="dxa" w:w="120"/>
+            </w:tcMar>
+          </w:tcPr>
+          <w:p>
+            <w:r>
+              <w:rPr>
+                <w:rFonts w:ascii="Georgia" w:cs="Georgia" w:eastAsia="Georgia" w:hAnsi="Georgia"/>
+                <w:b/>
+                <w:bCs/>
+                <w:color w:val="453A30"/>
+                <w:sz w:val="24"/>
+                <w:szCs w:val="24"/>
+              </w:rPr>
+              <w:t xml:space="preserve">Oct 3 – 8</w:t>
+            </w:r>
+          </w:p>
+          <w:p>
+            <w:r>
+              <w:rPr>
+                <w:rFonts w:ascii="Calibri" w:cs="Calibri" w:eastAsia="Calibri" w:hAnsi="Calibri"/>
+                <w:color w:val="6A5B4A"/>
+                <w:sz w:val="18"/>
+                <w:szCs w:val="18"/>
+              </w:rPr>
+              <w:t xml:space="preserve">Sat – Thu</w:t>
+            </w:r>
+          </w:p>
+          <w:p>
+            <w:pPr>
+              <w:spacing w:before="60"/>
+            </w:pPr>
+            <w:r>
+              <w:rPr>
+                <w:rFonts w:ascii="Calibri" w:cs="Calibri" w:eastAsia="Calibri" w:hAnsi="Calibri"/>
+                <w:b/>
+                <w:bCs/>
+                <w:color w:val="2F6B72"/>
+                <w:sz w:val="16"/>
+                <w:szCs w:val="16"/>
+                <w:shd w:fill="DCEBEB" w:color="auto" w:val="clear"/>
+              </w:rPr>
+              <w:t xml:space="preserve"> ~6 HOURS </w:t>
+            </w:r>
+          </w:p>
+        </w:tc>
+        <w:tc>
+          <w:tcPr>
+            <w:tcW w:type="dxa" w:w="8512"/>
+            <w:tcBorders>
+              <w:top w:val="none" w:color="FFFFFF" w:sz="0"/>
+              <w:left w:val="none" w:color="FFFFFF" w:sz="0"/>
+              <w:bottom w:val="single" w:color="E6DCCB" w:sz="4"/>
+              <w:right w:val="none" w:color="FFFFFF" w:sz="0"/>
+            </w:tcBorders>
+            <w:tcMar>
+              <w:top w:type="dxa" w:w="120"/>
+              <w:bottom w:type="dxa" w:w="120"/>
+            </w:tcMar>
+          </w:tcPr>
+          <w:p>
+            <w:pPr>
+              <w:spacing w:after="80"/>
+            </w:pPr>
+            <w:r>
+              <w:rPr>
+                <w:rFonts w:ascii="Georgia" w:cs="Georgia" w:eastAsia="Georgia" w:hAnsi="Georgia"/>
+                <w:b/>
+                <w:bCs/>
+                <w:color w:val="453A30"/>
+                <w:sz w:val="22"/>
+                <w:szCs w:val="22"/>
+              </w:rPr>
+              <w:t xml:space="preserve">Bandanas, restock, and the outdoor gear</w:t>
+            </w:r>
+          </w:p>
+          <w:p>
+            <w:pPr>
+              <w:spacing w:after="60"/>
+            </w:pPr>
+            <w:r>
+              <w:rPr>
+                <w:rFonts w:ascii="Calibri" w:cs="Calibri" w:eastAsia="Calibri" w:hAnsi="Calibri"/>
+                <w:color w:val="453A30"/>
+                <w:sz w:val="21"/>
+                <w:szCs w:val="21"/>
+              </w:rPr>
+              <w:t xml:space="preserve">Dog bandanas — Medium</w:t>
+            </w:r>
+            <w:r>
+              <w:rPr>
+                <w:rFonts w:ascii="Calibri" w:cs="Calibri" w:eastAsia="Calibri" w:hAnsi="Calibri"/>
+                <w:color w:val="6A5B4A"/>
+                <w:sz w:val="18"/>
+                <w:szCs w:val="18"/>
+              </w:rPr>
+              <w:t xml:space="preserve">  · Scarlet/Cream · Bone Carver's Candy/Elain's Gingham · Autumn Court Gourds/Lucien's Patch</w:t>
+            </w:r>
+            <w:r>
+              <w:rPr>
+                <w:rFonts w:ascii="Calibri" w:cs="Calibri" w:eastAsia="Calibri" w:hAnsi="Calibri"/>
+                <w:color w:val="453A30"/>
+                <w:sz w:val="21"/>
+                <w:szCs w:val="21"/>
+              </w:rPr>
+              <w:t xml:space="preserve">   </w:t>
+            </w:r>
+            <w:sdt>
+              <w:sdtPr>
+                <w14:checkbox>
+                  <w14:checked w14:val="0"/>
+                  <w14:checkedState w14:val="2612" w14:font="MS Gothic"/>
+                  <w14:uncheckedState w14:val="2610" w14:font="MS Gothic"/>
+                </w14:checkbox>
+              </w:sdtPr>
+              <w:sdtContent>
+                <w:r>
+                  <w:sym w:char="2610" w:font="MS Gothic"/>
+                </w:r>
+              </w:sdtContent>
+            </w:sdt>
+            <w:r>
+              <w:rPr>
+                <w:rFonts w:ascii="Calibri" w:cs="Calibri" w:eastAsia="Calibri" w:hAnsi="Calibri"/>
+                <w:color w:val="453A30"/>
+                <w:sz w:val="21"/>
+                <w:szCs w:val="21"/>
+              </w:rPr>
+              <w:t xml:space="preserve"> </w:t>
+            </w:r>
+            <w:sdt>
+              <w:sdtPr>
+                <w14:checkbox>
+                  <w14:checked w14:val="0"/>
+                  <w14:checkedState w14:val="2612" w14:font="MS Gothic"/>
+                  <w14:uncheckedState w14:val="2610" w14:font="MS Gothic"/>
+                </w14:checkbox>
+              </w:sdtPr>
+              <w:sdtContent>
+                <w:r>
+                  <w:sym w:char="2610" w:font="MS Gothic"/>
+                </w:r>
+              </w:sdtContent>
+            </w:sdt>
+            <w:r>
+              <w:rPr>
+                <w:rFonts w:ascii="Calibri" w:cs="Calibri" w:eastAsia="Calibri" w:hAnsi="Calibri"/>
+                <w:color w:val="453A30"/>
+                <w:sz w:val="21"/>
+                <w:szCs w:val="21"/>
+              </w:rPr>
+              <w:t xml:space="preserve"> </w:t>
+            </w:r>
+            <w:sdt>
+              <w:sdtPr>
+                <w14:checkbox>
+                  <w14:checked w14:val="0"/>
+                  <w14:checkedState w14:val="2612" w14:font="MS Gothic"/>
+                  <w14:uncheckedState w14:val="2610" w14:font="MS Gothic"/>
+                </w14:checkbox>
+              </w:sdtPr>
+              <w:sdtContent>
+                <w:r>
+                  <w:sym w:char="2610" w:font="MS Gothic"/>
+                </w:r>
+              </w:sdtContent>
+            </w:sdt>
+            <w:r>
+              <w:rPr>
+                <w:rFonts w:ascii="Calibri" w:cs="Calibri" w:eastAsia="Calibri" w:hAnsi="Calibri"/>
+                <w:color w:val="453A30"/>
+                <w:sz w:val="21"/>
+                <w:szCs w:val="21"/>
+              </w:rPr>
+              <w:t xml:space="preserve"/>
+            </w:r>
+          </w:p>
+          <w:p>
+            <w:pPr>
+              <w:spacing w:after="60"/>
+            </w:pPr>
+            <w:r>
+              <w:rPr>
+                <w:rFonts w:ascii="Calibri" w:cs="Calibri" w:eastAsia="Calibri" w:hAnsi="Calibri"/>
+                <w:color w:val="453A30"/>
+                <w:sz w:val="21"/>
+                <w:szCs w:val="21"/>
+              </w:rPr>
+              <w:t xml:space="preserve">Dog bandanas — Large</w:t>
+            </w:r>
+            <w:r>
+              <w:rPr>
+                <w:rFonts w:ascii="Calibri" w:cs="Calibri" w:eastAsia="Calibri" w:hAnsi="Calibri"/>
+                <w:color w:val="6A5B4A"/>
+                <w:sz w:val="18"/>
+                <w:szCs w:val="18"/>
+              </w:rPr>
+              <w:t xml:space="preserve">  · Scarlet/Cream · Pumpkin Patch/Amber</w:t>
+            </w:r>
+            <w:r>
+              <w:rPr>
+                <w:rFonts w:ascii="Calibri" w:cs="Calibri" w:eastAsia="Calibri" w:hAnsi="Calibri"/>
+                <w:color w:val="453A30"/>
+                <w:sz w:val="21"/>
+                <w:szCs w:val="21"/>
+              </w:rPr>
+              <w:t xml:space="preserve">   </w:t>
+            </w:r>
+            <w:sdt>
+              <w:sdtPr>
+                <w14:checkbox>
+                  <w14:checked w14:val="0"/>
+                  <w14:checkedState w14:val="2612" w14:font="MS Gothic"/>
+                  <w14:uncheckedState w14:val="2610" w14:font="MS Gothic"/>
+                </w14:checkbox>
+              </w:sdtPr>
+              <w:sdtContent>
+                <w:r>
+                  <w:sym w:char="2610" w:font="MS Gothic"/>
+                </w:r>
+              </w:sdtContent>
+            </w:sdt>
+            <w:r>
+              <w:rPr>
+                <w:rFonts w:ascii="Calibri" w:cs="Calibri" w:eastAsia="Calibri" w:hAnsi="Calibri"/>
+                <w:color w:val="453A30"/>
+                <w:sz w:val="21"/>
+                <w:szCs w:val="21"/>
+              </w:rPr>
+              <w:t xml:space="preserve"> </w:t>
+            </w:r>
+            <w:sdt>
+              <w:sdtPr>
+                <w14:checkbox>
+                  <w14:checked w14:val="0"/>
+                  <w14:checkedState w14:val="2612" w14:font="MS Gothic"/>
+                  <w14:uncheckedState w14:val="2610" w14:font="MS Gothic"/>
+                </w14:checkbox>
+              </w:sdtPr>
+              <w:sdtContent>
+                <w:r>
+                  <w:sym w:char="2610" w:font="MS Gothic"/>
+                </w:r>
+              </w:sdtContent>
+            </w:sdt>
+            <w:r>
+              <w:rPr>
+                <w:rFonts w:ascii="Calibri" w:cs="Calibri" w:eastAsia="Calibri" w:hAnsi="Calibri"/>
+                <w:color w:val="453A30"/>
+                <w:sz w:val="21"/>
+                <w:szCs w:val="21"/>
+              </w:rPr>
+              <w:t xml:space="preserve"/>
+            </w:r>
+          </w:p>
+          <w:p>
+            <w:pPr>
+              <w:spacing w:after="60"/>
+              <w:ind w:left="300" w:hanging="300"/>
+            </w:pPr>
+            <w:sdt>
+              <w:sdtPr>
+                <w14:checkbox>
+                  <w14:checked w14:val="0"/>
+                  <w14:checkedState w14:val="2612" w14:font="MS Gothic"/>
+                  <w14:uncheckedState w14:val="2610" w14:font="MS Gothic"/>
+                </w14:checkbox>
+              </w:sdtPr>
+              <w:sdtContent>
+                <w:r>
+                  <w:sym w:char="2610" w:font="MS Gothic"/>
+                </w:r>
+              </w:sdtContent>
+            </w:sdt>
+            <w:r>
+              <w:rPr>
+                <w:rFonts w:ascii="Calibri" w:cs="Calibri" w:eastAsia="Calibri" w:hAnsi="Calibri"/>
+                <w:color w:val="453A30"/>
+                <w:sz w:val="21"/>
+                <w:szCs w:val="21"/>
+              </w:rPr>
+              <w:t xml:space="preserve">  </w:t>
+            </w:r>
+            <w:r>
+              <w:rPr>
+                <w:rFonts w:ascii="Calibri" w:cs="Calibri" w:eastAsia="Calibri" w:hAnsi="Calibri"/>
+                <w:color w:val="453A30"/>
+                <w:sz w:val="21"/>
+                <w:szCs w:val="21"/>
+              </w:rPr>
+              <w:t xml:space="preserve">Re-sew whatever sold out on Sep 26: ________________ · update the inventory list</w:t>
+            </w:r>
+          </w:p>
+          <w:p>
+            <w:pPr>
+              <w:spacing w:after="60"/>
+              <w:ind w:left="300" w:hanging="300"/>
+            </w:pPr>
+            <w:sdt>
+              <w:sdtPr>
+                <w14:checkbox>
+                  <w14:checked w14:val="0"/>
+                  <w14:checkedState w14:val="2612" w14:font="MS Gothic"/>
+                  <w14:uncheckedState w14:val="2610" w14:font="MS Gothic"/>
+                </w14:checkbox>
+              </w:sdtPr>
+              <w:sdtContent>
+                <w:r>
+                  <w:sym w:char="2610" w:font="MS Gothic"/>
+                </w:r>
+              </w:sdtContent>
+            </w:sdt>
+            <w:r>
+              <w:rPr>
+                <w:rFonts w:ascii="Calibri" w:cs="Calibri" w:eastAsia="Calibri" w:hAnsi="Calibri"/>
+                <w:color w:val="453A30"/>
+                <w:sz w:val="21"/>
+                <w:szCs w:val="21"/>
+              </w:rPr>
+              <w:t xml:space="preserve">  </w:t>
+            </w:r>
+            <w:r>
+              <w:rPr>
+                <w:rFonts w:ascii="Calibri" w:cs="Calibri" w:eastAsia="Calibri" w:hAnsi="Calibri"/>
+                <w:color w:val="453A30"/>
+                <w:sz w:val="21"/>
+                <w:szCs w:val="21"/>
+              </w:rPr>
+              <w:t xml:space="preserve">Canopy + weights for the two outdoor markets · ask the Oct organisers the same questions</w:t>
+            </w:r>
+          </w:p>
+          <w:p>
+            <w:pPr>
+              <w:spacing w:after="60"/>
+              <w:ind w:left="300" w:hanging="300"/>
+            </w:pPr>
+            <w:sdt>
+              <w:sdtPr>
+                <w14:checkbox>
+                  <w14:checked w14:val="0"/>
+                  <w14:checkedState w14:val="2612" w14:font="MS Gothic"/>
+                  <w14:uncheckedState w14:val="2610" w14:font="MS Gothic"/>
+                </w14:checkbox>
+              </w:sdtPr>
+              <w:sdtContent>
+                <w:r>
+                  <w:sym w:char="2610" w:font="MS Gothic"/>
+                </w:r>
+              </w:sdtContent>
+            </w:sdt>
+            <w:r>
+              <w:rPr>
+                <w:rFonts w:ascii="Calibri" w:cs="Calibri" w:eastAsia="Calibri" w:hAnsi="Calibri"/>
+                <w:color w:val="453A30"/>
+                <w:sz w:val="21"/>
+                <w:szCs w:val="21"/>
+              </w:rPr>
+              <w:t xml:space="preserve">  </w:t>
+            </w:r>
+            <w:r>
+              <w:rPr>
+                <w:rFonts w:ascii="Calibri" w:cs="Calibri" w:eastAsia="Calibri" w:hAnsi="Calibri"/>
+                <w:color w:val="453A30"/>
+                <w:sz w:val="21"/>
+                <w:szCs w:val="21"/>
+              </w:rPr>
+              <w:t xml:space="preserve">Fill the </w:t>
+            </w:r>
+            <w:r>
+              <w:rPr>
+                <w:rFonts w:ascii="Calibri" w:cs="Calibri" w:eastAsia="Calibri" w:hAnsi="Calibri"/>
+                <w:b/>
+                <w:bCs/>
+                <w:color w:val="453A30"/>
+                <w:sz w:val="21"/>
+                <w:szCs w:val="21"/>
+              </w:rPr>
+              <w:t xml:space="preserve">[brackets]</w:t>
+            </w:r>
+            <w:r>
+              <w:rPr>
+                <w:rFonts w:ascii="Calibri" w:cs="Calibri" w:eastAsia="Calibri" w:hAnsi="Calibri"/>
+                <w:color w:val="453A30"/>
+                <w:sz w:val="21"/>
+                <w:szCs w:val="21"/>
+              </w:rPr>
+              <w:t xml:space="preserve"> in the market posts · tag the market and share its event page</w:t>
+            </w:r>
+            <w:r>
+              <w:rPr>
+                <w:rFonts w:ascii="Calibri" w:cs="Calibri" w:eastAsia="Calibri" w:hAnsi="Calibri"/>
+                <w:color w:val="6A5B4A"/>
+                <w:sz w:val="18"/>
+                <w:szCs w:val="18"/>
+              </w:rPr>
+              <w:t xml:space="preserve"> — copy is in marketing/october-market-posts.md</w:t>
+            </w:r>
+          </w:p>
+          <w:p>
+            <w:pPr>
+              <w:spacing w:after="60"/>
+              <w:ind w:left="300" w:hanging="300"/>
+            </w:pPr>
+            <w:sdt>
+              <w:sdtPr>
+                <w14:checkbox>
+                  <w14:checked w14:val="0"/>
+                  <w14:checkedState w14:val="2612" w14:font="MS Gothic"/>
+                  <w14:uncheckedState w14:val="2610" w14:font="MS Gothic"/>
+                </w14:checkbox>
+              </w:sdtPr>
+              <w:sdtContent>
+                <w:r>
+                  <w:sym w:char="2610" w:font="MS Gothic"/>
+                </w:r>
+              </w:sdtContent>
+            </w:sdt>
+            <w:r>
+              <w:rPr>
+                <w:rFonts w:ascii="Calibri" w:cs="Calibri" w:eastAsia="Calibri" w:hAnsi="Calibri"/>
+                <w:color w:val="453A30"/>
+                <w:sz w:val="21"/>
+                <w:szCs w:val="21"/>
+              </w:rPr>
+              <w:t xml:space="preserve">  </w:t>
+            </w:r>
+            <w:r>
+              <w:rPr>
+                <w:rFonts w:ascii="Calibri" w:cs="Calibri" w:eastAsia="Calibri" w:hAnsi="Calibri"/>
+                <w:color w:val="453A30"/>
+                <w:sz w:val="21"/>
+                <w:szCs w:val="21"/>
+              </w:rPr>
+              <w:t xml:space="preserve">Post the announcement — your page + Instagram</w:t>
+            </w:r>
+            <w:r>
+              <w:rPr>
+                <w:rFonts w:ascii="Calibri" w:cs="Calibri" w:eastAsia="Calibri" w:hAnsi="Calibri"/>
+                <w:color w:val="6A5B4A"/>
+                <w:sz w:val="18"/>
+                <w:szCs w:val="18"/>
+              </w:rPr>
+              <w:t xml:space="preserve"> · Oct 3–4 · use the table photo</w:t>
+            </w:r>
+          </w:p>
+          <w:p>
+            <w:pPr>
+              <w:spacing w:after="60"/>
+              <w:ind w:left="300" w:hanging="300"/>
+            </w:pPr>
+            <w:sdt>
+              <w:sdtPr>
+                <w14:checkbox>
+                  <w14:checked w14:val="0"/>
+                  <w14:checkedState w14:val="2612" w14:font="MS Gothic"/>
+                  <w14:uncheckedState w14:val="2610" w14:font="MS Gothic"/>
+                </w14:checkbox>
+              </w:sdtPr>
+              <w:sdtContent>
+                <w:r>
+                  <w:sym w:char="2610" w:font="MS Gothic"/>
+                </w:r>
+              </w:sdtContent>
+            </w:sdt>
+            <w:r>
+              <w:rPr>
+                <w:rFonts w:ascii="Calibri" w:cs="Calibri" w:eastAsia="Calibri" w:hAnsi="Calibri"/>
+                <w:color w:val="453A30"/>
+                <w:sz w:val="21"/>
+                <w:szCs w:val="21"/>
+              </w:rPr>
+              <w:t xml:space="preserve">  </w:t>
+            </w:r>
+            <w:r>
+              <w:rPr>
+                <w:rFonts w:ascii="Calibri" w:cs="Calibri" w:eastAsia="Calibri" w:hAnsi="Calibri"/>
+                <w:color w:val="453A30"/>
+                <w:sz w:val="21"/>
+                <w:szCs w:val="21"/>
+              </w:rPr>
+              <w:t xml:space="preserve">Post in two local groups, different words each</w:t>
+            </w:r>
+            <w:r>
+              <w:rPr>
+                <w:rFonts w:ascii="Calibri" w:cs="Calibri" w:eastAsia="Calibri" w:hAnsi="Calibri"/>
+                <w:color w:val="6A5B4A"/>
+                <w:sz w:val="18"/>
+                <w:szCs w:val="18"/>
+              </w:rPr>
+              <w:t xml:space="preserve"> · Oct 5 and Oct 7</w:t>
+            </w:r>
+          </w:p>
+        </w:tc>
+      </w:tr>
+      <w:tr>
+        <w:trPr>
+          <w:cantSplit/>
+        </w:trPr>
+        <w:tc>
+          <w:tcPr>
+            <w:tcW w:type="dxa" w:w="2000"/>
+            <w:tcBorders>
+              <w:top w:val="none" w:color="FFFFFF" w:sz="0"/>
+              <w:left w:val="none" w:color="FFFFFF" w:sz="0"/>
+              <w:bottom w:val="single" w:color="E6DCCB" w:sz="4"/>
+              <w:right w:val="none" w:color="FFFFFF" w:sz="0"/>
+            </w:tcBorders>
+            <w:tcMar>
+              <w:top w:type="dxa" w:w="120"/>
+              <w:bottom w:type="dxa" w:w="120"/>
+              <w:right w:type="dxa" w:w="120"/>
+            </w:tcMar>
+          </w:tcPr>
+          <w:p>
+            <w:r>
+              <w:rPr>
+                <w:rFonts w:ascii="Georgia" w:cs="Georgia" w:eastAsia="Georgia" w:hAnsi="Georgia"/>
+                <w:b/>
+                <w:bCs/>
                 <w:color w:val="453A30"/>
                 <w:sz w:val="24"/>
                 <w:szCs w:val="24"/>
@@ -3006,7 +4083,7 @@
           <w:sz w:val="18"/>
           <w:szCs w:val="18"/>
         </w:rPr>
-        <w:t xml:space="preserve">Sewing to Oct 10: </w:t>
+        <w:t xml:space="preserve">Sewing to Sep 26: ~10 hours · to Oct 10: </w:t>
       </w:r>
       <w:r>
         <w:rPr>
@@ -3167,7 +4244,7 @@
                 <w:szCs w:val="16"/>
                 <w:shd w:fill="F6E2E8" w:color="auto" w:val="clear"/>
               </w:rPr>
-              <w:t xml:space="preserve"> MARKET 1 </w:t>
+              <w:t xml:space="preserve"> MARKET 2 </w:t>
             </w:r>
           </w:p>
         </w:tc>
@@ -4669,7 +5746,7 @@
                 <w:szCs w:val="16"/>
                 <w:shd w:fill="F6E2E8" w:color="auto" w:val="clear"/>
               </w:rPr>
-              <w:t xml:space="preserve"> MARKET 2 </w:t>
+              <w:t xml:space="preserve"> MARKET 3 </w:t>
             </w:r>
           </w:p>
         </w:tc>
@@ -5942,7 +7019,7 @@
           <w:sz w:val="18"/>
           <w:szCs w:val="18"/>
         </w:rPr>
-        <w:t xml:space="preserve">$60 for both</w:t>
+        <w:t xml:space="preserve">$80 for all three</w:t>
       </w:r>
       <w:r>
         <w:rPr>

</xml_diff>

<commit_message>
Market times from the organisers' flyers
Sep 26 is 4-9pm (own 6-8 ft table, no canopy), Oct 10 is 9am-3pm, Oct 30 is
5-11pm and booked for that night only. Times filled into the posts and the
checklist; names and places stay out of the public repo.

Co-Authored-By: Claude Opus 5 <noreply@anthropic.com>
</commit_message>
<xml_diff>
--- a/marketing/october-market-prep.docx
+++ b/marketing/october-market-prep.docx
@@ -1764,7 +1764,7 @@
                 <w:sz w:val="21"/>
                 <w:szCs w:val="21"/>
               </w:rPr>
-              <w:t xml:space="preserve">Ask the Sep 26 organiser: table provided? · power? · set-up time · liability insurance? · check the tax rate if it's outside San Antonio (the 7.6% assumes 8.25%)</w:t>
+              <w:t xml:space="preserve">Ask the Sep 26 organiser: power? · set-up time · liability insurance? · check the tax rate if it's outside San Antonio (the 7.6% assumes 8.25%)</w:t>
             </w:r>
           </w:p>
           <w:p>
@@ -2240,7 +2240,7 @@
                 <w:sz w:val="18"/>
                 <w:szCs w:val="18"/>
               </w:rPr>
-              <w:t xml:space="preserve">evening · indoor</w:t>
+              <w:t xml:space="preserve">4 – 9pm · indoor</w:t>
             </w:r>
           </w:p>
           <w:p>
@@ -4227,7 +4227,7 @@
                 <w:sz w:val="18"/>
                 <w:szCs w:val="18"/>
               </w:rPr>
-              <w:t xml:space="preserve">daytime</w:t>
+              <w:t xml:space="preserve">9am – 3pm</w:t>
             </w:r>
           </w:p>
           <w:p>
@@ -5729,7 +5729,7 @@
                 <w:sz w:val="18"/>
                 <w:szCs w:val="18"/>
               </w:rPr>
-              <w:t xml:space="preserve">night</w:t>
+              <w:t xml:space="preserve">5 – 11pm</w:t>
             </w:r>
           </w:p>
           <w:p>

</xml_diff>

<commit_message>
Market bows: 19 planned, 8 sewn; sales tax linked to Webfile, filing quarterly
Six more bows sewn Sep 14 (Nesta's Familiars, Rita's Harlequin, plus extras
Lucien's Patch, Elain's Gingham, Solstice Sunflowers and Lady of Autumn).
Halloween tallies now of 8; two bandana backs flagged to check.
Sales tax permit linked to Webfile; next return Oct 20.

Co-Authored-By: Claude Opus 5 <noreply@anthropic.com>
</commit_message>
<xml_diff>
--- a/marketing/october-market-prep.docx
+++ b/marketing/october-market-prep.docx
@@ -507,7 +507,7 @@
                 <w:sz w:val="21"/>
                 <w:szCs w:val="21"/>
               </w:rPr>
-              <w:t xml:space="preserve">Link the sales tax permit to Webfile, before Oct 20</w:t>
+              <w:t xml:space="preserve">✅ Sales tax permit linked to Webfile (Sep 15) · quarterly — Jul–Sep return due Oct 20, and it includes Sep 26 market sales</w:t>
             </w:r>
           </w:p>
           <w:p>
@@ -840,7 +840,7 @@
                 <w:szCs w:val="16"/>
                 <w:shd w:fill="DCEBEB" w:color="auto" w:val="clear"/>
               </w:rPr>
-              <w:t xml:space="preserve"> ~10 HOURS </w:t>
+              <w:t xml:space="preserve"> ~8 HOURS </w:t>
             </w:r>
           </w:p>
         </w:tc>
@@ -871,7 +871,7 @@
                 <w:sz w:val="22"/>
                 <w:szCs w:val="22"/>
               </w:rPr>
-              <w:t xml:space="preserve">Bows and hair whimsys — ready for Sep 26</w:t>
+              <w:t xml:space="preserve">Bows and hair whimsys — ready for Sep 26 (19 bows, 8 already sewn)</w:t>
             </w:r>
           </w:p>
           <w:p>
@@ -1170,7 +1170,7 @@
                 <w:sz w:val="18"/>
                 <w:szCs w:val="18"/>
               </w:rPr>
-              <w:t xml:space="preserve">  · one of each, to learn which sells</w:t>
+              <w:t xml:space="preserve">  · one of each, to learn which sells · ✓ already sewn</w:t>
             </w:r>
           </w:p>
           <w:p>
@@ -1198,7 +1198,7 @@
                 <w:sz w:val="19"/>
                 <w:szCs w:val="19"/>
               </w:rPr>
-              <w:t xml:space="preserve"> Weaver's Web      </w:t>
+              <w:t xml:space="preserve"> Weaver's Web ✓      </w:t>
             </w:r>
             <w:sdt>
               <w:sdtPr>
@@ -1221,7 +1221,7 @@
                 <w:sz w:val="19"/>
                 <w:szCs w:val="19"/>
               </w:rPr>
-              <w:t xml:space="preserve"> Nesta's Familiars      </w:t>
+              <w:t xml:space="preserve"> Nesta's Familiars ✓      </w:t>
             </w:r>
             <w:sdt>
               <w:sdtPr>
@@ -1244,7 +1244,7 @@
                 <w:sz w:val="19"/>
                 <w:szCs w:val="19"/>
               </w:rPr>
-              <w:t xml:space="preserve"> Rita's Harlequin      </w:t>
+              <w:t xml:space="preserve"> Rita's Harlequin ✓      </w:t>
             </w:r>
             <w:sdt>
               <w:sdtPr>
@@ -1267,7 +1267,99 @@
                 <w:sz w:val="19"/>
                 <w:szCs w:val="19"/>
               </w:rPr>
+              <w:t xml:space="preserve"> Lucien's Patch ✓      </w:t>
+            </w:r>
+            <w:sdt>
+              <w:sdtPr>
+                <w14:checkbox>
+                  <w14:checked w14:val="0"/>
+                  <w14:checkedState w14:val="2612" w14:font="MS Gothic"/>
+                  <w14:uncheckedState w14:val="2610" w14:font="MS Gothic"/>
+                </w14:checkbox>
+              </w:sdtPr>
+              <w:sdtContent>
+                <w:r>
+                  <w:sym w:char="2610" w:font="MS Gothic"/>
+                </w:r>
+              </w:sdtContent>
+            </w:sdt>
+            <w:r>
+              <w:rPr>
+                <w:rFonts w:ascii="Calibri" w:cs="Calibri" w:eastAsia="Calibri" w:hAnsi="Calibri"/>
+                <w:color w:val="453A30"/>
+                <w:sz w:val="19"/>
+                <w:szCs w:val="19"/>
+              </w:rPr>
+              <w:t xml:space="preserve"> Solstice Sunflowers ✓      </w:t>
+            </w:r>
+            <w:sdt>
+              <w:sdtPr>
+                <w14:checkbox>
+                  <w14:checked w14:val="0"/>
+                  <w14:checkedState w14:val="2612" w14:font="MS Gothic"/>
+                  <w14:uncheckedState w14:val="2610" w14:font="MS Gothic"/>
+                </w14:checkbox>
+              </w:sdtPr>
+              <w:sdtContent>
+                <w:r>
+                  <w:sym w:char="2610" w:font="MS Gothic"/>
+                </w:r>
+              </w:sdtContent>
+            </w:sdt>
+            <w:r>
+              <w:rPr>
+                <w:rFonts w:ascii="Calibri" w:cs="Calibri" w:eastAsia="Calibri" w:hAnsi="Calibri"/>
+                <w:color w:val="453A30"/>
+                <w:sz w:val="19"/>
+                <w:szCs w:val="19"/>
+              </w:rPr>
+              <w:t xml:space="preserve"> Lady of Autumn ✓      </w:t>
+            </w:r>
+            <w:sdt>
+              <w:sdtPr>
+                <w14:checkbox>
+                  <w14:checked w14:val="0"/>
+                  <w14:checkedState w14:val="2612" w14:font="MS Gothic"/>
+                  <w14:uncheckedState w14:val="2610" w14:font="MS Gothic"/>
+                </w14:checkbox>
+              </w:sdtPr>
+              <w:sdtContent>
+                <w:r>
+                  <w:sym w:char="2610" w:font="MS Gothic"/>
+                </w:r>
+              </w:sdtContent>
+            </w:sdt>
+            <w:r>
+              <w:rPr>
+                <w:rFonts w:ascii="Calibri" w:cs="Calibri" w:eastAsia="Calibri" w:hAnsi="Calibri"/>
+                <w:color w:val="453A30"/>
+                <w:sz w:val="19"/>
+                <w:szCs w:val="19"/>
+              </w:rPr>
               <w:t xml:space="preserve"> Amber Wildflowers      </w:t>
+            </w:r>
+            <w:sdt>
+              <w:sdtPr>
+                <w14:checkbox>
+                  <w14:checked w14:val="0"/>
+                  <w14:checkedState w14:val="2612" w14:font="MS Gothic"/>
+                  <w14:uncheckedState w14:val="2610" w14:font="MS Gothic"/>
+                </w14:checkbox>
+              </w:sdtPr>
+              <w:sdtContent>
+                <w:r>
+                  <w:sym w:char="2610" w:font="MS Gothic"/>
+                </w:r>
+              </w:sdtContent>
+            </w:sdt>
+            <w:r>
+              <w:rPr>
+                <w:rFonts w:ascii="Calibri" w:cs="Calibri" w:eastAsia="Calibri" w:hAnsi="Calibri"/>
+                <w:color w:val="453A30"/>
+                <w:sz w:val="19"/>
+                <w:szCs w:val="19"/>
+              </w:rPr>
+              <w:t xml:space="preserve"> Spider web ✓      </w:t>
             </w:r>
           </w:p>
           <w:p>
@@ -1297,6 +1389,29 @@
             <w:pPr>
               <w:spacing w:after="60"/>
             </w:pPr>
+            <w:sdt>
+              <w:sdtPr>
+                <w14:checkbox>
+                  <w14:checked w14:val="0"/>
+                  <w14:checkedState w14:val="2612" w14:font="MS Gothic"/>
+                  <w14:uncheckedState w14:val="2610" w14:font="MS Gothic"/>
+                </w14:checkbox>
+              </w:sdtPr>
+              <w:sdtContent>
+                <w:r>
+                  <w:sym w:char="2610" w:font="MS Gothic"/>
+                </w:r>
+              </w:sdtContent>
+            </w:sdt>
+            <w:r>
+              <w:rPr>
+                <w:rFonts w:ascii="Calibri" w:cs="Calibri" w:eastAsia="Calibri" w:hAnsi="Calibri"/>
+                <w:color w:val="453A30"/>
+                <w:sz w:val="19"/>
+                <w:szCs w:val="19"/>
+              </w:rPr>
+              <w:t xml:space="preserve"> Elain's Gingham ✓      </w:t>
+            </w:r>
             <w:sdt>
               <w:sdtPr>
                 <w14:checkbox>
@@ -2824,7 +2939,7 @@
                 <w:sz w:val="21"/>
                 <w:szCs w:val="21"/>
               </w:rPr>
-              <w:t xml:space="preserve"> of 4 · best print: </w:t>
+              <w:t xml:space="preserve"> of 8 · best print: </w:t>
             </w:r>
             <w:r>
               <w:rPr>
@@ -3398,7 +3513,7 @@
                 <w:sz w:val="21"/>
                 <w:szCs w:val="21"/>
               </w:rPr>
-              <w:t xml:space="preserve">Halloween bows: if 3–4 of 4 went on Sep 26, make 4 more in the prints that sold — they now have two more markets to sell at</w:t>
+              <w:t xml:space="preserve">Halloween bows: if 6–8 of 8 went on Sep 26, make 4 more in the prints that sold — they now have two more markets to sell at</w:t>
             </w:r>
           </w:p>
         </w:tc>
@@ -3514,7 +3629,7 @@
                 <w:sz w:val="18"/>
                 <w:szCs w:val="18"/>
               </w:rPr>
-              <w:t xml:space="preserve">  · Scarlet/Cream · Bone Carver's Candy/Elain's Gingham · Autumn Court Gourds/Lucien's Patch</w:t>
+              <w:t xml:space="preserve">  · Scarlet/Cream · Bone Carver's Candy/Elain's Gingham · Autumn Court Gourds/Lucien's Patch · check the backs, two went into bows</w:t>
             </w:r>
             <w:r>
               <w:rPr>
@@ -4083,7 +4198,7 @@
           <w:sz w:val="18"/>
           <w:szCs w:val="18"/>
         </w:rPr>
-        <w:t xml:space="preserve">Sewing to Sep 26: ~10 hours · to Oct 10: </w:t>
+        <w:t xml:space="preserve">Sewing to Sep 26: ~8 hours · to Oct 10: </w:t>
       </w:r>
       <w:r>
         <w:rPr>
@@ -4094,7 +4209,7 @@
           <w:sz w:val="18"/>
           <w:szCs w:val="18"/>
         </w:rPr>
-        <w:t xml:space="preserve">~20 hours</w:t>
+        <w:t xml:space="preserve">~18 hours</w:t>
       </w:r>
       <w:r>
         <w:rPr>
@@ -4114,7 +4229,7 @@
           <w:sz w:val="18"/>
           <w:szCs w:val="18"/>
         </w:rPr>
-        <w:t xml:space="preserve">~50 pieces already made + ~40 new</w:t>
+        <w:t xml:space="preserve">~50 pieces already made + ~45 new</w:t>
       </w:r>
       <w:r>
         <w:rPr>
@@ -4811,7 +4926,7 @@
                 <w:sz w:val="21"/>
                 <w:szCs w:val="21"/>
               </w:rPr>
-              <w:t xml:space="preserve"> of 4 · best print: </w:t>
+              <w:t xml:space="preserve"> of 8 · best print: </w:t>
             </w:r>
             <w:r>
               <w:rPr>
@@ -4959,7 +5074,7 @@
                       <w:sz w:val="19"/>
                       <w:szCs w:val="19"/>
                     </w:rPr>
-                    <w:t xml:space="preserve">Sold 3–4   </w:t>
+                    <w:t xml:space="preserve">Sold 6–8   </w:t>
                   </w:r>
                   <w:r>
                     <w:rPr>
@@ -4981,7 +5096,7 @@
                       <w:sz w:val="19"/>
                       <w:szCs w:val="19"/>
                     </w:rPr>
-                    <w:t xml:space="preserve">Sold 1–2   </w:t>
+                    <w:t xml:space="preserve">Sold 3–5   </w:t>
                   </w:r>
                   <w:r>
                     <w:rPr>
@@ -5003,7 +5118,7 @@
                       <w:sz w:val="19"/>
                       <w:szCs w:val="19"/>
                     </w:rPr>
-                    <w:t xml:space="preserve">Sold 0       </w:t>
+                    <w:t xml:space="preserve">Sold 0–2     </w:t>
                   </w:r>
                   <w:r>
                     <w:rPr>
@@ -5012,7 +5127,7 @@
                       <w:sz w:val="19"/>
                       <w:szCs w:val="19"/>
                     </w:rPr>
-                    <w:t xml:space="preserve">make none — bring the four back</w:t>
+                    <w:t xml:space="preserve">make none — bring the rest back</w:t>
                   </w:r>
                 </w:p>
               </w:tc>
@@ -7039,7 +7154,7 @@
           <w:sz w:val="18"/>
           <w:szCs w:val="18"/>
         </w:rPr>
-        <w:t xml:space="preserve">~27–29 hours over seven weeks</w:t>
+        <w:t xml:space="preserve">~25–27 hours over seven weeks</w:t>
       </w:r>
       <w:r>
         <w:rPr>

</xml_diff>

<commit_message>
Market checklist: scan-to-pay card for the Stripe quick-checkout links
Co-Authored-By: Claude Opus 5 <noreply@anthropic.com>
</commit_message>
<xml_diff>
--- a/marketing/october-market-prep.docx
+++ b/marketing/october-market-prep.docx
@@ -1803,7 +1803,7 @@
                 <w:sz w:val="21"/>
                 <w:szCs w:val="21"/>
               </w:rPr>
-              <w:t xml:space="preserve">Print the price sign + QR sign — scan each QR with your phone · print + cut the price tags (totes, sleeve, tea cover, Suriel set, headband, gift card holders)</w:t>
+              <w:t xml:space="preserve">Print the price sign, QR sign + scan-to-pay card — scan every QR with your phone · print + cut the price tags (totes, sleeve, tea cover, Suriel set, headband, gift card holders)</w:t>
             </w:r>
           </w:p>
           <w:p>
@@ -1841,7 +1841,7 @@
                 <w:sz w:val="21"/>
                 <w:szCs w:val="21"/>
               </w:rPr>
-              <w:t xml:space="preserve">Two sign holders · a name banner for the table front · a copy of the sales tax permit</w:t>
+              <w:t xml:space="preserve">Three sign holders · a name banner for the table front · a copy of the sales tax permit</w:t>
             </w:r>
           </w:p>
           <w:p>
@@ -1917,7 +1917,7 @@
                 <w:sz w:val="21"/>
                 <w:szCs w:val="21"/>
               </w:rPr>
-              <w:t xml:space="preserve">Tap to Pay: $1 test charge + refund · practise a 3-for-$15 scrunchie sale</w:t>
+              <w:t xml:space="preserve">Tap to Pay: $1 test charge + refund · practise a 3-for-$15 scrunchie sale · open each scan-to-pay link (scrunchie $6 · bow $12 · bandana $18 — the $22 Quilted Court is paid at the table)</w:t>
             </w:r>
           </w:p>
           <w:p>
@@ -6427,7 +6427,7 @@
                 <w:sz w:val="20"/>
                 <w:szCs w:val="20"/>
               </w:rPr>
-              <w:t xml:space="preserve">  Price signs + QR sign</w:t>
+              <w:t xml:space="preserve">  Price signs + QR sign + scan-to-pay card</w:t>
             </w:r>
           </w:p>
           <w:p>

</xml_diff>

<commit_message>
Shadow box finished, extended for Linda's additions; Maurya pickup moved to Sep 17
Co-Authored-By: Claude Opus 5 <noreply@anthropic.com>
</commit_message>
<xml_diff>
--- a/marketing/october-market-prep.docx
+++ b/marketing/october-market-prep.docx
@@ -100,7 +100,7 @@
                 <w:sz w:val="22"/>
                 <w:szCs w:val="22"/>
               </w:rPr>
-              <w:t xml:space="preserve">Sep 18</w:t>
+              <w:t xml:space="preserve">Sep 15</w:t>
             </w:r>
           </w:p>
           <w:p>
@@ -111,7 +111,7 @@
                 <w:sz w:val="18"/>
                 <w:szCs w:val="18"/>
               </w:rPr>
-              <w:t xml:space="preserve">Shadow box due to Linda</w:t>
+              <w:t xml:space="preserve">Shadow box done · Linda adding to it</w:t>
             </w:r>
           </w:p>
         </w:tc>
@@ -382,7 +382,7 @@
                 <w:sz w:val="22"/>
                 <w:szCs w:val="22"/>
               </w:rPr>
-              <w:t xml:space="preserve">Shadow box first — then check the shelf and order what's short</w:t>
+              <w:t xml:space="preserve">Shadow box done — now check the shelf and order what's short</w:t>
             </w:r>
           </w:p>
           <w:p>
@@ -420,7 +420,7 @@
                 <w:sz w:val="21"/>
                 <w:szCs w:val="21"/>
               </w:rPr>
-              <w:t xml:space="preserve">Finish Linda's shadow box — </w:t>
+              <w:t xml:space="preserve">✅ Linda's shadow box finished and previewed (Sep 15) · she's adding to it — agree what, and the </w:t>
             </w:r>
             <w:r>
               <w:rPr>
@@ -431,7 +431,7 @@
                 <w:sz w:val="21"/>
                 <w:szCs w:val="21"/>
               </w:rPr>
-              <w:t xml:space="preserve">due Fri Sep 18</w:t>
+              <w:t xml:space="preserve">new date: ____________</w:t>
             </w:r>
           </w:p>
           <w:p>

</xml_diff>

<commit_message>
Market bows: 23 planned, 15 sewn; federal tax deferred to April
Seven more bows sewn Sep 15 (Middengard Wyrms, Starfall Pines, Solstice
Tartan, Night Court Stripe, Hewn City Stripe, Autumn Court Gourds and
Traditional Christmas). Halloween tallies now of 9. Whimsy stripes and a
bandana's fabrics went into bows - flagged to check.

Co-Authored-By: Claude Opus 5 <noreply@anthropic.com>
</commit_message>
<xml_diff>
--- a/marketing/october-market-prep.docx
+++ b/marketing/october-market-prep.docx
@@ -469,7 +469,7 @@
                 <w:sz w:val="21"/>
                 <w:szCs w:val="21"/>
               </w:rPr>
-              <w:t xml:space="preserve">Pay the federal estimated tax — Sep 15</w:t>
+              <w:t xml:space="preserve">✅ Federal tax: not paying estimated tax now — paying in April with the return</w:t>
             </w:r>
           </w:p>
           <w:p>
@@ -840,7 +840,7 @@
                 <w:szCs w:val="16"/>
                 <w:shd w:fill="DCEBEB" w:color="auto" w:val="clear"/>
               </w:rPr>
-              <w:t xml:space="preserve"> ~8 HOURS </w:t>
+              <w:t xml:space="preserve"> ~7 HOURS </w:t>
             </w:r>
           </w:p>
         </w:tc>
@@ -871,7 +871,7 @@
                 <w:sz w:val="22"/>
                 <w:szCs w:val="22"/>
               </w:rPr>
-              <w:t xml:space="preserve">Bows and hair whimsys — ready for Sep 26 (19 bows, 8 already sewn)</w:t>
+              <w:t xml:space="preserve">Bows and hair whimsys — ready for Sep 26 (23 bows, 15 already sewn)</w:t>
             </w:r>
           </w:p>
           <w:p>
@@ -1124,7 +1124,7 @@
                 <w:sz w:val="19"/>
                 <w:szCs w:val="19"/>
               </w:rPr>
-              <w:t xml:space="preserve"> Starfall Pines      </w:t>
+              <w:t xml:space="preserve"> Starfall Pines ✓      </w:t>
             </w:r>
             <w:sdt>
               <w:sdtPr>
@@ -1147,7 +1147,30 @@
                 <w:sz w:val="19"/>
                 <w:szCs w:val="19"/>
               </w:rPr>
-              <w:t xml:space="preserve"> Solstice Tartan      </w:t>
+              <w:t xml:space="preserve"> Solstice Tartan ✓      </w:t>
+            </w:r>
+            <w:sdt>
+              <w:sdtPr>
+                <w14:checkbox>
+                  <w14:checked w14:val="0"/>
+                  <w14:checkedState w14:val="2612" w14:font="MS Gothic"/>
+                  <w14:uncheckedState w14:val="2610" w14:font="MS Gothic"/>
+                </w14:checkbox>
+              </w:sdtPr>
+              <w:sdtContent>
+                <w:r>
+                  <w:sym w:char="2610" w:font="MS Gothic"/>
+                </w:r>
+              </w:sdtContent>
+            </w:sdt>
+            <w:r>
+              <w:rPr>
+                <w:rFonts w:ascii="Calibri" w:cs="Calibri" w:eastAsia="Calibri" w:hAnsi="Calibri"/>
+                <w:color w:val="453A30"/>
+                <w:sz w:val="19"/>
+                <w:szCs w:val="19"/>
+              </w:rPr>
+              <w:t xml:space="preserve"> Traditional Christmas ✓      </w:t>
             </w:r>
           </w:p>
           <w:p>
@@ -1336,6 +1359,29 @@
                 <w:sz w:val="19"/>
                 <w:szCs w:val="19"/>
               </w:rPr>
+              <w:t xml:space="preserve"> Autumn Court Gourds ✓      </w:t>
+            </w:r>
+            <w:sdt>
+              <w:sdtPr>
+                <w14:checkbox>
+                  <w14:checked w14:val="0"/>
+                  <w14:checkedState w14:val="2612" w14:font="MS Gothic"/>
+                  <w14:uncheckedState w14:val="2610" w14:font="MS Gothic"/>
+                </w14:checkbox>
+              </w:sdtPr>
+              <w:sdtContent>
+                <w:r>
+                  <w:sym w:char="2610" w:font="MS Gothic"/>
+                </w:r>
+              </w:sdtContent>
+            </w:sdt>
+            <w:r>
+              <w:rPr>
+                <w:rFonts w:ascii="Calibri" w:cs="Calibri" w:eastAsia="Calibri" w:hAnsi="Calibri"/>
+                <w:color w:val="453A30"/>
+                <w:sz w:val="19"/>
+                <w:szCs w:val="19"/>
+              </w:rPr>
               <w:t xml:space="preserve"> Amber Wildflowers      </w:t>
             </w:r>
             <w:sdt>
@@ -1433,7 +1479,53 @@
                 <w:sz w:val="19"/>
                 <w:szCs w:val="19"/>
               </w:rPr>
-              <w:t xml:space="preserve"> Middengard Wyrms      </w:t>
+              <w:t xml:space="preserve"> Middengard Wyrms ✓      </w:t>
+            </w:r>
+            <w:sdt>
+              <w:sdtPr>
+                <w14:checkbox>
+                  <w14:checked w14:val="0"/>
+                  <w14:checkedState w14:val="2612" w14:font="MS Gothic"/>
+                  <w14:uncheckedState w14:val="2610" w14:font="MS Gothic"/>
+                </w14:checkbox>
+              </w:sdtPr>
+              <w:sdtContent>
+                <w:r>
+                  <w:sym w:char="2610" w:font="MS Gothic"/>
+                </w:r>
+              </w:sdtContent>
+            </w:sdt>
+            <w:r>
+              <w:rPr>
+                <w:rFonts w:ascii="Calibri" w:cs="Calibri" w:eastAsia="Calibri" w:hAnsi="Calibri"/>
+                <w:color w:val="453A30"/>
+                <w:sz w:val="19"/>
+                <w:szCs w:val="19"/>
+              </w:rPr>
+              <w:t xml:space="preserve"> Night Court Stripe ✓      </w:t>
+            </w:r>
+            <w:sdt>
+              <w:sdtPr>
+                <w14:checkbox>
+                  <w14:checked w14:val="0"/>
+                  <w14:checkedState w14:val="2612" w14:font="MS Gothic"/>
+                  <w14:uncheckedState w14:val="2610" w14:font="MS Gothic"/>
+                </w14:checkbox>
+              </w:sdtPr>
+              <w:sdtContent>
+                <w:r>
+                  <w:sym w:char="2610" w:font="MS Gothic"/>
+                </w:r>
+              </w:sdtContent>
+            </w:sdt>
+            <w:r>
+              <w:rPr>
+                <w:rFonts w:ascii="Calibri" w:cs="Calibri" w:eastAsia="Calibri" w:hAnsi="Calibri"/>
+                <w:color w:val="453A30"/>
+                <w:sz w:val="19"/>
+                <w:szCs w:val="19"/>
+              </w:rPr>
+              <w:t xml:space="preserve"> Hewn City Stripe ✓      </w:t>
             </w:r>
             <w:sdt>
               <w:sdtPr>
@@ -1479,7 +1571,7 @@
                 <w:sz w:val="18"/>
                 <w:szCs w:val="18"/>
               </w:rPr>
-              <w:t xml:space="preserve">  · 3 Night Court Stripe · 3 Hewn City Stripe · 2 Nesta's Cats</w:t>
+              <w:t xml:space="preserve">  · 3 Night Court Stripe · 3 Hewn City Stripe · 2 Nesta's Cats · the stripes went into bows, check what's left</w:t>
             </w:r>
             <w:r>
               <w:rPr>
@@ -2939,7 +3031,7 @@
                 <w:sz w:val="21"/>
                 <w:szCs w:val="21"/>
               </w:rPr>
-              <w:t xml:space="preserve"> of 8 · best print: </w:t>
+              <w:t xml:space="preserve"> of 9 · best print: </w:t>
             </w:r>
             <w:r>
               <w:rPr>
@@ -3513,7 +3605,7 @@
                 <w:sz w:val="21"/>
                 <w:szCs w:val="21"/>
               </w:rPr>
-              <w:t xml:space="preserve">Halloween bows: if 6–8 of 8 went on Sep 26, make 4 more in the prints that sold — they now have two more markets to sell at</w:t>
+              <w:t xml:space="preserve">Halloween bows: if 7–9 of 9 went on Sep 26, make 4 more in the prints that sold — they now have two more markets to sell at</w:t>
             </w:r>
           </w:p>
         </w:tc>
@@ -3629,7 +3721,7 @@
                 <w:sz w:val="18"/>
                 <w:szCs w:val="18"/>
               </w:rPr>
-              <w:t xml:space="preserve">  · Scarlet/Cream · Bone Carver's Candy/Elain's Gingham · Autumn Court Gourds/Lucien's Patch · check the backs, two went into bows</w:t>
+              <w:t xml:space="preserve">  · Scarlet/Cream · Bone Carver's Candy/Elain's Gingham · Autumn Court Gourds/Lucien's Patch · three of these fabrics went into bows, check what's left</w:t>
             </w:r>
             <w:r>
               <w:rPr>
@@ -4198,7 +4290,7 @@
           <w:sz w:val="18"/>
           <w:szCs w:val="18"/>
         </w:rPr>
-        <w:t xml:space="preserve">Sewing to Sep 26: ~8 hours · to Oct 10: </w:t>
+        <w:t xml:space="preserve">Sewing to Sep 26: ~7 hours · to Oct 10: </w:t>
       </w:r>
       <w:r>
         <w:rPr>
@@ -4209,7 +4301,7 @@
           <w:sz w:val="18"/>
           <w:szCs w:val="18"/>
         </w:rPr>
-        <w:t xml:space="preserve">~18 hours</w:t>
+        <w:t xml:space="preserve">~16 hours</w:t>
       </w:r>
       <w:r>
         <w:rPr>
@@ -4229,7 +4321,7 @@
           <w:sz w:val="18"/>
           <w:szCs w:val="18"/>
         </w:rPr>
-        <w:t xml:space="preserve">~50 pieces already made + ~45 new</w:t>
+        <w:t xml:space="preserve">~50 pieces already made + ~49 new</w:t>
       </w:r>
       <w:r>
         <w:rPr>
@@ -4926,7 +5018,7 @@
                 <w:sz w:val="21"/>
                 <w:szCs w:val="21"/>
               </w:rPr>
-              <w:t xml:space="preserve"> of 8 · best print: </w:t>
+              <w:t xml:space="preserve"> of 9 · best print: </w:t>
             </w:r>
             <w:r>
               <w:rPr>
@@ -5074,7 +5166,7 @@
                       <w:sz w:val="19"/>
                       <w:szCs w:val="19"/>
                     </w:rPr>
-                    <w:t xml:space="preserve">Sold 6–8   </w:t>
+                    <w:t xml:space="preserve">Sold 7–9   </w:t>
                   </w:r>
                   <w:r>
                     <w:rPr>
@@ -5096,7 +5188,7 @@
                       <w:sz w:val="19"/>
                       <w:szCs w:val="19"/>
                     </w:rPr>
-                    <w:t xml:space="preserve">Sold 3–5   </w:t>
+                    <w:t xml:space="preserve">Sold 4–6   </w:t>
                   </w:r>
                   <w:r>
                     <w:rPr>
@@ -5118,7 +5210,7 @@
                       <w:sz w:val="19"/>
                       <w:szCs w:val="19"/>
                     </w:rPr>
-                    <w:t xml:space="preserve">Sold 0–2     </w:t>
+                    <w:t xml:space="preserve">Sold 0–3     </w:t>
                   </w:r>
                   <w:r>
                     <w:rPr>
@@ -7154,7 +7246,7 @@
           <w:sz w:val="18"/>
           <w:szCs w:val="18"/>
         </w:rPr>
-        <w:t xml:space="preserve">~25–27 hours over seven weeks</w:t>
+        <w:t xml:space="preserve">~23–25 hours over seven weeks</w:t>
       </w:r>
       <w:r>
         <w:rPr>

</xml_diff>

<commit_message>
Sep 26 posts use the new-bows group shot; Linda's box now due by Sep 25
Co-Authored-By: Claude Opus 5 <noreply@anthropic.com>
</commit_message>
<xml_diff>
--- a/marketing/october-market-prep.docx
+++ b/marketing/october-market-prep.docx
@@ -420,7 +420,7 @@
                 <w:sz w:val="21"/>
                 <w:szCs w:val="21"/>
               </w:rPr>
-              <w:t xml:space="preserve">✅ Linda's shadow box finished and previewed (Sep 15) · she's adding to it — agree what, and the </w:t>
+              <w:t xml:space="preserve">✅ Linda's shadow box finished and previewed (Sep 15) · she's adding one item she owns — </w:t>
             </w:r>
             <w:r>
               <w:rPr>
@@ -431,7 +431,7 @@
                 <w:sz w:val="21"/>
                 <w:szCs w:val="21"/>
               </w:rPr>
-              <w:t xml:space="preserve">new date: ____________</w:t>
+              <w:t xml:space="preserve">new date: next week, by Fri Sep 25</w:t>
             </w:r>
           </w:p>
           <w:p>

</xml_diff>

<commit_message>
Sep 26 market: inside the boutique, no power, set-up 2:30, no insurance
Co-Authored-By: Claude Opus 5 <noreply@anthropic.com>
</commit_message>
<xml_diff>
--- a/marketing/october-market-prep.docx
+++ b/marketing/october-market-prep.docx
@@ -42,7 +42,7 @@
           <w:sz w:val="18"/>
           <w:szCs w:val="18"/>
         </w:rPr>
-        <w:t xml:space="preserve">Three markets · Sep 26 indoor evening, $20 · Oct 10 and Oct 30 outdoor, $30 each · 6-ft table (mine)      </w:t>
+        <w:t xml:space="preserve">Three markets · Sep 26 inside a boutique, evening, $20 · Oct 10 and Oct 30 outdoor, $30 each · 6-ft table (mine)      </w:t>
       </w:r>
       <w:r>
         <w:rPr>
@@ -1971,7 +1971,7 @@
                 <w:sz w:val="21"/>
                 <w:szCs w:val="21"/>
               </w:rPr>
-              <w:t xml:space="preserve">Ask the Sep 26 organiser: power? · set-up time · liability insurance? · check the tax rate if it's outside San Antonio (the 7.6% assumes 8.25%)</w:t>
+              <w:t xml:space="preserve">✅ Sep 26 organiser: no power · set-up from 2:30pm · no insurance required · look the address up in the Comptroller Rate Locator (the 7.6% assumes 8.25%)</w:t>
             </w:r>
           </w:p>
           <w:p>
@@ -2344,7 +2344,7 @@
                 <w:sz w:val="21"/>
                 <w:szCs w:val="21"/>
               </w:rPr>
-              <w:t xml:space="preserve">Pack from the list on page 2 — indoor, so no canopy, weights, rain sheet or sunscreen · </w:t>
+              <w:t xml:space="preserve">Pack from the list on page 2 — inside the shop — table only, so no canopy, weights, rain sheet or sunscreen · </w:t>
             </w:r>
             <w:r>
               <w:rPr>
@@ -2402,7 +2402,7 @@
                 <w:sz w:val="21"/>
                 <w:szCs w:val="21"/>
               </w:rPr>
-              <w:t xml:space="preserve">If there's power: warm string lights for an evening table · post “packed and ready”</w:t>
+              <w:t xml:space="preserve">No power at this one — battery lights only, and pack a charged power bank for Tap to Pay · post “packed and ready”</w:t>
             </w:r>
           </w:p>
         </w:tc>
@@ -2447,7 +2447,7 @@
                 <w:sz w:val="18"/>
                 <w:szCs w:val="18"/>
               </w:rPr>
-              <w:t xml:space="preserve">4 – 9pm · indoor</w:t>
+              <w:t xml:space="preserve">4 – 9pm · in the shop</w:t>
             </w:r>
           </w:p>
           <w:p>

</xml_diff>

<commit_message>
Table plan for the 6-ft table; Kindle sleeve enquiry logged
Co-Authored-By: Claude Opus 5 <noreply@anthropic.com>
</commit_message>
<xml_diff>
--- a/marketing/october-market-prep.docx
+++ b/marketing/october-market-prep.docx
@@ -1895,7 +1895,7 @@
                 <w:sz w:val="21"/>
                 <w:szCs w:val="21"/>
               </w:rPr>
-              <w:t xml:space="preserve">Print the price sign, QR sign + scan-to-pay card — scan every QR with your phone · print + cut the price tags (totes, sleeve, tea cover, Suriel set, headband, gift card holders)</w:t>
+              <w:t xml:space="preserve">Print the price sign, QR sign, scan-to-pay card + table plan — scan every QR with your phone · print + cut the price tags (totes, sleeve, tea cover, Suriel set, headband, gift card holders)</w:t>
             </w:r>
           </w:p>
           <w:p>
@@ -6519,7 +6519,7 @@
                 <w:sz w:val="20"/>
                 <w:szCs w:val="20"/>
               </w:rPr>
-              <w:t xml:space="preserve">  Price signs + QR sign + scan-to-pay card</w:t>
+              <w:t xml:space="preserve">  Price signs + QR sign + scan-to-pay card + table plan</w:t>
             </w:r>
           </w:p>
           <w:p>

</xml_diff>

<commit_message>
Hair whimsys in two sizes; how many of each piece to bring
Whimsys split 5 long (18x4, ties as a bow) and 3 short + wide (12x5-6,
half knot) at one $5 price. TASKS records the duplication rule by price
band and the table targets: 65 pieces, ~$879 retail on Sep 26.

Co-Authored-By: Claude Opus 5 <noreply@anthropic.com>
</commit_message>
<xml_diff>
--- a/marketing/october-market-prep.docx
+++ b/marketing/october-market-prep.docx
@@ -1562,7 +1562,7 @@
                 <w:sz w:val="21"/>
                 <w:szCs w:val="21"/>
               </w:rPr>
-              <w:t xml:space="preserve">Hair whimsys</w:t>
+              <w:t xml:space="preserve">Hair whimsys — long</w:t>
             </w:r>
             <w:r>
               <w:rPr>
@@ -1571,7 +1571,7 @@
                 <w:sz w:val="18"/>
                 <w:szCs w:val="18"/>
               </w:rPr>
-              <w:t xml:space="preserve">  · 6 from bow leftovers (Weaver's Web and others) · 2 Nesta's Cats</w:t>
+              <w:t xml:space="preserve">  · 18″ × 4″ · stripes and small prints</w:t>
             </w:r>
             <w:r>
               <w:rPr>
@@ -1696,6 +1696,38 @@
                 <w:szCs w:val="21"/>
               </w:rPr>
               <w:t xml:space="preserve"> </w:t>
+            </w:r>
+          </w:p>
+          <w:p>
+            <w:pPr>
+              <w:spacing w:after="60"/>
+            </w:pPr>
+            <w:r>
+              <w:rPr>
+                <w:rFonts w:ascii="Calibri" w:cs="Calibri" w:eastAsia="Calibri" w:hAnsi="Calibri"/>
+                <w:color w:val="453A30"/>
+                <w:sz w:val="21"/>
+                <w:szCs w:val="21"/>
+              </w:rPr>
+              <w:t xml:space="preserve">Hair whimsys — short + wide</w:t>
+            </w:r>
+            <w:r>
+              <w:rPr>
+                <w:rFonts w:ascii="Calibri" w:cs="Calibri" w:eastAsia="Calibri" w:hAnsi="Calibri"/>
+                <w:color w:val="6A5B4A"/>
+                <w:sz w:val="18"/>
+                <w:szCs w:val="18"/>
+              </w:rPr>
+              <w:t xml:space="preserve">  · 12″ × 5–6″ · big prints, half knot</w:t>
+            </w:r>
+            <w:r>
+              <w:rPr>
+                <w:rFonts w:ascii="Calibri" w:cs="Calibri" w:eastAsia="Calibri" w:hAnsi="Calibri"/>
+                <w:color w:val="453A30"/>
+                <w:sz w:val="21"/>
+                <w:szCs w:val="21"/>
+              </w:rPr>
+              <w:t xml:space="preserve">   </w:t>
             </w:r>
             <w:sdt>
               <w:sdtPr>
@@ -3078,7 +3110,7 @@
                 <w:sz w:val="21"/>
                 <w:szCs w:val="21"/>
               </w:rPr>
-              <w:t xml:space="preserve">Hair whimsys sold: ____ of 8</w:t>
+              <w:t xml:space="preserve">Hair whimsys sold: long ____ of 5 · short ____ of 3</w:t>
             </w:r>
           </w:p>
         </w:tc>

</xml_diff>

<commit_message>
Checklist names the printable inventory sheet
Co-Authored-By: Claude Opus 5 <noreply@anthropic.com>
</commit_message>
<xml_diff>
--- a/marketing/october-market-prep.docx
+++ b/marketing/october-market-prep.docx
@@ -2202,7 +2202,7 @@
                 <w:sz w:val="21"/>
                 <w:szCs w:val="21"/>
               </w:rPr>
-              <w:t xml:space="preserve">Inventory list — every piece going to the table</w:t>
+              <w:t xml:space="preserve">Print the inventory list — every piece going to the table (Dragon Ink market inventory.pdf)</w:t>
             </w:r>
           </w:p>
           <w:p>
@@ -6860,7 +6860,7 @@
                 <w:sz w:val="20"/>
                 <w:szCs w:val="20"/>
               </w:rPr>
-              <w:t xml:space="preserve">  Inventory list + pen</w:t>
+              <w:t xml:space="preserve">  Inventory list (printed) + pen</w:t>
             </w:r>
           </w:p>
           <w:p>

</xml_diff>